<commit_message>
Report: format headings in task 5
</commit_message>
<xml_diff>
--- a/Report/Task 05_MovingTarget_Report.docx
+++ b/Report/Task 05_MovingTarget_Report.docx
@@ -8,7 +8,30 @@
       </w:pPr>
       <w:bookmarkStart w:id="0" w:name="_Toc228918272"/>
       <w:r>
-        <w:t>1. Problem Description</w:t>
+        <w:t>5. Moving Target</w:t>
+      </w:r>
+    </w:p>
+    <w:p>
+      <w:pPr>
+        <w:pStyle w:val="Heading2"/>
+      </w:pPr>
+      <w:r>
+        <w:t>5</w:t>
+      </w:r>
+      <w:r>
+        <w:t>.</w:t>
+      </w:r>
+      <w:r>
+        <w:t>1</w:t>
+      </w:r>
+      <w:r>
+        <w:t xml:space="preserve"> Problem </w:t>
+      </w:r>
+      <w:r>
+        <w:t>d</w:t>
+      </w:r>
+      <w:r>
+        <w:t>escription</w:t>
       </w:r>
       <w:bookmarkEnd w:id="0"/>
     </w:p>
@@ -25,21 +48,7 @@
         <w:rPr>
           <w:color w:val="000000"/>
         </w:rPr>
-        <w:t xml:space="preserve">A computer game has a shooter and a moving target. There </w:t>
-      </w:r>
-      <w:proofErr w:type="gramStart"/>
-      <w:r>
-        <w:rPr>
-          <w:color w:val="000000"/>
-        </w:rPr>
-        <w:t>are</w:t>
-      </w:r>
-      <w:proofErr w:type="gramEnd"/>
-      <w:r>
-        <w:rPr>
-          <w:color w:val="000000"/>
-        </w:rPr>
-        <w:t xml:space="preserve"> n &gt; 1 hiding spots located along a straight line. The shooter fires one shot at a time at any chosen hiding spot. The target is invisible — the shooter can never see it. </w:t>
+        <w:t xml:space="preserve">A computer game has a shooter and a moving target. There are n &gt; 1 hiding spots located along a straight line. The shooter fires one shot at a time at any chosen hiding spot. The target is invisible — the shooter can never see it. </w:t>
       </w:r>
     </w:p>
     <w:p>
@@ -58,11 +67,17 @@
     <w:p/>
     <w:p>
       <w:pPr>
-        <w:pStyle w:val="Heading1"/>
+        <w:pStyle w:val="Heading2"/>
       </w:pPr>
       <w:bookmarkStart w:id="1" w:name="_Toc228918273"/>
       <w:r>
-        <w:t>2. Assumptions</w:t>
+        <w:t>5.</w:t>
+      </w:r>
+      <w:r>
+        <w:t>2</w:t>
+      </w:r>
+      <w:r>
+        <w:t xml:space="preserve"> Assumptions</w:t>
       </w:r>
       <w:bookmarkEnd w:id="1"/>
     </w:p>
@@ -80,21 +95,7 @@
         <w:rPr>
           <w:color w:val="000000"/>
         </w:rPr>
-        <w:t xml:space="preserve">There </w:t>
-      </w:r>
-      <w:proofErr w:type="gramStart"/>
-      <w:r>
-        <w:rPr>
-          <w:color w:val="000000"/>
-        </w:rPr>
-        <w:t>are</w:t>
-      </w:r>
-      <w:proofErr w:type="gramEnd"/>
-      <w:r>
-        <w:rPr>
-          <w:color w:val="000000"/>
-        </w:rPr>
-        <w:t xml:space="preserve"> n &gt; 1 hiding spots numbered 1 through n, arranged in a straight line.</w:t>
+        <w:t>There are n &gt; 1 hiding spots numbered 1 through n, arranged in a straight line.</w:t>
       </w:r>
     </w:p>
     <w:p>
@@ -145,21 +146,7 @@
         <w:rPr>
           <w:color w:val="000000"/>
         </w:rPr>
-        <w:t xml:space="preserve">The target's position </w:t>
-      </w:r>
-      <w:proofErr w:type="gramStart"/>
-      <w:r>
-        <w:rPr>
-          <w:color w:val="000000"/>
-        </w:rPr>
-        <w:t>is completely unknown to the shooter at all times</w:t>
-      </w:r>
-      <w:proofErr w:type="gramEnd"/>
-      <w:r>
-        <w:rPr>
-          <w:color w:val="000000"/>
-        </w:rPr>
-        <w:t>.</w:t>
+        <w:t>The target's position is completely unknown to the shooter at all times.</w:t>
       </w:r>
     </w:p>
     <w:p>
@@ -271,22 +258,34 @@
     </w:p>
     <w:p>
       <w:pPr>
-        <w:pStyle w:val="Heading1"/>
+        <w:pStyle w:val="Heading2"/>
       </w:pPr>
       <w:bookmarkStart w:id="2" w:name="_Toc228918274"/>
       <w:r>
         <w:lastRenderedPageBreak/>
-        <w:t>3. Methodology</w:t>
+        <w:t>5.</w:t>
+      </w:r>
+      <w:r>
+        <w:t>3 Methodology</w:t>
       </w:r>
       <w:bookmarkEnd w:id="2"/>
     </w:p>
     <w:p>
       <w:pPr>
-        <w:pStyle w:val="Heading2"/>
+        <w:pStyle w:val="Heading3"/>
       </w:pPr>
       <w:bookmarkStart w:id="3" w:name="_Toc228918275"/>
       <w:r>
-        <w:t>3.1 Key Insight</w:t>
+        <w:t xml:space="preserve">5.3.1 </w:t>
+      </w:r>
+      <w:r>
+        <w:t xml:space="preserve">Key </w:t>
+      </w:r>
+      <w:r>
+        <w:t>i</w:t>
+      </w:r>
+      <w:r>
+        <w:t>nsight</w:t>
       </w:r>
       <w:bookmarkEnd w:id="3"/>
     </w:p>
@@ -295,21 +294,40 @@
         <w:spacing w:before="240" w:after="120" w:line="360" w:lineRule="auto"/>
         <w:ind w:firstLine="720"/>
         <w:jc w:val="both"/>
-      </w:pPr>
-      <w:r>
         <w:rPr>
           <w:color w:val="000000"/>
         </w:rPr>
+      </w:pPr>
+      <w:r>
+        <w:rPr>
+          <w:color w:val="000000"/>
+        </w:rPr>
         <w:t>The key insight is this: if we shoot spots 2, 3, 4, ..., n-1 in order (forward sweep), the target is cornered — it can never cross our sweep without being hit if it started on an odd-indexed spot. Then we shoot the same sequence in reverse (backward sweep) to catch targets that started on even-indexed spots. Together, the two sweeps guarantee a hit.</w:t>
       </w:r>
     </w:p>
     <w:p>
       <w:pPr>
-        <w:pStyle w:val="Heading2"/>
+        <w:spacing w:before="240" w:after="120" w:line="360" w:lineRule="auto"/>
+        <w:ind w:firstLine="720"/>
+        <w:jc w:val="both"/>
+      </w:pPr>
+    </w:p>
+    <w:p>
+      <w:pPr>
+        <w:pStyle w:val="Heading3"/>
       </w:pPr>
       <w:bookmarkStart w:id="4" w:name="_Toc228918276"/>
       <w:r>
-        <w:t>3.2 Step-by-Step Description</w:t>
+        <w:t xml:space="preserve">5.3.2 </w:t>
+      </w:r>
+      <w:r>
+        <w:t xml:space="preserve">Step-by-Step </w:t>
+      </w:r>
+      <w:r>
+        <w:t>d</w:t>
+      </w:r>
+      <w:r>
+        <w:t>escription</w:t>
       </w:r>
       <w:bookmarkEnd w:id="4"/>
     </w:p>
@@ -492,12 +510,15 @@
     </w:p>
     <w:p>
       <w:pPr>
-        <w:pStyle w:val="Heading1"/>
+        <w:pStyle w:val="Heading2"/>
       </w:pPr>
       <w:bookmarkStart w:id="5" w:name="_Toc228918277"/>
       <w:r>
         <w:lastRenderedPageBreak/>
-        <w:t>4. Pseudocode</w:t>
+        <w:t>5.4</w:t>
+      </w:r>
+      <w:r>
+        <w:t xml:space="preserve"> Pseudocode</w:t>
       </w:r>
       <w:bookmarkEnd w:id="5"/>
     </w:p>
@@ -513,9 +534,14 @@
           <w:sz w:val="20"/>
           <w:szCs w:val="20"/>
         </w:rPr>
-        <w:t xml:space="preserve">FUNCTION </w:t>
-      </w:r>
-      <w:proofErr w:type="gramStart"/>
+        <w:t>FUNCTION hunt(low, high, sequence):</w:t>
+      </w:r>
+    </w:p>
+    <w:p>
+      <w:pPr>
+        <w:spacing w:before="120" w:after="120" w:line="276" w:lineRule="auto"/>
+        <w:ind w:left="720"/>
+      </w:pPr>
       <w:r>
         <w:rPr>
           <w:rFonts w:ascii="Courier New" w:eastAsia="Courier New" w:hAnsi="Courier New" w:cs="Courier New"/>
@@ -523,9 +549,14 @@
           <w:sz w:val="20"/>
           <w:szCs w:val="20"/>
         </w:rPr>
-        <w:t>hunt(</w:t>
-      </w:r>
-      <w:proofErr w:type="gramEnd"/>
+        <w:t xml:space="preserve">    IF low &gt; high:</w:t>
+      </w:r>
+    </w:p>
+    <w:p>
+      <w:pPr>
+        <w:spacing w:before="120" w:after="120" w:line="276" w:lineRule="auto"/>
+        <w:ind w:left="720"/>
+      </w:pPr>
       <w:r>
         <w:rPr>
           <w:rFonts w:ascii="Courier New" w:eastAsia="Courier New" w:hAnsi="Courier New" w:cs="Courier New"/>
@@ -533,7 +564,7 @@
           <w:sz w:val="20"/>
           <w:szCs w:val="20"/>
         </w:rPr>
-        <w:t>low, high, sequence):</w:t>
+        <w:t xml:space="preserve">        RETURN                        // Base case: empty range</w:t>
       </w:r>
     </w:p>
     <w:p>
@@ -548,7 +579,7 @@
           <w:sz w:val="20"/>
           <w:szCs w:val="20"/>
         </w:rPr>
-        <w:t xml:space="preserve">    IF low &gt; high:</w:t>
+        <w:t xml:space="preserve">    IF low == high:</w:t>
       </w:r>
     </w:p>
     <w:p>
@@ -563,7 +594,7 @@
           <w:sz w:val="20"/>
           <w:szCs w:val="20"/>
         </w:rPr>
-        <w:t xml:space="preserve">        RETURN                        // Base case: empty range</w:t>
+        <w:t xml:space="preserve">        APPEND low TO sequence</w:t>
       </w:r>
     </w:p>
     <w:p>
@@ -578,7 +609,7 @@
           <w:sz w:val="20"/>
           <w:szCs w:val="20"/>
         </w:rPr>
-        <w:t xml:space="preserve">    IF low == high:</w:t>
+        <w:t xml:space="preserve">        RETURN                        // Base case: single spot</w:t>
       </w:r>
     </w:p>
     <w:p>
@@ -593,9 +624,14 @@
           <w:sz w:val="20"/>
           <w:szCs w:val="20"/>
         </w:rPr>
-        <w:t xml:space="preserve">        APPEND low TO </w:t>
-      </w:r>
-      <w:proofErr w:type="gramStart"/>
+        <w:t xml:space="preserve">    mid = (low + high) / 2</w:t>
+      </w:r>
+    </w:p>
+    <w:p>
+      <w:pPr>
+        <w:spacing w:before="120" w:after="120" w:line="276" w:lineRule="auto"/>
+        <w:ind w:left="720"/>
+      </w:pPr>
       <w:r>
         <w:rPr>
           <w:rFonts w:ascii="Courier New" w:eastAsia="Courier New" w:hAnsi="Courier New" w:cs="Courier New"/>
@@ -603,9 +639,8 @@
           <w:sz w:val="20"/>
           <w:szCs w:val="20"/>
         </w:rPr>
-        <w:t>sequence</w:t>
-      </w:r>
-      <w:proofErr w:type="gramEnd"/>
+        <w:t xml:space="preserve">    hunt(low, mid, sequence)          // Conquer left half</w:t>
+      </w:r>
     </w:p>
     <w:p>
       <w:pPr>
@@ -619,7 +654,7 @@
           <w:sz w:val="20"/>
           <w:szCs w:val="20"/>
         </w:rPr>
-        <w:t xml:space="preserve">        RETURN                        // Base case: single spot</w:t>
+        <w:t xml:space="preserve">    hunt(mid+1, high, sequence)       // Conquer right half</w:t>
       </w:r>
     </w:p>
     <w:p>
@@ -634,8 +669,14 @@
           <w:sz w:val="20"/>
           <w:szCs w:val="20"/>
         </w:rPr>
-        <w:t xml:space="preserve">    mid = (low + high) / 2</w:t>
-      </w:r>
+        <w:t xml:space="preserve">    // No explicit combine — results appended in order</w:t>
+      </w:r>
+    </w:p>
+    <w:p>
+      <w:pPr>
+        <w:spacing w:before="120" w:after="120" w:line="276" w:lineRule="auto"/>
+        <w:ind w:left="720"/>
+      </w:pPr>
     </w:p>
     <w:p>
       <w:pPr>
@@ -649,9 +690,14 @@
           <w:sz w:val="20"/>
           <w:szCs w:val="20"/>
         </w:rPr>
-        <w:t xml:space="preserve">    </w:t>
-      </w:r>
-      <w:proofErr w:type="gramStart"/>
+        <w:t>FUNCTION movingTarget(n):</w:t>
+      </w:r>
+    </w:p>
+    <w:p>
+      <w:pPr>
+        <w:spacing w:before="120" w:after="120" w:line="276" w:lineRule="auto"/>
+        <w:ind w:left="720"/>
+      </w:pPr>
       <w:r>
         <w:rPr>
           <w:rFonts w:ascii="Courier New" w:eastAsia="Courier New" w:hAnsi="Courier New" w:cs="Courier New"/>
@@ -659,9 +705,14 @@
           <w:sz w:val="20"/>
           <w:szCs w:val="20"/>
         </w:rPr>
-        <w:t>hunt(</w:t>
-      </w:r>
-      <w:proofErr w:type="gramEnd"/>
+        <w:t xml:space="preserve">    IF n == 2:</w:t>
+      </w:r>
+    </w:p>
+    <w:p>
+      <w:pPr>
+        <w:spacing w:before="120" w:after="120" w:line="276" w:lineRule="auto"/>
+        <w:ind w:left="720"/>
+      </w:pPr>
       <w:r>
         <w:rPr>
           <w:rFonts w:ascii="Courier New" w:eastAsia="Courier New" w:hAnsi="Courier New" w:cs="Courier New"/>
@@ -669,7 +720,7 @@
           <w:sz w:val="20"/>
           <w:szCs w:val="20"/>
         </w:rPr>
-        <w:t>low, mid, sequence)          // Conquer left half</w:t>
+        <w:t xml:space="preserve">        PRINT "Shoot spot 1, then spot 1 again"</w:t>
       </w:r>
     </w:p>
     <w:p>
@@ -684,9 +735,14 @@
           <w:sz w:val="20"/>
           <w:szCs w:val="20"/>
         </w:rPr>
-        <w:t xml:space="preserve">    </w:t>
-      </w:r>
-      <w:proofErr w:type="gramStart"/>
+        <w:t xml:space="preserve">        RETURN</w:t>
+      </w:r>
+    </w:p>
+    <w:p>
+      <w:pPr>
+        <w:spacing w:before="120" w:after="120" w:line="276" w:lineRule="auto"/>
+        <w:ind w:left="720"/>
+      </w:pPr>
       <w:r>
         <w:rPr>
           <w:rFonts w:ascii="Courier New" w:eastAsia="Courier New" w:hAnsi="Courier New" w:cs="Courier New"/>
@@ -694,9 +750,14 @@
           <w:sz w:val="20"/>
           <w:szCs w:val="20"/>
         </w:rPr>
-        <w:t>hunt(</w:t>
-      </w:r>
-      <w:proofErr w:type="gramEnd"/>
+        <w:t xml:space="preserve">    forwardSequence = []</w:t>
+      </w:r>
+    </w:p>
+    <w:p>
+      <w:pPr>
+        <w:spacing w:before="120" w:after="120" w:line="276" w:lineRule="auto"/>
+        <w:ind w:left="720"/>
+      </w:pPr>
       <w:r>
         <w:rPr>
           <w:rFonts w:ascii="Courier New" w:eastAsia="Courier New" w:hAnsi="Courier New" w:cs="Courier New"/>
@@ -704,7 +765,7 @@
           <w:sz w:val="20"/>
           <w:szCs w:val="20"/>
         </w:rPr>
-        <w:t>mid+1, high, sequence)       // Conquer right half</w:t>
+        <w:t xml:space="preserve">    hunt(2, n-1, forwardSequence)    // D&amp;C on inner spots</w:t>
       </w:r>
     </w:p>
     <w:p>
@@ -719,14 +780,8 @@
           <w:sz w:val="20"/>
           <w:szCs w:val="20"/>
         </w:rPr>
-        <w:t xml:space="preserve">    // No explicit combine — results appended in order</w:t>
-      </w:r>
-    </w:p>
-    <w:p>
-      <w:pPr>
-        <w:spacing w:before="120" w:after="120" w:line="276" w:lineRule="auto"/>
-        <w:ind w:left="720"/>
-      </w:pPr>
+        <w:t xml:space="preserve">    backwardSequence = REVERSE(forwardSequence)</w:t>
+      </w:r>
     </w:p>
     <w:p>
       <w:pPr>
@@ -740,9 +795,14 @@
           <w:sz w:val="20"/>
           <w:szCs w:val="20"/>
         </w:rPr>
-        <w:t xml:space="preserve">FUNCTION </w:t>
-      </w:r>
-      <w:proofErr w:type="spellStart"/>
+        <w:t xml:space="preserve">    shots = forwardSequence + backwardSequence</w:t>
+      </w:r>
+    </w:p>
+    <w:p>
+      <w:pPr>
+        <w:spacing w:before="120" w:after="120" w:line="276" w:lineRule="auto"/>
+        <w:ind w:left="720"/>
+      </w:pPr>
       <w:r>
         <w:rPr>
           <w:rFonts w:ascii="Courier New" w:eastAsia="Courier New" w:hAnsi="Courier New" w:cs="Courier New"/>
@@ -750,9 +810,14 @@
           <w:sz w:val="20"/>
           <w:szCs w:val="20"/>
         </w:rPr>
-        <w:t>movingTarget</w:t>
-      </w:r>
-      <w:proofErr w:type="spellEnd"/>
+        <w:t xml:space="preserve">    PRINT shots</w:t>
+      </w:r>
+    </w:p>
+    <w:p>
+      <w:pPr>
+        <w:spacing w:before="120" w:after="120" w:line="276" w:lineRule="auto"/>
+        <w:ind w:left="720"/>
+      </w:pPr>
       <w:r>
         <w:rPr>
           <w:rFonts w:ascii="Courier New" w:eastAsia="Courier New" w:hAnsi="Courier New" w:cs="Courier New"/>
@@ -760,335 +825,7 @@
           <w:sz w:val="20"/>
           <w:szCs w:val="20"/>
         </w:rPr>
-        <w:t>(n):</w:t>
-      </w:r>
-    </w:p>
-    <w:p>
-      <w:pPr>
-        <w:spacing w:before="120" w:after="120" w:line="276" w:lineRule="auto"/>
-        <w:ind w:left="720"/>
-      </w:pPr>
-      <w:r>
-        <w:rPr>
-          <w:rFonts w:ascii="Courier New" w:eastAsia="Courier New" w:hAnsi="Courier New" w:cs="Courier New"/>
-          <w:color w:val="2E4053"/>
-          <w:sz w:val="20"/>
-          <w:szCs w:val="20"/>
-        </w:rPr>
-        <w:t xml:space="preserve">    IF n == 2:</w:t>
-      </w:r>
-    </w:p>
-    <w:p>
-      <w:pPr>
-        <w:spacing w:before="120" w:after="120" w:line="276" w:lineRule="auto"/>
-        <w:ind w:left="720"/>
-      </w:pPr>
-      <w:r>
-        <w:rPr>
-          <w:rFonts w:ascii="Courier New" w:eastAsia="Courier New" w:hAnsi="Courier New" w:cs="Courier New"/>
-          <w:color w:val="2E4053"/>
-          <w:sz w:val="20"/>
-          <w:szCs w:val="20"/>
-        </w:rPr>
-        <w:t xml:space="preserve">        PRINT "Shoot spot 1, then spot 1 </w:t>
-      </w:r>
-      <w:proofErr w:type="gramStart"/>
-      <w:r>
-        <w:rPr>
-          <w:rFonts w:ascii="Courier New" w:eastAsia="Courier New" w:hAnsi="Courier New" w:cs="Courier New"/>
-          <w:color w:val="2E4053"/>
-          <w:sz w:val="20"/>
-          <w:szCs w:val="20"/>
-        </w:rPr>
-        <w:t>again</w:t>
-      </w:r>
-      <w:proofErr w:type="gramEnd"/>
-      <w:r>
-        <w:rPr>
-          <w:rFonts w:ascii="Courier New" w:eastAsia="Courier New" w:hAnsi="Courier New" w:cs="Courier New"/>
-          <w:color w:val="2E4053"/>
-          <w:sz w:val="20"/>
-          <w:szCs w:val="20"/>
-        </w:rPr>
-        <w:t>"</w:t>
-      </w:r>
-    </w:p>
-    <w:p>
-      <w:pPr>
-        <w:spacing w:before="120" w:after="120" w:line="276" w:lineRule="auto"/>
-        <w:ind w:left="720"/>
-      </w:pPr>
-      <w:r>
-        <w:rPr>
-          <w:rFonts w:ascii="Courier New" w:eastAsia="Courier New" w:hAnsi="Courier New" w:cs="Courier New"/>
-          <w:color w:val="2E4053"/>
-          <w:sz w:val="20"/>
-          <w:szCs w:val="20"/>
-        </w:rPr>
-        <w:t xml:space="preserve">        RETURN</w:t>
-      </w:r>
-    </w:p>
-    <w:p>
-      <w:pPr>
-        <w:spacing w:before="120" w:after="120" w:line="276" w:lineRule="auto"/>
-        <w:ind w:left="720"/>
-      </w:pPr>
-      <w:r>
-        <w:rPr>
-          <w:rFonts w:ascii="Courier New" w:eastAsia="Courier New" w:hAnsi="Courier New" w:cs="Courier New"/>
-          <w:color w:val="2E4053"/>
-          <w:sz w:val="20"/>
-          <w:szCs w:val="20"/>
-        </w:rPr>
-        <w:t xml:space="preserve">    </w:t>
-      </w:r>
-      <w:proofErr w:type="spellStart"/>
-      <w:r>
-        <w:rPr>
-          <w:rFonts w:ascii="Courier New" w:eastAsia="Courier New" w:hAnsi="Courier New" w:cs="Courier New"/>
-          <w:color w:val="2E4053"/>
-          <w:sz w:val="20"/>
-          <w:szCs w:val="20"/>
-        </w:rPr>
-        <w:t>forwardSequence</w:t>
-      </w:r>
-      <w:proofErr w:type="spellEnd"/>
-      <w:r>
-        <w:rPr>
-          <w:rFonts w:ascii="Courier New" w:eastAsia="Courier New" w:hAnsi="Courier New" w:cs="Courier New"/>
-          <w:color w:val="2E4053"/>
-          <w:sz w:val="20"/>
-          <w:szCs w:val="20"/>
-        </w:rPr>
-        <w:t xml:space="preserve"> = []</w:t>
-      </w:r>
-    </w:p>
-    <w:p>
-      <w:pPr>
-        <w:spacing w:before="120" w:after="120" w:line="276" w:lineRule="auto"/>
-        <w:ind w:left="720"/>
-      </w:pPr>
-      <w:r>
-        <w:rPr>
-          <w:rFonts w:ascii="Courier New" w:eastAsia="Courier New" w:hAnsi="Courier New" w:cs="Courier New"/>
-          <w:color w:val="2E4053"/>
-          <w:sz w:val="20"/>
-          <w:szCs w:val="20"/>
-        </w:rPr>
-        <w:t xml:space="preserve">    </w:t>
-      </w:r>
-      <w:proofErr w:type="gramStart"/>
-      <w:r>
-        <w:rPr>
-          <w:rFonts w:ascii="Courier New" w:eastAsia="Courier New" w:hAnsi="Courier New" w:cs="Courier New"/>
-          <w:color w:val="2E4053"/>
-          <w:sz w:val="20"/>
-          <w:szCs w:val="20"/>
-        </w:rPr>
-        <w:t>hunt(</w:t>
-      </w:r>
-      <w:proofErr w:type="gramEnd"/>
-      <w:r>
-        <w:rPr>
-          <w:rFonts w:ascii="Courier New" w:eastAsia="Courier New" w:hAnsi="Courier New" w:cs="Courier New"/>
-          <w:color w:val="2E4053"/>
-          <w:sz w:val="20"/>
-          <w:szCs w:val="20"/>
-        </w:rPr>
-        <w:t xml:space="preserve">2, n-1, </w:t>
-      </w:r>
-      <w:proofErr w:type="spellStart"/>
-      <w:r>
-        <w:rPr>
-          <w:rFonts w:ascii="Courier New" w:eastAsia="Courier New" w:hAnsi="Courier New" w:cs="Courier New"/>
-          <w:color w:val="2E4053"/>
-          <w:sz w:val="20"/>
-          <w:szCs w:val="20"/>
-        </w:rPr>
-        <w:t>forwardSequence</w:t>
-      </w:r>
-      <w:proofErr w:type="spellEnd"/>
-      <w:r>
-        <w:rPr>
-          <w:rFonts w:ascii="Courier New" w:eastAsia="Courier New" w:hAnsi="Courier New" w:cs="Courier New"/>
-          <w:color w:val="2E4053"/>
-          <w:sz w:val="20"/>
-          <w:szCs w:val="20"/>
-        </w:rPr>
-        <w:t>)    // D&amp;C on inner spots</w:t>
-      </w:r>
-    </w:p>
-    <w:p>
-      <w:pPr>
-        <w:spacing w:before="120" w:after="120" w:line="276" w:lineRule="auto"/>
-        <w:ind w:left="720"/>
-      </w:pPr>
-      <w:r>
-        <w:rPr>
-          <w:rFonts w:ascii="Courier New" w:eastAsia="Courier New" w:hAnsi="Courier New" w:cs="Courier New"/>
-          <w:color w:val="2E4053"/>
-          <w:sz w:val="20"/>
-          <w:szCs w:val="20"/>
-        </w:rPr>
-        <w:t xml:space="preserve">    </w:t>
-      </w:r>
-      <w:proofErr w:type="spellStart"/>
-      <w:r>
-        <w:rPr>
-          <w:rFonts w:ascii="Courier New" w:eastAsia="Courier New" w:hAnsi="Courier New" w:cs="Courier New"/>
-          <w:color w:val="2E4053"/>
-          <w:sz w:val="20"/>
-          <w:szCs w:val="20"/>
-        </w:rPr>
-        <w:t>backwardSequence</w:t>
-      </w:r>
-      <w:proofErr w:type="spellEnd"/>
-      <w:r>
-        <w:rPr>
-          <w:rFonts w:ascii="Courier New" w:eastAsia="Courier New" w:hAnsi="Courier New" w:cs="Courier New"/>
-          <w:color w:val="2E4053"/>
-          <w:sz w:val="20"/>
-          <w:szCs w:val="20"/>
-        </w:rPr>
-        <w:t xml:space="preserve"> = </w:t>
-      </w:r>
-      <w:proofErr w:type="gramStart"/>
-      <w:r>
-        <w:rPr>
-          <w:rFonts w:ascii="Courier New" w:eastAsia="Courier New" w:hAnsi="Courier New" w:cs="Courier New"/>
-          <w:color w:val="2E4053"/>
-          <w:sz w:val="20"/>
-          <w:szCs w:val="20"/>
-        </w:rPr>
-        <w:t>REVERSE(</w:t>
-      </w:r>
-      <w:proofErr w:type="spellStart"/>
-      <w:proofErr w:type="gramEnd"/>
-      <w:r>
-        <w:rPr>
-          <w:rFonts w:ascii="Courier New" w:eastAsia="Courier New" w:hAnsi="Courier New" w:cs="Courier New"/>
-          <w:color w:val="2E4053"/>
-          <w:sz w:val="20"/>
-          <w:szCs w:val="20"/>
-        </w:rPr>
-        <w:t>forwardSequence</w:t>
-      </w:r>
-      <w:proofErr w:type="spellEnd"/>
-      <w:r>
-        <w:rPr>
-          <w:rFonts w:ascii="Courier New" w:eastAsia="Courier New" w:hAnsi="Courier New" w:cs="Courier New"/>
-          <w:color w:val="2E4053"/>
-          <w:sz w:val="20"/>
-          <w:szCs w:val="20"/>
-        </w:rPr>
-        <w:t>)</w:t>
-      </w:r>
-    </w:p>
-    <w:p>
-      <w:pPr>
-        <w:spacing w:before="120" w:after="120" w:line="276" w:lineRule="auto"/>
-        <w:ind w:left="720"/>
-      </w:pPr>
-      <w:r>
-        <w:rPr>
-          <w:rFonts w:ascii="Courier New" w:eastAsia="Courier New" w:hAnsi="Courier New" w:cs="Courier New"/>
-          <w:color w:val="2E4053"/>
-          <w:sz w:val="20"/>
-          <w:szCs w:val="20"/>
-        </w:rPr>
-        <w:t xml:space="preserve">    shots = </w:t>
-      </w:r>
-      <w:proofErr w:type="spellStart"/>
-      <w:r>
-        <w:rPr>
-          <w:rFonts w:ascii="Courier New" w:eastAsia="Courier New" w:hAnsi="Courier New" w:cs="Courier New"/>
-          <w:color w:val="2E4053"/>
-          <w:sz w:val="20"/>
-          <w:szCs w:val="20"/>
-        </w:rPr>
-        <w:t>forwardSequence</w:t>
-      </w:r>
-      <w:proofErr w:type="spellEnd"/>
-      <w:r>
-        <w:rPr>
-          <w:rFonts w:ascii="Courier New" w:eastAsia="Courier New" w:hAnsi="Courier New" w:cs="Courier New"/>
-          <w:color w:val="2E4053"/>
-          <w:sz w:val="20"/>
-          <w:szCs w:val="20"/>
-        </w:rPr>
-        <w:t xml:space="preserve"> + </w:t>
-      </w:r>
-      <w:proofErr w:type="spellStart"/>
-      <w:r>
-        <w:rPr>
-          <w:rFonts w:ascii="Courier New" w:eastAsia="Courier New" w:hAnsi="Courier New" w:cs="Courier New"/>
-          <w:color w:val="2E4053"/>
-          <w:sz w:val="20"/>
-          <w:szCs w:val="20"/>
-        </w:rPr>
-        <w:t>backwardSequence</w:t>
-      </w:r>
-      <w:proofErr w:type="spellEnd"/>
-    </w:p>
-    <w:p>
-      <w:pPr>
-        <w:spacing w:before="120" w:after="120" w:line="276" w:lineRule="auto"/>
-        <w:ind w:left="720"/>
-      </w:pPr>
-      <w:r>
-        <w:rPr>
-          <w:rFonts w:ascii="Courier New" w:eastAsia="Courier New" w:hAnsi="Courier New" w:cs="Courier New"/>
-          <w:color w:val="2E4053"/>
-          <w:sz w:val="20"/>
-          <w:szCs w:val="20"/>
-        </w:rPr>
-        <w:t xml:space="preserve">    PRINT shots</w:t>
-      </w:r>
-    </w:p>
-    <w:p>
-      <w:pPr>
-        <w:spacing w:before="120" w:after="120" w:line="276" w:lineRule="auto"/>
-        <w:ind w:left="720"/>
-      </w:pPr>
-      <w:r>
-        <w:rPr>
-          <w:rFonts w:ascii="Courier New" w:eastAsia="Courier New" w:hAnsi="Courier New" w:cs="Courier New"/>
-          <w:color w:val="2E4053"/>
-          <w:sz w:val="20"/>
-          <w:szCs w:val="20"/>
-        </w:rPr>
-        <w:t xml:space="preserve">    PRINT "Total shots needed: " + 2 * </w:t>
-      </w:r>
-      <w:proofErr w:type="gramStart"/>
-      <w:r>
-        <w:rPr>
-          <w:rFonts w:ascii="Courier New" w:eastAsia="Courier New" w:hAnsi="Courier New" w:cs="Courier New"/>
-          <w:color w:val="2E4053"/>
-          <w:sz w:val="20"/>
-          <w:szCs w:val="20"/>
-        </w:rPr>
-        <w:t>SIZE(</w:t>
-      </w:r>
-      <w:proofErr w:type="spellStart"/>
-      <w:proofErr w:type="gramEnd"/>
-      <w:r>
-        <w:rPr>
-          <w:rFonts w:ascii="Courier New" w:eastAsia="Courier New" w:hAnsi="Courier New" w:cs="Courier New"/>
-          <w:color w:val="2E4053"/>
-          <w:sz w:val="20"/>
-          <w:szCs w:val="20"/>
-        </w:rPr>
-        <w:t>forwardSequence</w:t>
-      </w:r>
-      <w:proofErr w:type="spellEnd"/>
-      <w:r>
-        <w:rPr>
-          <w:rFonts w:ascii="Courier New" w:eastAsia="Courier New" w:hAnsi="Courier New" w:cs="Courier New"/>
-          <w:color w:val="2E4053"/>
-          <w:sz w:val="20"/>
-          <w:szCs w:val="20"/>
-        </w:rPr>
-        <w:t>)</w:t>
+        <w:t xml:space="preserve">    PRINT "Total shots needed: " + 2 * SIZE(forwardSequence)</w:t>
       </w:r>
     </w:p>
     <w:p>
@@ -1098,28 +835,24 @@
     </w:p>
     <w:p>
       <w:pPr>
-        <w:pStyle w:val="Heading1"/>
+        <w:pStyle w:val="Heading2"/>
       </w:pPr>
       <w:bookmarkStart w:id="6" w:name="_Toc228918278"/>
       <w:r>
         <w:lastRenderedPageBreak/>
-        <w:t>5. Implementation Code</w:t>
+        <w:t>5.</w:t>
+      </w:r>
+      <w:r>
+        <w:t xml:space="preserve">5 Implementation </w:t>
+      </w:r>
+      <w:r>
+        <w:t>c</w:t>
+      </w:r>
+      <w:r>
+        <w:t>ode</w:t>
       </w:r>
       <w:bookmarkEnd w:id="6"/>
     </w:p>
-    <w:p>
-      <w:pPr>
-        <w:spacing w:before="240" w:after="120" w:line="360" w:lineRule="auto"/>
-        <w:jc w:val="both"/>
-      </w:pPr>
-      <w:r>
-        <w:rPr>
-          <w:color w:val="000000"/>
-        </w:rPr>
-        <w:t>The following C++ implementation realizes the above pseudocode:</w:t>
-      </w:r>
-    </w:p>
-    <w:p/>
     <w:p>
       <w:pPr>
         <w:shd w:val="clear" w:color="auto" w:fill="1E1E1E"/>
@@ -1245,7 +978,6 @@
         </w:rPr>
         <w:t xml:space="preserve"> </w:t>
       </w:r>
-      <w:proofErr w:type="gramStart"/>
       <w:r>
         <w:rPr>
           <w:rFonts w:ascii="Consolas" w:eastAsia="Times New Roman" w:hAnsi="Consolas" w:cs="Times New Roman"/>
@@ -1264,7 +996,6 @@
         </w:rPr>
         <w:t>;</w:t>
       </w:r>
-      <w:proofErr w:type="gramEnd"/>
     </w:p>
     <w:p>
       <w:pPr>
@@ -1307,7 +1038,6 @@
         </w:rPr>
         <w:t xml:space="preserve"> </w:t>
       </w:r>
-      <w:proofErr w:type="gramStart"/>
       <w:r>
         <w:rPr>
           <w:rFonts w:ascii="Consolas" w:eastAsia="Times New Roman" w:hAnsi="Consolas" w:cs="Times New Roman"/>
@@ -1326,7 +1056,6 @@
         </w:rPr>
         <w:t>(</w:t>
       </w:r>
-      <w:proofErr w:type="gramEnd"/>
       <w:r>
         <w:rPr>
           <w:rFonts w:ascii="Consolas" w:eastAsia="Times New Roman" w:hAnsi="Consolas" w:cs="Times New Roman"/>
@@ -1345,7 +1074,6 @@
         </w:rPr>
         <w:t xml:space="preserve"> </w:t>
       </w:r>
-      <w:proofErr w:type="spellStart"/>
       <w:r>
         <w:rPr>
           <w:rFonts w:ascii="Consolas" w:eastAsia="Times New Roman" w:hAnsi="Consolas" w:cs="Times New Roman"/>
@@ -1355,7 +1083,6 @@
         </w:rPr>
         <w:t>lowerLimit</w:t>
       </w:r>
-      <w:proofErr w:type="spellEnd"/>
       <w:r>
         <w:rPr>
           <w:rFonts w:ascii="Consolas" w:eastAsia="Times New Roman" w:hAnsi="Consolas" w:cs="Times New Roman"/>
@@ -1383,7 +1110,6 @@
         </w:rPr>
         <w:t xml:space="preserve"> </w:t>
       </w:r>
-      <w:proofErr w:type="spellStart"/>
       <w:r>
         <w:rPr>
           <w:rFonts w:ascii="Consolas" w:eastAsia="Times New Roman" w:hAnsi="Consolas" w:cs="Times New Roman"/>
@@ -1393,7 +1119,6 @@
         </w:rPr>
         <w:t>higherLimit</w:t>
       </w:r>
-      <w:proofErr w:type="spellEnd"/>
       <w:r>
         <w:rPr>
           <w:rFonts w:ascii="Consolas" w:eastAsia="Times New Roman" w:hAnsi="Consolas" w:cs="Times New Roman"/>
@@ -1448,7 +1173,6 @@
         </w:rPr>
         <w:t>&amp;</w:t>
       </w:r>
-      <w:proofErr w:type="spellStart"/>
       <w:r>
         <w:rPr>
           <w:rFonts w:ascii="Consolas" w:eastAsia="Times New Roman" w:hAnsi="Consolas" w:cs="Times New Roman"/>
@@ -1458,7 +1182,6 @@
         </w:rPr>
         <w:t>forwardSequence</w:t>
       </w:r>
-      <w:proofErr w:type="spellEnd"/>
       <w:r>
         <w:rPr>
           <w:rFonts w:ascii="Consolas" w:eastAsia="Times New Roman" w:hAnsi="Consolas" w:cs="Times New Roman"/>
@@ -1549,7 +1272,6 @@
         </w:rPr>
         <w:t xml:space="preserve"> (</w:t>
       </w:r>
-      <w:proofErr w:type="spellStart"/>
       <w:r>
         <w:rPr>
           <w:rFonts w:ascii="Consolas" w:eastAsia="Times New Roman" w:hAnsi="Consolas" w:cs="Times New Roman"/>
@@ -1559,7 +1281,6 @@
         </w:rPr>
         <w:t>lowerLimit</w:t>
       </w:r>
-      <w:proofErr w:type="spellEnd"/>
       <w:r>
         <w:rPr>
           <w:rFonts w:ascii="Consolas" w:eastAsia="Times New Roman" w:hAnsi="Consolas" w:cs="Times New Roman"/>
@@ -1569,7 +1290,6 @@
         </w:rPr>
         <w:t xml:space="preserve"> &gt; </w:t>
       </w:r>
-      <w:proofErr w:type="spellStart"/>
       <w:r>
         <w:rPr>
           <w:rFonts w:ascii="Consolas" w:eastAsia="Times New Roman" w:hAnsi="Consolas" w:cs="Times New Roman"/>
@@ -1579,7 +1299,6 @@
         </w:rPr>
         <w:t>higherLimit</w:t>
       </w:r>
-      <w:proofErr w:type="spellEnd"/>
       <w:r>
         <w:rPr>
           <w:rFonts w:ascii="Consolas" w:eastAsia="Times New Roman" w:hAnsi="Consolas" w:cs="Times New Roman"/>
@@ -1610,7 +1329,6 @@
         </w:rPr>
         <w:t xml:space="preserve">        </w:t>
       </w:r>
-      <w:proofErr w:type="gramStart"/>
       <w:r>
         <w:rPr>
           <w:rFonts w:ascii="Consolas" w:eastAsia="Times New Roman" w:hAnsi="Consolas" w:cs="Times New Roman"/>
@@ -1629,7 +1347,6 @@
         </w:rPr>
         <w:t>;</w:t>
       </w:r>
-      <w:proofErr w:type="gramEnd"/>
     </w:p>
     <w:p>
       <w:pPr>
@@ -1669,7 +1386,6 @@
         </w:rPr>
         <w:t xml:space="preserve"> (</w:t>
       </w:r>
-      <w:proofErr w:type="spellStart"/>
       <w:r>
         <w:rPr>
           <w:rFonts w:ascii="Consolas" w:eastAsia="Times New Roman" w:hAnsi="Consolas" w:cs="Times New Roman"/>
@@ -1679,7 +1395,6 @@
         </w:rPr>
         <w:t>lowerLimit</w:t>
       </w:r>
-      <w:proofErr w:type="spellEnd"/>
       <w:r>
         <w:rPr>
           <w:rFonts w:ascii="Consolas" w:eastAsia="Times New Roman" w:hAnsi="Consolas" w:cs="Times New Roman"/>
@@ -1689,7 +1404,6 @@
         </w:rPr>
         <w:t xml:space="preserve"> == </w:t>
       </w:r>
-      <w:proofErr w:type="spellStart"/>
       <w:r>
         <w:rPr>
           <w:rFonts w:ascii="Consolas" w:eastAsia="Times New Roman" w:hAnsi="Consolas" w:cs="Times New Roman"/>
@@ -1699,7 +1413,6 @@
         </w:rPr>
         <w:t>higherLimit</w:t>
       </w:r>
-      <w:proofErr w:type="spellEnd"/>
       <w:r>
         <w:rPr>
           <w:rFonts w:ascii="Consolas" w:eastAsia="Times New Roman" w:hAnsi="Consolas" w:cs="Times New Roman"/>
@@ -1751,7 +1464,6 @@
         </w:rPr>
         <w:t xml:space="preserve">        </w:t>
       </w:r>
-      <w:proofErr w:type="spellStart"/>
       <w:r>
         <w:rPr>
           <w:rFonts w:ascii="Consolas" w:eastAsia="Times New Roman" w:hAnsi="Consolas" w:cs="Times New Roman"/>
@@ -1779,7 +1491,6 @@
         </w:rPr>
         <w:t>push_back</w:t>
       </w:r>
-      <w:proofErr w:type="spellEnd"/>
       <w:r>
         <w:rPr>
           <w:rFonts w:ascii="Consolas" w:eastAsia="Times New Roman" w:hAnsi="Consolas" w:cs="Times New Roman"/>
@@ -1789,7 +1500,6 @@
         </w:rPr>
         <w:t>(</w:t>
       </w:r>
-      <w:proofErr w:type="spellStart"/>
       <w:r>
         <w:rPr>
           <w:rFonts w:ascii="Consolas" w:eastAsia="Times New Roman" w:hAnsi="Consolas" w:cs="Times New Roman"/>
@@ -1799,8 +1509,6 @@
         </w:rPr>
         <w:t>lowerLimit</w:t>
       </w:r>
-      <w:proofErr w:type="spellEnd"/>
-      <w:proofErr w:type="gramStart"/>
       <w:r>
         <w:rPr>
           <w:rFonts w:ascii="Consolas" w:eastAsia="Times New Roman" w:hAnsi="Consolas" w:cs="Times New Roman"/>
@@ -1810,7 +1518,6 @@
         </w:rPr>
         <w:t>);</w:t>
       </w:r>
-      <w:proofErr w:type="gramEnd"/>
     </w:p>
     <w:p>
       <w:pPr>
@@ -1832,7 +1539,6 @@
         </w:rPr>
         <w:t xml:space="preserve">        </w:t>
       </w:r>
-      <w:proofErr w:type="gramStart"/>
       <w:r>
         <w:rPr>
           <w:rFonts w:ascii="Consolas" w:eastAsia="Times New Roman" w:hAnsi="Consolas" w:cs="Times New Roman"/>
@@ -1851,7 +1557,6 @@
         </w:rPr>
         <w:t>;</w:t>
       </w:r>
-      <w:proofErr w:type="gramEnd"/>
     </w:p>
     <w:p>
       <w:pPr>
@@ -1942,7 +1647,6 @@
         </w:rPr>
         <w:t xml:space="preserve"> = (</w:t>
       </w:r>
-      <w:proofErr w:type="spellStart"/>
       <w:r>
         <w:rPr>
           <w:rFonts w:ascii="Consolas" w:eastAsia="Times New Roman" w:hAnsi="Consolas" w:cs="Times New Roman"/>
@@ -1952,7 +1656,6 @@
         </w:rPr>
         <w:t>lowerLimit</w:t>
       </w:r>
-      <w:proofErr w:type="spellEnd"/>
       <w:r>
         <w:rPr>
           <w:rFonts w:ascii="Consolas" w:eastAsia="Times New Roman" w:hAnsi="Consolas" w:cs="Times New Roman"/>
@@ -1962,7 +1665,6 @@
         </w:rPr>
         <w:t xml:space="preserve"> + </w:t>
       </w:r>
-      <w:proofErr w:type="spellStart"/>
       <w:r>
         <w:rPr>
           <w:rFonts w:ascii="Consolas" w:eastAsia="Times New Roman" w:hAnsi="Consolas" w:cs="Times New Roman"/>
@@ -1972,7 +1674,6 @@
         </w:rPr>
         <w:t>higherLimit</w:t>
       </w:r>
-      <w:proofErr w:type="spellEnd"/>
       <w:r>
         <w:rPr>
           <w:rFonts w:ascii="Consolas" w:eastAsia="Times New Roman" w:hAnsi="Consolas" w:cs="Times New Roman"/>
@@ -1982,7 +1683,6 @@
         </w:rPr>
         <w:t xml:space="preserve">) / </w:t>
       </w:r>
-      <w:proofErr w:type="gramStart"/>
       <w:r>
         <w:rPr>
           <w:rFonts w:ascii="Consolas" w:eastAsia="Times New Roman" w:hAnsi="Consolas" w:cs="Times New Roman"/>
@@ -2001,7 +1701,6 @@
         </w:rPr>
         <w:t>;</w:t>
       </w:r>
-      <w:proofErr w:type="gramEnd"/>
     </w:p>
     <w:p>
       <w:pPr>
@@ -2023,7 +1722,6 @@
         </w:rPr>
         <w:t xml:space="preserve">    </w:t>
       </w:r>
-      <w:proofErr w:type="gramStart"/>
       <w:r>
         <w:rPr>
           <w:rFonts w:ascii="Consolas" w:eastAsia="Times New Roman" w:hAnsi="Consolas" w:cs="Times New Roman"/>
@@ -2042,8 +1740,6 @@
         </w:rPr>
         <w:t>(</w:t>
       </w:r>
-      <w:proofErr w:type="spellStart"/>
-      <w:proofErr w:type="gramEnd"/>
       <w:r>
         <w:rPr>
           <w:rFonts w:ascii="Consolas" w:eastAsia="Times New Roman" w:hAnsi="Consolas" w:cs="Times New Roman"/>
@@ -2053,7 +1749,6 @@
         </w:rPr>
         <w:t>lowerLimit</w:t>
       </w:r>
-      <w:proofErr w:type="spellEnd"/>
       <w:r>
         <w:rPr>
           <w:rFonts w:ascii="Consolas" w:eastAsia="Times New Roman" w:hAnsi="Consolas" w:cs="Times New Roman"/>
@@ -2081,7 +1776,6 @@
         </w:rPr>
         <w:t xml:space="preserve">, </w:t>
       </w:r>
-      <w:proofErr w:type="spellStart"/>
       <w:r>
         <w:rPr>
           <w:rFonts w:ascii="Consolas" w:eastAsia="Times New Roman" w:hAnsi="Consolas" w:cs="Times New Roman"/>
@@ -2091,7 +1785,6 @@
         </w:rPr>
         <w:t>forwardSequence</w:t>
       </w:r>
-      <w:proofErr w:type="spellEnd"/>
       <w:r>
         <w:rPr>
           <w:rFonts w:ascii="Consolas" w:eastAsia="Times New Roman" w:hAnsi="Consolas" w:cs="Times New Roman"/>
@@ -2131,7 +1824,6 @@
         </w:rPr>
         <w:t xml:space="preserve">    </w:t>
       </w:r>
-      <w:proofErr w:type="gramStart"/>
       <w:r>
         <w:rPr>
           <w:rFonts w:ascii="Consolas" w:eastAsia="Times New Roman" w:hAnsi="Consolas" w:cs="Times New Roman"/>
@@ -2150,7 +1842,6 @@
         </w:rPr>
         <w:t>(</w:t>
       </w:r>
-      <w:proofErr w:type="gramEnd"/>
       <w:r>
         <w:rPr>
           <w:rFonts w:ascii="Consolas" w:eastAsia="Times New Roman" w:hAnsi="Consolas" w:cs="Times New Roman"/>
@@ -2187,7 +1878,6 @@
         </w:rPr>
         <w:t xml:space="preserve">, </w:t>
       </w:r>
-      <w:proofErr w:type="spellStart"/>
       <w:r>
         <w:rPr>
           <w:rFonts w:ascii="Consolas" w:eastAsia="Times New Roman" w:hAnsi="Consolas" w:cs="Times New Roman"/>
@@ -2197,7 +1887,6 @@
         </w:rPr>
         <w:t>higherLimit</w:t>
       </w:r>
-      <w:proofErr w:type="spellEnd"/>
       <w:r>
         <w:rPr>
           <w:rFonts w:ascii="Consolas" w:eastAsia="Times New Roman" w:hAnsi="Consolas" w:cs="Times New Roman"/>
@@ -2207,7 +1896,6 @@
         </w:rPr>
         <w:t xml:space="preserve">, </w:t>
       </w:r>
-      <w:proofErr w:type="spellStart"/>
       <w:r>
         <w:rPr>
           <w:rFonts w:ascii="Consolas" w:eastAsia="Times New Roman" w:hAnsi="Consolas" w:cs="Times New Roman"/>
@@ -2217,7 +1905,6 @@
         </w:rPr>
         <w:t>forwardSequence</w:t>
       </w:r>
-      <w:proofErr w:type="spellEnd"/>
       <w:r>
         <w:rPr>
           <w:rFonts w:ascii="Consolas" w:eastAsia="Times New Roman" w:hAnsi="Consolas" w:cs="Times New Roman"/>
@@ -2302,6 +1989,42 @@
           <w:szCs w:val="21"/>
         </w:rPr>
       </w:pPr>
+      <w:r>
+        <w:rPr>
+          <w:rFonts w:ascii="Consolas" w:eastAsia="Times New Roman" w:hAnsi="Consolas" w:cs="Times New Roman"/>
+          <w:color w:val="569CD6"/>
+          <w:sz w:val="21"/>
+          <w:szCs w:val="21"/>
+        </w:rPr>
+        <w:t>int</w:t>
+      </w:r>
+      <w:r>
+        <w:rPr>
+          <w:rFonts w:ascii="Consolas" w:eastAsia="Times New Roman" w:hAnsi="Consolas" w:cs="Times New Roman"/>
+          <w:color w:val="D4D4D4"/>
+          <w:sz w:val="21"/>
+          <w:szCs w:val="21"/>
+        </w:rPr>
+        <w:t xml:space="preserve"> </w:t>
+      </w:r>
+      <w:r>
+        <w:rPr>
+          <w:rFonts w:ascii="Consolas" w:eastAsia="Times New Roman" w:hAnsi="Consolas" w:cs="Times New Roman"/>
+          <w:color w:val="DCDCAA"/>
+          <w:sz w:val="21"/>
+          <w:szCs w:val="21"/>
+        </w:rPr>
+        <w:t>main</w:t>
+      </w:r>
+      <w:r>
+        <w:rPr>
+          <w:rFonts w:ascii="Consolas" w:eastAsia="Times New Roman" w:hAnsi="Consolas" w:cs="Times New Roman"/>
+          <w:color w:val="D4D4D4"/>
+          <w:sz w:val="21"/>
+          <w:szCs w:val="21"/>
+        </w:rPr>
+        <w:t>()</w:t>
+      </w:r>
     </w:p>
     <w:p>
       <w:pPr>
@@ -2317,49 +2040,11 @@
       <w:r>
         <w:rPr>
           <w:rFonts w:ascii="Consolas" w:eastAsia="Times New Roman" w:hAnsi="Consolas" w:cs="Times New Roman"/>
-          <w:color w:val="569CD6"/>
-          <w:sz w:val="21"/>
-          <w:szCs w:val="21"/>
-        </w:rPr>
-        <w:t>int</w:t>
-      </w:r>
-      <w:r>
-        <w:rPr>
-          <w:rFonts w:ascii="Consolas" w:eastAsia="Times New Roman" w:hAnsi="Consolas" w:cs="Times New Roman"/>
-          <w:color w:val="D4D4D4"/>
-          <w:sz w:val="21"/>
-          <w:szCs w:val="21"/>
-        </w:rPr>
-        <w:t xml:space="preserve"> </w:t>
-      </w:r>
-      <w:proofErr w:type="gramStart"/>
-      <w:r>
-        <w:rPr>
-          <w:rFonts w:ascii="Consolas" w:eastAsia="Times New Roman" w:hAnsi="Consolas" w:cs="Times New Roman"/>
-          <w:color w:val="DCDCAA"/>
-          <w:sz w:val="21"/>
-          <w:szCs w:val="21"/>
-        </w:rPr>
-        <w:t>main</w:t>
-      </w:r>
-      <w:r>
-        <w:rPr>
-          <w:rFonts w:ascii="Consolas" w:eastAsia="Times New Roman" w:hAnsi="Consolas" w:cs="Times New Roman"/>
-          <w:color w:val="D4D4D4"/>
-          <w:sz w:val="21"/>
-          <w:szCs w:val="21"/>
-        </w:rPr>
-        <w:t>(</w:t>
-      </w:r>
-      <w:proofErr w:type="gramEnd"/>
-      <w:r>
-        <w:rPr>
-          <w:rFonts w:ascii="Consolas" w:eastAsia="Times New Roman" w:hAnsi="Consolas" w:cs="Times New Roman"/>
-          <w:color w:val="D4D4D4"/>
-          <w:sz w:val="21"/>
-          <w:szCs w:val="21"/>
-        </w:rPr>
-        <w:t>)</w:t>
+          <w:color w:val="D4D4D4"/>
+          <w:sz w:val="21"/>
+          <w:szCs w:val="21"/>
+        </w:rPr>
+        <w:t>{</w:t>
       </w:r>
     </w:p>
     <w:p>
@@ -2380,7 +2065,61 @@
           <w:sz w:val="21"/>
           <w:szCs w:val="21"/>
         </w:rPr>
-        <w:t>{</w:t>
+        <w:t xml:space="preserve">    </w:t>
+      </w:r>
+      <w:r>
+        <w:rPr>
+          <w:rFonts w:ascii="Consolas" w:eastAsia="Times New Roman" w:hAnsi="Consolas" w:cs="Times New Roman"/>
+          <w:color w:val="9CDCFE"/>
+          <w:sz w:val="21"/>
+          <w:szCs w:val="21"/>
+        </w:rPr>
+        <w:t>cout</w:t>
+      </w:r>
+      <w:r>
+        <w:rPr>
+          <w:rFonts w:ascii="Consolas" w:eastAsia="Times New Roman" w:hAnsi="Consolas" w:cs="Times New Roman"/>
+          <w:color w:val="D4D4D4"/>
+          <w:sz w:val="21"/>
+          <w:szCs w:val="21"/>
+        </w:rPr>
+        <w:t xml:space="preserve"> </w:t>
+      </w:r>
+      <w:r>
+        <w:rPr>
+          <w:rFonts w:ascii="Consolas" w:eastAsia="Times New Roman" w:hAnsi="Consolas" w:cs="Times New Roman"/>
+          <w:color w:val="DCDCAA"/>
+          <w:sz w:val="21"/>
+          <w:szCs w:val="21"/>
+        </w:rPr>
+        <w:t>&lt;&lt;</w:t>
+      </w:r>
+      <w:r>
+        <w:rPr>
+          <w:rFonts w:ascii="Consolas" w:eastAsia="Times New Roman" w:hAnsi="Consolas" w:cs="Times New Roman"/>
+          <w:color w:val="D4D4D4"/>
+          <w:sz w:val="21"/>
+          <w:szCs w:val="21"/>
+        </w:rPr>
+        <w:t xml:space="preserve"> </w:t>
+      </w:r>
+      <w:r>
+        <w:rPr>
+          <w:rFonts w:ascii="Consolas" w:eastAsia="Times New Roman" w:hAnsi="Consolas" w:cs="Times New Roman"/>
+          <w:color w:val="CE9178"/>
+          <w:sz w:val="21"/>
+          <w:szCs w:val="21"/>
+        </w:rPr>
+        <w:t>"Enter no. of spots (n &gt; 1): "</w:t>
+      </w:r>
+      <w:r>
+        <w:rPr>
+          <w:rFonts w:ascii="Consolas" w:eastAsia="Times New Roman" w:hAnsi="Consolas" w:cs="Times New Roman"/>
+          <w:color w:val="D4D4D4"/>
+          <w:sz w:val="21"/>
+          <w:szCs w:val="21"/>
+        </w:rPr>
+        <w:t>;</w:t>
       </w:r>
     </w:p>
     <w:p>
@@ -2403,7 +2142,24 @@
         </w:rPr>
         <w:t xml:space="preserve">    </w:t>
       </w:r>
-      <w:proofErr w:type="spellStart"/>
+      <w:r>
+        <w:rPr>
+          <w:rFonts w:ascii="Consolas" w:eastAsia="Times New Roman" w:hAnsi="Consolas" w:cs="Times New Roman"/>
+          <w:color w:val="569CD6"/>
+          <w:sz w:val="21"/>
+          <w:szCs w:val="21"/>
+        </w:rPr>
+        <w:t>int</w:t>
+      </w:r>
+      <w:r>
+        <w:rPr>
+          <w:rFonts w:ascii="Consolas" w:eastAsia="Times New Roman" w:hAnsi="Consolas" w:cs="Times New Roman"/>
+          <w:color w:val="D4D4D4"/>
+          <w:sz w:val="21"/>
+          <w:szCs w:val="21"/>
+        </w:rPr>
+        <w:t xml:space="preserve"> </w:t>
+      </w:r>
       <w:r>
         <w:rPr>
           <w:rFonts w:ascii="Consolas" w:eastAsia="Times New Roman" w:hAnsi="Consolas" w:cs="Times New Roman"/>
@@ -2411,54 +2167,7 @@
           <w:sz w:val="21"/>
           <w:szCs w:val="21"/>
         </w:rPr>
-        <w:t>cout</w:t>
-      </w:r>
-      <w:proofErr w:type="spellEnd"/>
-      <w:r>
-        <w:rPr>
-          <w:rFonts w:ascii="Consolas" w:eastAsia="Times New Roman" w:hAnsi="Consolas" w:cs="Times New Roman"/>
-          <w:color w:val="D4D4D4"/>
-          <w:sz w:val="21"/>
-          <w:szCs w:val="21"/>
-        </w:rPr>
-        <w:t xml:space="preserve"> </w:t>
-      </w:r>
-      <w:r>
-        <w:rPr>
-          <w:rFonts w:ascii="Consolas" w:eastAsia="Times New Roman" w:hAnsi="Consolas" w:cs="Times New Roman"/>
-          <w:color w:val="DCDCAA"/>
-          <w:sz w:val="21"/>
-          <w:szCs w:val="21"/>
-        </w:rPr>
-        <w:t>&lt;&lt;</w:t>
-      </w:r>
-      <w:r>
-        <w:rPr>
-          <w:rFonts w:ascii="Consolas" w:eastAsia="Times New Roman" w:hAnsi="Consolas" w:cs="Times New Roman"/>
-          <w:color w:val="D4D4D4"/>
-          <w:sz w:val="21"/>
-          <w:szCs w:val="21"/>
-        </w:rPr>
-        <w:t xml:space="preserve"> </w:t>
-      </w:r>
-      <w:r>
-        <w:rPr>
-          <w:rFonts w:ascii="Consolas" w:eastAsia="Times New Roman" w:hAnsi="Consolas" w:cs="Times New Roman"/>
-          <w:color w:val="CE9178"/>
-          <w:sz w:val="21"/>
-          <w:szCs w:val="21"/>
-        </w:rPr>
-        <w:t xml:space="preserve">"Enter no. of spots (n &gt; 1): </w:t>
-      </w:r>
-      <w:proofErr w:type="gramStart"/>
-      <w:r>
-        <w:rPr>
-          <w:rFonts w:ascii="Consolas" w:eastAsia="Times New Roman" w:hAnsi="Consolas" w:cs="Times New Roman"/>
-          <w:color w:val="CE9178"/>
-          <w:sz w:val="21"/>
-          <w:szCs w:val="21"/>
-        </w:rPr>
-        <w:t>"</w:t>
+        <w:t>spots</w:t>
       </w:r>
       <w:r>
         <w:rPr>
@@ -2469,7 +2178,6 @@
         </w:rPr>
         <w:t>;</w:t>
       </w:r>
-      <w:proofErr w:type="gramEnd"/>
     </w:p>
     <w:p>
       <w:pPr>
@@ -2494,11 +2202,11 @@
       <w:r>
         <w:rPr>
           <w:rFonts w:ascii="Consolas" w:eastAsia="Times New Roman" w:hAnsi="Consolas" w:cs="Times New Roman"/>
-          <w:color w:val="569CD6"/>
-          <w:sz w:val="21"/>
-          <w:szCs w:val="21"/>
-        </w:rPr>
-        <w:t>int</w:t>
+          <w:color w:val="9CDCFE"/>
+          <w:sz w:val="21"/>
+          <w:szCs w:val="21"/>
+        </w:rPr>
+        <w:t>cin</w:t>
       </w:r>
       <w:r>
         <w:rPr>
@@ -2509,7 +2217,24 @@
         </w:rPr>
         <w:t xml:space="preserve"> </w:t>
       </w:r>
-      <w:proofErr w:type="gramStart"/>
+      <w:r>
+        <w:rPr>
+          <w:rFonts w:ascii="Consolas" w:eastAsia="Times New Roman" w:hAnsi="Consolas" w:cs="Times New Roman"/>
+          <w:color w:val="DCDCAA"/>
+          <w:sz w:val="21"/>
+          <w:szCs w:val="21"/>
+        </w:rPr>
+        <w:t>&gt;&gt;</w:t>
+      </w:r>
+      <w:r>
+        <w:rPr>
+          <w:rFonts w:ascii="Consolas" w:eastAsia="Times New Roman" w:hAnsi="Consolas" w:cs="Times New Roman"/>
+          <w:color w:val="D4D4D4"/>
+          <w:sz w:val="21"/>
+          <w:szCs w:val="21"/>
+        </w:rPr>
+        <w:t xml:space="preserve"> </w:t>
+      </w:r>
       <w:r>
         <w:rPr>
           <w:rFonts w:ascii="Consolas" w:eastAsia="Times New Roman" w:hAnsi="Consolas" w:cs="Times New Roman"/>
@@ -2528,7 +2253,6 @@
         </w:rPr>
         <w:t>;</w:t>
       </w:r>
-      <w:proofErr w:type="gramEnd"/>
     </w:p>
     <w:p>
       <w:pPr>
@@ -2541,73 +2265,6 @@
           <w:szCs w:val="21"/>
         </w:rPr>
       </w:pPr>
-      <w:r>
-        <w:rPr>
-          <w:rFonts w:ascii="Consolas" w:eastAsia="Times New Roman" w:hAnsi="Consolas" w:cs="Times New Roman"/>
-          <w:color w:val="D4D4D4"/>
-          <w:sz w:val="21"/>
-          <w:szCs w:val="21"/>
-        </w:rPr>
-        <w:t xml:space="preserve">    </w:t>
-      </w:r>
-      <w:proofErr w:type="spellStart"/>
-      <w:r>
-        <w:rPr>
-          <w:rFonts w:ascii="Consolas" w:eastAsia="Times New Roman" w:hAnsi="Consolas" w:cs="Times New Roman"/>
-          <w:color w:val="9CDCFE"/>
-          <w:sz w:val="21"/>
-          <w:szCs w:val="21"/>
-        </w:rPr>
-        <w:t>cin</w:t>
-      </w:r>
-      <w:proofErr w:type="spellEnd"/>
-      <w:r>
-        <w:rPr>
-          <w:rFonts w:ascii="Consolas" w:eastAsia="Times New Roman" w:hAnsi="Consolas" w:cs="Times New Roman"/>
-          <w:color w:val="D4D4D4"/>
-          <w:sz w:val="21"/>
-          <w:szCs w:val="21"/>
-        </w:rPr>
-        <w:t xml:space="preserve"> </w:t>
-      </w:r>
-      <w:r>
-        <w:rPr>
-          <w:rFonts w:ascii="Consolas" w:eastAsia="Times New Roman" w:hAnsi="Consolas" w:cs="Times New Roman"/>
-          <w:color w:val="DCDCAA"/>
-          <w:sz w:val="21"/>
-          <w:szCs w:val="21"/>
-        </w:rPr>
-        <w:t>&gt;&gt;</w:t>
-      </w:r>
-      <w:r>
-        <w:rPr>
-          <w:rFonts w:ascii="Consolas" w:eastAsia="Times New Roman" w:hAnsi="Consolas" w:cs="Times New Roman"/>
-          <w:color w:val="D4D4D4"/>
-          <w:sz w:val="21"/>
-          <w:szCs w:val="21"/>
-        </w:rPr>
-        <w:t xml:space="preserve"> </w:t>
-      </w:r>
-      <w:proofErr w:type="gramStart"/>
-      <w:r>
-        <w:rPr>
-          <w:rFonts w:ascii="Consolas" w:eastAsia="Times New Roman" w:hAnsi="Consolas" w:cs="Times New Roman"/>
-          <w:color w:val="9CDCFE"/>
-          <w:sz w:val="21"/>
-          <w:szCs w:val="21"/>
-        </w:rPr>
-        <w:t>spots</w:t>
-      </w:r>
-      <w:r>
-        <w:rPr>
-          <w:rFonts w:ascii="Consolas" w:eastAsia="Times New Roman" w:hAnsi="Consolas" w:cs="Times New Roman"/>
-          <w:color w:val="D4D4D4"/>
-          <w:sz w:val="21"/>
-          <w:szCs w:val="21"/>
-        </w:rPr>
-        <w:t>;</w:t>
-      </w:r>
-      <w:proofErr w:type="gramEnd"/>
     </w:p>
     <w:p>
       <w:pPr>
@@ -2620,6 +2277,69 @@
           <w:szCs w:val="21"/>
         </w:rPr>
       </w:pPr>
+      <w:r>
+        <w:rPr>
+          <w:rFonts w:ascii="Consolas" w:eastAsia="Times New Roman" w:hAnsi="Consolas" w:cs="Times New Roman"/>
+          <w:color w:val="D4D4D4"/>
+          <w:sz w:val="21"/>
+          <w:szCs w:val="21"/>
+        </w:rPr>
+        <w:t xml:space="preserve">    </w:t>
+      </w:r>
+      <w:r>
+        <w:rPr>
+          <w:rFonts w:ascii="Consolas" w:eastAsia="Times New Roman" w:hAnsi="Consolas" w:cs="Times New Roman"/>
+          <w:color w:val="C586C0"/>
+          <w:sz w:val="21"/>
+          <w:szCs w:val="21"/>
+        </w:rPr>
+        <w:t>if</w:t>
+      </w:r>
+      <w:r>
+        <w:rPr>
+          <w:rFonts w:ascii="Consolas" w:eastAsia="Times New Roman" w:hAnsi="Consolas" w:cs="Times New Roman"/>
+          <w:color w:val="D4D4D4"/>
+          <w:sz w:val="21"/>
+          <w:szCs w:val="21"/>
+        </w:rPr>
+        <w:t xml:space="preserve"> (</w:t>
+      </w:r>
+      <w:r>
+        <w:rPr>
+          <w:rFonts w:ascii="Consolas" w:eastAsia="Times New Roman" w:hAnsi="Consolas" w:cs="Times New Roman"/>
+          <w:color w:val="9CDCFE"/>
+          <w:sz w:val="21"/>
+          <w:szCs w:val="21"/>
+        </w:rPr>
+        <w:t>spots</w:t>
+      </w:r>
+      <w:r>
+        <w:rPr>
+          <w:rFonts w:ascii="Consolas" w:eastAsia="Times New Roman" w:hAnsi="Consolas" w:cs="Times New Roman"/>
+          <w:color w:val="D4D4D4"/>
+          <w:sz w:val="21"/>
+          <w:szCs w:val="21"/>
+        </w:rPr>
+        <w:t xml:space="preserve"> == </w:t>
+      </w:r>
+      <w:r>
+        <w:rPr>
+          <w:rFonts w:ascii="Consolas" w:eastAsia="Times New Roman" w:hAnsi="Consolas" w:cs="Times New Roman"/>
+          <w:color w:val="B5CEA8"/>
+          <w:sz w:val="21"/>
+          <w:szCs w:val="21"/>
+        </w:rPr>
+        <w:t>2</w:t>
+      </w:r>
+      <w:r>
+        <w:rPr>
+          <w:rFonts w:ascii="Consolas" w:eastAsia="Times New Roman" w:hAnsi="Consolas" w:cs="Times New Roman"/>
+          <w:color w:val="D4D4D4"/>
+          <w:sz w:val="21"/>
+          <w:szCs w:val="21"/>
+        </w:rPr>
+        <w:t>)</w:t>
+      </w:r>
     </w:p>
     <w:p>
       <w:pPr>
@@ -2639,61 +2359,7 @@
           <w:sz w:val="21"/>
           <w:szCs w:val="21"/>
         </w:rPr>
-        <w:t xml:space="preserve">    </w:t>
-      </w:r>
-      <w:r>
-        <w:rPr>
-          <w:rFonts w:ascii="Consolas" w:eastAsia="Times New Roman" w:hAnsi="Consolas" w:cs="Times New Roman"/>
-          <w:color w:val="C586C0"/>
-          <w:sz w:val="21"/>
-          <w:szCs w:val="21"/>
-        </w:rPr>
-        <w:t>if</w:t>
-      </w:r>
-      <w:r>
-        <w:rPr>
-          <w:rFonts w:ascii="Consolas" w:eastAsia="Times New Roman" w:hAnsi="Consolas" w:cs="Times New Roman"/>
-          <w:color w:val="D4D4D4"/>
-          <w:sz w:val="21"/>
-          <w:szCs w:val="21"/>
-        </w:rPr>
-        <w:t xml:space="preserve"> (</w:t>
-      </w:r>
-      <w:r>
-        <w:rPr>
-          <w:rFonts w:ascii="Consolas" w:eastAsia="Times New Roman" w:hAnsi="Consolas" w:cs="Times New Roman"/>
-          <w:color w:val="9CDCFE"/>
-          <w:sz w:val="21"/>
-          <w:szCs w:val="21"/>
-        </w:rPr>
-        <w:t>spots</w:t>
-      </w:r>
-      <w:r>
-        <w:rPr>
-          <w:rFonts w:ascii="Consolas" w:eastAsia="Times New Roman" w:hAnsi="Consolas" w:cs="Times New Roman"/>
-          <w:color w:val="D4D4D4"/>
-          <w:sz w:val="21"/>
-          <w:szCs w:val="21"/>
-        </w:rPr>
-        <w:t xml:space="preserve"> == </w:t>
-      </w:r>
-      <w:r>
-        <w:rPr>
-          <w:rFonts w:ascii="Consolas" w:eastAsia="Times New Roman" w:hAnsi="Consolas" w:cs="Times New Roman"/>
-          <w:color w:val="B5CEA8"/>
-          <w:sz w:val="21"/>
-          <w:szCs w:val="21"/>
-        </w:rPr>
-        <w:t>2</w:t>
-      </w:r>
-      <w:r>
-        <w:rPr>
-          <w:rFonts w:ascii="Consolas" w:eastAsia="Times New Roman" w:hAnsi="Consolas" w:cs="Times New Roman"/>
-          <w:color w:val="D4D4D4"/>
-          <w:sz w:val="21"/>
-          <w:szCs w:val="21"/>
-        </w:rPr>
-        <w:t>)</w:t>
+        <w:t>    {</w:t>
       </w:r>
     </w:p>
     <w:p>
@@ -2714,7 +2380,97 @@
           <w:sz w:val="21"/>
           <w:szCs w:val="21"/>
         </w:rPr>
-        <w:t>    {</w:t>
+        <w:t xml:space="preserve">        </w:t>
+      </w:r>
+      <w:r>
+        <w:rPr>
+          <w:rFonts w:ascii="Consolas" w:eastAsia="Times New Roman" w:hAnsi="Consolas" w:cs="Times New Roman"/>
+          <w:color w:val="9CDCFE"/>
+          <w:sz w:val="21"/>
+          <w:szCs w:val="21"/>
+        </w:rPr>
+        <w:t>cout</w:t>
+      </w:r>
+      <w:r>
+        <w:rPr>
+          <w:rFonts w:ascii="Consolas" w:eastAsia="Times New Roman" w:hAnsi="Consolas" w:cs="Times New Roman"/>
+          <w:color w:val="D4D4D4"/>
+          <w:sz w:val="21"/>
+          <w:szCs w:val="21"/>
+        </w:rPr>
+        <w:t xml:space="preserve"> </w:t>
+      </w:r>
+      <w:r>
+        <w:rPr>
+          <w:rFonts w:ascii="Consolas" w:eastAsia="Times New Roman" w:hAnsi="Consolas" w:cs="Times New Roman"/>
+          <w:color w:val="DCDCAA"/>
+          <w:sz w:val="21"/>
+          <w:szCs w:val="21"/>
+        </w:rPr>
+        <w:t>&lt;&lt;</w:t>
+      </w:r>
+      <w:r>
+        <w:rPr>
+          <w:rFonts w:ascii="Consolas" w:eastAsia="Times New Roman" w:hAnsi="Consolas" w:cs="Times New Roman"/>
+          <w:color w:val="D4D4D4"/>
+          <w:sz w:val="21"/>
+          <w:szCs w:val="21"/>
+        </w:rPr>
+        <w:t xml:space="preserve"> </w:t>
+      </w:r>
+      <w:r>
+        <w:rPr>
+          <w:rFonts w:ascii="Consolas" w:eastAsia="Times New Roman" w:hAnsi="Consolas" w:cs="Times New Roman"/>
+          <w:color w:val="CE9178"/>
+          <w:sz w:val="21"/>
+          <w:szCs w:val="21"/>
+        </w:rPr>
+        <w:t>"sequence: 1 1"</w:t>
+      </w:r>
+      <w:r>
+        <w:rPr>
+          <w:rFonts w:ascii="Consolas" w:eastAsia="Times New Roman" w:hAnsi="Consolas" w:cs="Times New Roman"/>
+          <w:color w:val="D4D4D4"/>
+          <w:sz w:val="21"/>
+          <w:szCs w:val="21"/>
+        </w:rPr>
+        <w:t xml:space="preserve"> </w:t>
+      </w:r>
+      <w:r>
+        <w:rPr>
+          <w:rFonts w:ascii="Consolas" w:eastAsia="Times New Roman" w:hAnsi="Consolas" w:cs="Times New Roman"/>
+          <w:color w:val="DCDCAA"/>
+          <w:sz w:val="21"/>
+          <w:szCs w:val="21"/>
+        </w:rPr>
+        <w:t>&lt;&lt;</w:t>
+      </w:r>
+      <w:r>
+        <w:rPr>
+          <w:rFonts w:ascii="Consolas" w:eastAsia="Times New Roman" w:hAnsi="Consolas" w:cs="Times New Roman"/>
+          <w:color w:val="D4D4D4"/>
+          <w:sz w:val="21"/>
+          <w:szCs w:val="21"/>
+        </w:rPr>
+        <w:t xml:space="preserve"> </w:t>
+      </w:r>
+      <w:r>
+        <w:rPr>
+          <w:rFonts w:ascii="Consolas" w:eastAsia="Times New Roman" w:hAnsi="Consolas" w:cs="Times New Roman"/>
+          <w:color w:val="DCDCAA"/>
+          <w:sz w:val="21"/>
+          <w:szCs w:val="21"/>
+        </w:rPr>
+        <w:t>endl</w:t>
+      </w:r>
+      <w:r>
+        <w:rPr>
+          <w:rFonts w:ascii="Consolas" w:eastAsia="Times New Roman" w:hAnsi="Consolas" w:cs="Times New Roman"/>
+          <w:color w:val="D4D4D4"/>
+          <w:sz w:val="21"/>
+          <w:szCs w:val="21"/>
+        </w:rPr>
+        <w:t>;</w:t>
       </w:r>
     </w:p>
     <w:p>
@@ -2737,7 +2493,6 @@
         </w:rPr>
         <w:t xml:space="preserve">        </w:t>
       </w:r>
-      <w:proofErr w:type="spellStart"/>
       <w:r>
         <w:rPr>
           <w:rFonts w:ascii="Consolas" w:eastAsia="Times New Roman" w:hAnsi="Consolas" w:cs="Times New Roman"/>
@@ -2747,7 +2502,6 @@
         </w:rPr>
         <w:t>cout</w:t>
       </w:r>
-      <w:proofErr w:type="spellEnd"/>
       <w:r>
         <w:rPr>
           <w:rFonts w:ascii="Consolas" w:eastAsia="Times New Roman" w:hAnsi="Consolas" w:cs="Times New Roman"/>
@@ -2782,7 +2536,7 @@
           <w:sz w:val="21"/>
           <w:szCs w:val="21"/>
         </w:rPr>
-        <w:t>"sequence: 1 1"</w:t>
+        <w:t>"Max shots needed : 2 "</w:t>
       </w:r>
       <w:r>
         <w:rPr>
@@ -2811,8 +2565,6 @@
         </w:rPr>
         <w:t xml:space="preserve"> </w:t>
       </w:r>
-      <w:proofErr w:type="spellStart"/>
-      <w:proofErr w:type="gramStart"/>
       <w:r>
         <w:rPr>
           <w:rFonts w:ascii="Consolas" w:eastAsia="Times New Roman" w:hAnsi="Consolas" w:cs="Times New Roman"/>
@@ -2822,7 +2574,6 @@
         </w:rPr>
         <w:t>endl</w:t>
       </w:r>
-      <w:proofErr w:type="spellEnd"/>
       <w:r>
         <w:rPr>
           <w:rFonts w:ascii="Consolas" w:eastAsia="Times New Roman" w:hAnsi="Consolas" w:cs="Times New Roman"/>
@@ -2832,7 +2583,6 @@
         </w:rPr>
         <w:t>;</w:t>
       </w:r>
-      <w:proofErr w:type="gramEnd"/>
     </w:p>
     <w:p>
       <w:pPr>
@@ -2854,17 +2604,15 @@
         </w:rPr>
         <w:t xml:space="preserve">        </w:t>
       </w:r>
-      <w:proofErr w:type="spellStart"/>
-      <w:r>
-        <w:rPr>
-          <w:rFonts w:ascii="Consolas" w:eastAsia="Times New Roman" w:hAnsi="Consolas" w:cs="Times New Roman"/>
-          <w:color w:val="9CDCFE"/>
-          <w:sz w:val="21"/>
-          <w:szCs w:val="21"/>
-        </w:rPr>
-        <w:t>cout</w:t>
-      </w:r>
-      <w:proofErr w:type="spellEnd"/>
+      <w:r>
+        <w:rPr>
+          <w:rFonts w:ascii="Consolas" w:eastAsia="Times New Roman" w:hAnsi="Consolas" w:cs="Times New Roman"/>
+          <w:color w:val="C586C0"/>
+          <w:sz w:val="21"/>
+          <w:szCs w:val="21"/>
+        </w:rPr>
+        <w:t>return</w:t>
+      </w:r>
       <w:r>
         <w:rPr>
           <w:rFonts w:ascii="Consolas" w:eastAsia="Times New Roman" w:hAnsi="Consolas" w:cs="Times New Roman"/>
@@ -2877,88 +2625,12 @@
       <w:r>
         <w:rPr>
           <w:rFonts w:ascii="Consolas" w:eastAsia="Times New Roman" w:hAnsi="Consolas" w:cs="Times New Roman"/>
-          <w:color w:val="DCDCAA"/>
-          <w:sz w:val="21"/>
-          <w:szCs w:val="21"/>
-        </w:rPr>
-        <w:t>&lt;&lt;</w:t>
-      </w:r>
-      <w:r>
-        <w:rPr>
-          <w:rFonts w:ascii="Consolas" w:eastAsia="Times New Roman" w:hAnsi="Consolas" w:cs="Times New Roman"/>
-          <w:color w:val="D4D4D4"/>
-          <w:sz w:val="21"/>
-          <w:szCs w:val="21"/>
-        </w:rPr>
-        <w:t xml:space="preserve"> </w:t>
-      </w:r>
-      <w:r>
-        <w:rPr>
-          <w:rFonts w:ascii="Consolas" w:eastAsia="Times New Roman" w:hAnsi="Consolas" w:cs="Times New Roman"/>
-          <w:color w:val="CE9178"/>
-          <w:sz w:val="21"/>
-          <w:szCs w:val="21"/>
-        </w:rPr>
-        <w:t xml:space="preserve">"Max shots </w:t>
-      </w:r>
-      <w:proofErr w:type="gramStart"/>
-      <w:r>
-        <w:rPr>
-          <w:rFonts w:ascii="Consolas" w:eastAsia="Times New Roman" w:hAnsi="Consolas" w:cs="Times New Roman"/>
-          <w:color w:val="CE9178"/>
-          <w:sz w:val="21"/>
-          <w:szCs w:val="21"/>
-        </w:rPr>
-        <w:t>needed :</w:t>
-      </w:r>
-      <w:proofErr w:type="gramEnd"/>
-      <w:r>
-        <w:rPr>
-          <w:rFonts w:ascii="Consolas" w:eastAsia="Times New Roman" w:hAnsi="Consolas" w:cs="Times New Roman"/>
-          <w:color w:val="CE9178"/>
-          <w:sz w:val="21"/>
-          <w:szCs w:val="21"/>
-        </w:rPr>
-        <w:t xml:space="preserve"> 2 "</w:t>
-      </w:r>
-      <w:r>
-        <w:rPr>
-          <w:rFonts w:ascii="Consolas" w:eastAsia="Times New Roman" w:hAnsi="Consolas" w:cs="Times New Roman"/>
-          <w:color w:val="D4D4D4"/>
-          <w:sz w:val="21"/>
-          <w:szCs w:val="21"/>
-        </w:rPr>
-        <w:t xml:space="preserve"> </w:t>
-      </w:r>
-      <w:r>
-        <w:rPr>
-          <w:rFonts w:ascii="Consolas" w:eastAsia="Times New Roman" w:hAnsi="Consolas" w:cs="Times New Roman"/>
-          <w:color w:val="DCDCAA"/>
-          <w:sz w:val="21"/>
-          <w:szCs w:val="21"/>
-        </w:rPr>
-        <w:t>&lt;&lt;</w:t>
-      </w:r>
-      <w:r>
-        <w:rPr>
-          <w:rFonts w:ascii="Consolas" w:eastAsia="Times New Roman" w:hAnsi="Consolas" w:cs="Times New Roman"/>
-          <w:color w:val="D4D4D4"/>
-          <w:sz w:val="21"/>
-          <w:szCs w:val="21"/>
-        </w:rPr>
-        <w:t xml:space="preserve"> </w:t>
-      </w:r>
-      <w:proofErr w:type="spellStart"/>
-      <w:r>
-        <w:rPr>
-          <w:rFonts w:ascii="Consolas" w:eastAsia="Times New Roman" w:hAnsi="Consolas" w:cs="Times New Roman"/>
-          <w:color w:val="DCDCAA"/>
-          <w:sz w:val="21"/>
-          <w:szCs w:val="21"/>
-        </w:rPr>
-        <w:t>endl</w:t>
-      </w:r>
-      <w:proofErr w:type="spellEnd"/>
+          <w:color w:val="B5CEA8"/>
+          <w:sz w:val="21"/>
+          <w:szCs w:val="21"/>
+        </w:rPr>
+        <w:t>0</w:t>
+      </w:r>
       <w:r>
         <w:rPr>
           <w:rFonts w:ascii="Consolas" w:eastAsia="Times New Roman" w:hAnsi="Consolas" w:cs="Times New Roman"/>
@@ -2987,46 +2659,8 @@
           <w:sz w:val="21"/>
           <w:szCs w:val="21"/>
         </w:rPr>
-        <w:t xml:space="preserve">        </w:t>
-      </w:r>
-      <w:r>
-        <w:rPr>
-          <w:rFonts w:ascii="Consolas" w:eastAsia="Times New Roman" w:hAnsi="Consolas" w:cs="Times New Roman"/>
-          <w:color w:val="C586C0"/>
-          <w:sz w:val="21"/>
-          <w:szCs w:val="21"/>
-        </w:rPr>
-        <w:t>return</w:t>
-      </w:r>
-      <w:r>
-        <w:rPr>
-          <w:rFonts w:ascii="Consolas" w:eastAsia="Times New Roman" w:hAnsi="Consolas" w:cs="Times New Roman"/>
-          <w:color w:val="D4D4D4"/>
-          <w:sz w:val="21"/>
-          <w:szCs w:val="21"/>
-        </w:rPr>
-        <w:t xml:space="preserve"> </w:t>
-      </w:r>
-      <w:proofErr w:type="gramStart"/>
-      <w:r>
-        <w:rPr>
-          <w:rFonts w:ascii="Consolas" w:eastAsia="Times New Roman" w:hAnsi="Consolas" w:cs="Times New Roman"/>
-          <w:color w:val="B5CEA8"/>
-          <w:sz w:val="21"/>
-          <w:szCs w:val="21"/>
-        </w:rPr>
-        <w:t>0</w:t>
-      </w:r>
-      <w:r>
-        <w:rPr>
-          <w:rFonts w:ascii="Consolas" w:eastAsia="Times New Roman" w:hAnsi="Consolas" w:cs="Times New Roman"/>
-          <w:color w:val="D4D4D4"/>
-          <w:sz w:val="21"/>
-          <w:szCs w:val="21"/>
-        </w:rPr>
-        <w:t>;</w:t>
-      </w:r>
-      <w:proofErr w:type="gramEnd"/>
+        <w:t>    }</w:t>
+      </w:r>
     </w:p>
     <w:p>
       <w:pPr>
@@ -3046,7 +2680,61 @@
           <w:sz w:val="21"/>
           <w:szCs w:val="21"/>
         </w:rPr>
-        <w:t>    }</w:t>
+        <w:t xml:space="preserve">    </w:t>
+      </w:r>
+      <w:r>
+        <w:rPr>
+          <w:rFonts w:ascii="Consolas" w:eastAsia="Times New Roman" w:hAnsi="Consolas" w:cs="Times New Roman"/>
+          <w:color w:val="4EC9B0"/>
+          <w:sz w:val="21"/>
+          <w:szCs w:val="21"/>
+        </w:rPr>
+        <w:t>vector</w:t>
+      </w:r>
+      <w:r>
+        <w:rPr>
+          <w:rFonts w:ascii="Consolas" w:eastAsia="Times New Roman" w:hAnsi="Consolas" w:cs="Times New Roman"/>
+          <w:color w:val="D4D4D4"/>
+          <w:sz w:val="21"/>
+          <w:szCs w:val="21"/>
+        </w:rPr>
+        <w:t>&lt;</w:t>
+      </w:r>
+      <w:r>
+        <w:rPr>
+          <w:rFonts w:ascii="Consolas" w:eastAsia="Times New Roman" w:hAnsi="Consolas" w:cs="Times New Roman"/>
+          <w:color w:val="569CD6"/>
+          <w:sz w:val="21"/>
+          <w:szCs w:val="21"/>
+        </w:rPr>
+        <w:t>int</w:t>
+      </w:r>
+      <w:r>
+        <w:rPr>
+          <w:rFonts w:ascii="Consolas" w:eastAsia="Times New Roman" w:hAnsi="Consolas" w:cs="Times New Roman"/>
+          <w:color w:val="D4D4D4"/>
+          <w:sz w:val="21"/>
+          <w:szCs w:val="21"/>
+        </w:rPr>
+        <w:t xml:space="preserve">&gt; </w:t>
+      </w:r>
+      <w:r>
+        <w:rPr>
+          <w:rFonts w:ascii="Consolas" w:eastAsia="Times New Roman" w:hAnsi="Consolas" w:cs="Times New Roman"/>
+          <w:color w:val="9CDCFE"/>
+          <w:sz w:val="21"/>
+          <w:szCs w:val="21"/>
+        </w:rPr>
+        <w:t>forwardSequence</w:t>
+      </w:r>
+      <w:r>
+        <w:rPr>
+          <w:rFonts w:ascii="Consolas" w:eastAsia="Times New Roman" w:hAnsi="Consolas" w:cs="Times New Roman"/>
+          <w:color w:val="D4D4D4"/>
+          <w:sz w:val="21"/>
+          <w:szCs w:val="21"/>
+        </w:rPr>
+        <w:t>;</w:t>
       </w:r>
     </w:p>
     <w:p>
@@ -3060,6 +2748,105 @@
           <w:szCs w:val="21"/>
         </w:rPr>
       </w:pPr>
+      <w:r>
+        <w:rPr>
+          <w:rFonts w:ascii="Consolas" w:eastAsia="Times New Roman" w:hAnsi="Consolas" w:cs="Times New Roman"/>
+          <w:color w:val="D4D4D4"/>
+          <w:sz w:val="21"/>
+          <w:szCs w:val="21"/>
+        </w:rPr>
+        <w:t xml:space="preserve">    </w:t>
+      </w:r>
+      <w:r>
+        <w:rPr>
+          <w:rFonts w:ascii="Consolas" w:eastAsia="Times New Roman" w:hAnsi="Consolas" w:cs="Times New Roman"/>
+          <w:color w:val="DCDCAA"/>
+          <w:sz w:val="21"/>
+          <w:szCs w:val="21"/>
+        </w:rPr>
+        <w:t>hunt</w:t>
+      </w:r>
+      <w:r>
+        <w:rPr>
+          <w:rFonts w:ascii="Consolas" w:eastAsia="Times New Roman" w:hAnsi="Consolas" w:cs="Times New Roman"/>
+          <w:color w:val="D4D4D4"/>
+          <w:sz w:val="21"/>
+          <w:szCs w:val="21"/>
+        </w:rPr>
+        <w:t>(</w:t>
+      </w:r>
+      <w:r>
+        <w:rPr>
+          <w:rFonts w:ascii="Consolas" w:eastAsia="Times New Roman" w:hAnsi="Consolas" w:cs="Times New Roman"/>
+          <w:color w:val="B5CEA8"/>
+          <w:sz w:val="21"/>
+          <w:szCs w:val="21"/>
+        </w:rPr>
+        <w:t>2</w:t>
+      </w:r>
+      <w:r>
+        <w:rPr>
+          <w:rFonts w:ascii="Consolas" w:eastAsia="Times New Roman" w:hAnsi="Consolas" w:cs="Times New Roman"/>
+          <w:color w:val="D4D4D4"/>
+          <w:sz w:val="21"/>
+          <w:szCs w:val="21"/>
+        </w:rPr>
+        <w:t xml:space="preserve">, </w:t>
+      </w:r>
+      <w:r>
+        <w:rPr>
+          <w:rFonts w:ascii="Consolas" w:eastAsia="Times New Roman" w:hAnsi="Consolas" w:cs="Times New Roman"/>
+          <w:color w:val="9CDCFE"/>
+          <w:sz w:val="21"/>
+          <w:szCs w:val="21"/>
+        </w:rPr>
+        <w:t>spots</w:t>
+      </w:r>
+      <w:r>
+        <w:rPr>
+          <w:rFonts w:ascii="Consolas" w:eastAsia="Times New Roman" w:hAnsi="Consolas" w:cs="Times New Roman"/>
+          <w:color w:val="D4D4D4"/>
+          <w:sz w:val="21"/>
+          <w:szCs w:val="21"/>
+        </w:rPr>
+        <w:t xml:space="preserve"> - </w:t>
+      </w:r>
+      <w:r>
+        <w:rPr>
+          <w:rFonts w:ascii="Consolas" w:eastAsia="Times New Roman" w:hAnsi="Consolas" w:cs="Times New Roman"/>
+          <w:color w:val="B5CEA8"/>
+          <w:sz w:val="21"/>
+          <w:szCs w:val="21"/>
+        </w:rPr>
+        <w:t>1</w:t>
+      </w:r>
+      <w:r>
+        <w:rPr>
+          <w:rFonts w:ascii="Consolas" w:eastAsia="Times New Roman" w:hAnsi="Consolas" w:cs="Times New Roman"/>
+          <w:color w:val="D4D4D4"/>
+          <w:sz w:val="21"/>
+          <w:szCs w:val="21"/>
+        </w:rPr>
+        <w:t xml:space="preserve">, </w:t>
+      </w:r>
+      <w:r>
+        <w:rPr>
+          <w:rFonts w:ascii="Consolas" w:eastAsia="Times New Roman" w:hAnsi="Consolas" w:cs="Times New Roman"/>
+          <w:color w:val="9CDCFE"/>
+          <w:sz w:val="21"/>
+          <w:szCs w:val="21"/>
+        </w:rPr>
+        <w:t>forwardSequence</w:t>
+      </w:r>
+      <w:r>
+        <w:rPr>
+          <w:rFonts w:ascii="Consolas" w:eastAsia="Times New Roman" w:hAnsi="Consolas" w:cs="Times New Roman"/>
+          <w:color w:val="D4D4D4"/>
+          <w:sz w:val="21"/>
+          <w:szCs w:val="21"/>
+        </w:rPr>
+        <w:t>);</w:t>
+      </w:r>
     </w:p>
     <w:p>
       <w:pPr>
@@ -3117,8 +2904,6 @@
         </w:rPr>
         <w:t xml:space="preserve">&gt; </w:t>
       </w:r>
-      <w:proofErr w:type="spellStart"/>
-      <w:proofErr w:type="gramStart"/>
       <w:r>
         <w:rPr>
           <w:rFonts w:ascii="Consolas" w:eastAsia="Times New Roman" w:hAnsi="Consolas" w:cs="Times New Roman"/>
@@ -3126,19 +2911,98 @@
           <w:sz w:val="21"/>
           <w:szCs w:val="21"/>
         </w:rPr>
+        <w:t>backwardSequence</w:t>
+      </w:r>
+      <w:r>
+        <w:rPr>
+          <w:rFonts w:ascii="Consolas" w:eastAsia="Times New Roman" w:hAnsi="Consolas" w:cs="Times New Roman"/>
+          <w:color w:val="D4D4D4"/>
+          <w:sz w:val="21"/>
+          <w:szCs w:val="21"/>
+        </w:rPr>
+        <w:t>(</w:t>
+      </w:r>
+      <w:r>
+        <w:rPr>
+          <w:rFonts w:ascii="Consolas" w:eastAsia="Times New Roman" w:hAnsi="Consolas" w:cs="Times New Roman"/>
+          <w:color w:val="9CDCFE"/>
+          <w:sz w:val="21"/>
+          <w:szCs w:val="21"/>
+        </w:rPr>
         <w:t>forwardSequence</w:t>
       </w:r>
-      <w:proofErr w:type="spellEnd"/>
-      <w:r>
-        <w:rPr>
-          <w:rFonts w:ascii="Consolas" w:eastAsia="Times New Roman" w:hAnsi="Consolas" w:cs="Times New Roman"/>
-          <w:color w:val="D4D4D4"/>
-          <w:sz w:val="21"/>
-          <w:szCs w:val="21"/>
-        </w:rPr>
-        <w:t>;</w:t>
-      </w:r>
-      <w:proofErr w:type="gramEnd"/>
+      <w:r>
+        <w:rPr>
+          <w:rFonts w:ascii="Consolas" w:eastAsia="Times New Roman" w:hAnsi="Consolas" w:cs="Times New Roman"/>
+          <w:color w:val="D4D4D4"/>
+          <w:sz w:val="21"/>
+          <w:szCs w:val="21"/>
+        </w:rPr>
+        <w:t>.</w:t>
+      </w:r>
+      <w:r>
+        <w:rPr>
+          <w:rFonts w:ascii="Consolas" w:eastAsia="Times New Roman" w:hAnsi="Consolas" w:cs="Times New Roman"/>
+          <w:color w:val="DCDCAA"/>
+          <w:sz w:val="21"/>
+          <w:szCs w:val="21"/>
+        </w:rPr>
+        <w:t>rbegin</w:t>
+      </w:r>
+      <w:r>
+        <w:rPr>
+          <w:rFonts w:ascii="Consolas" w:eastAsia="Times New Roman" w:hAnsi="Consolas" w:cs="Times New Roman"/>
+          <w:color w:val="D4D4D4"/>
+          <w:sz w:val="21"/>
+          <w:szCs w:val="21"/>
+        </w:rPr>
+        <w:t>(),</w:t>
+      </w:r>
+      <w:r>
+        <w:rPr>
+          <w:rFonts w:ascii="Consolas" w:eastAsia="Times New Roman" w:hAnsi="Consolas" w:cs="Times New Roman"/>
+          <w:color w:val="D4D4D4"/>
+          <w:sz w:val="21"/>
+          <w:szCs w:val="21"/>
+        </w:rPr>
+        <w:t xml:space="preserve"> </w:t>
+      </w:r>
+      <w:r>
+        <w:rPr>
+          <w:rFonts w:ascii="Consolas" w:eastAsia="Times New Roman" w:hAnsi="Consolas" w:cs="Times New Roman"/>
+          <w:color w:val="9CDCFE"/>
+          <w:sz w:val="21"/>
+          <w:szCs w:val="21"/>
+        </w:rPr>
+        <w:t>forwardSequence</w:t>
+      </w:r>
+      <w:r>
+        <w:rPr>
+          <w:rFonts w:ascii="Consolas" w:eastAsia="Times New Roman" w:hAnsi="Consolas" w:cs="Times New Roman"/>
+          <w:color w:val="D4D4D4"/>
+          <w:sz w:val="21"/>
+          <w:szCs w:val="21"/>
+        </w:rPr>
+        <w:t>.</w:t>
+      </w:r>
+      <w:r>
+        <w:rPr>
+          <w:rFonts w:ascii="Consolas" w:eastAsia="Times New Roman" w:hAnsi="Consolas" w:cs="Times New Roman"/>
+          <w:color w:val="DCDCAA"/>
+          <w:sz w:val="21"/>
+          <w:szCs w:val="21"/>
+        </w:rPr>
+        <w:t>rend</w:t>
+      </w:r>
+      <w:r>
+        <w:rPr>
+          <w:rFonts w:ascii="Consolas" w:eastAsia="Times New Roman" w:hAnsi="Consolas" w:cs="Times New Roman"/>
+          <w:color w:val="D4D4D4"/>
+          <w:sz w:val="21"/>
+          <w:szCs w:val="21"/>
+        </w:rPr>
+        <w:t>());</w:t>
+      </w:r>
     </w:p>
     <w:p>
       <w:pPr>
@@ -3151,109 +3015,6 @@
           <w:szCs w:val="21"/>
         </w:rPr>
       </w:pPr>
-      <w:r>
-        <w:rPr>
-          <w:rFonts w:ascii="Consolas" w:eastAsia="Times New Roman" w:hAnsi="Consolas" w:cs="Times New Roman"/>
-          <w:color w:val="D4D4D4"/>
-          <w:sz w:val="21"/>
-          <w:szCs w:val="21"/>
-        </w:rPr>
-        <w:t xml:space="preserve">    </w:t>
-      </w:r>
-      <w:proofErr w:type="gramStart"/>
-      <w:r>
-        <w:rPr>
-          <w:rFonts w:ascii="Consolas" w:eastAsia="Times New Roman" w:hAnsi="Consolas" w:cs="Times New Roman"/>
-          <w:color w:val="DCDCAA"/>
-          <w:sz w:val="21"/>
-          <w:szCs w:val="21"/>
-        </w:rPr>
-        <w:t>hunt</w:t>
-      </w:r>
-      <w:r>
-        <w:rPr>
-          <w:rFonts w:ascii="Consolas" w:eastAsia="Times New Roman" w:hAnsi="Consolas" w:cs="Times New Roman"/>
-          <w:color w:val="D4D4D4"/>
-          <w:sz w:val="21"/>
-          <w:szCs w:val="21"/>
-        </w:rPr>
-        <w:t>(</w:t>
-      </w:r>
-      <w:proofErr w:type="gramEnd"/>
-      <w:r>
-        <w:rPr>
-          <w:rFonts w:ascii="Consolas" w:eastAsia="Times New Roman" w:hAnsi="Consolas" w:cs="Times New Roman"/>
-          <w:color w:val="B5CEA8"/>
-          <w:sz w:val="21"/>
-          <w:szCs w:val="21"/>
-        </w:rPr>
-        <w:t>2</w:t>
-      </w:r>
-      <w:r>
-        <w:rPr>
-          <w:rFonts w:ascii="Consolas" w:eastAsia="Times New Roman" w:hAnsi="Consolas" w:cs="Times New Roman"/>
-          <w:color w:val="D4D4D4"/>
-          <w:sz w:val="21"/>
-          <w:szCs w:val="21"/>
-        </w:rPr>
-        <w:t xml:space="preserve">, </w:t>
-      </w:r>
-      <w:r>
-        <w:rPr>
-          <w:rFonts w:ascii="Consolas" w:eastAsia="Times New Roman" w:hAnsi="Consolas" w:cs="Times New Roman"/>
-          <w:color w:val="9CDCFE"/>
-          <w:sz w:val="21"/>
-          <w:szCs w:val="21"/>
-        </w:rPr>
-        <w:t>spots</w:t>
-      </w:r>
-      <w:r>
-        <w:rPr>
-          <w:rFonts w:ascii="Consolas" w:eastAsia="Times New Roman" w:hAnsi="Consolas" w:cs="Times New Roman"/>
-          <w:color w:val="D4D4D4"/>
-          <w:sz w:val="21"/>
-          <w:szCs w:val="21"/>
-        </w:rPr>
-        <w:t xml:space="preserve"> - </w:t>
-      </w:r>
-      <w:r>
-        <w:rPr>
-          <w:rFonts w:ascii="Consolas" w:eastAsia="Times New Roman" w:hAnsi="Consolas" w:cs="Times New Roman"/>
-          <w:color w:val="B5CEA8"/>
-          <w:sz w:val="21"/>
-          <w:szCs w:val="21"/>
-        </w:rPr>
-        <w:t>1</w:t>
-      </w:r>
-      <w:r>
-        <w:rPr>
-          <w:rFonts w:ascii="Consolas" w:eastAsia="Times New Roman" w:hAnsi="Consolas" w:cs="Times New Roman"/>
-          <w:color w:val="D4D4D4"/>
-          <w:sz w:val="21"/>
-          <w:szCs w:val="21"/>
-        </w:rPr>
-        <w:t xml:space="preserve">, </w:t>
-      </w:r>
-      <w:proofErr w:type="spellStart"/>
-      <w:r>
-        <w:rPr>
-          <w:rFonts w:ascii="Consolas" w:eastAsia="Times New Roman" w:hAnsi="Consolas" w:cs="Times New Roman"/>
-          <w:color w:val="9CDCFE"/>
-          <w:sz w:val="21"/>
-          <w:szCs w:val="21"/>
-        </w:rPr>
-        <w:t>forwardSequence</w:t>
-      </w:r>
-      <w:proofErr w:type="spellEnd"/>
-      <w:r>
-        <w:rPr>
-          <w:rFonts w:ascii="Consolas" w:eastAsia="Times New Roman" w:hAnsi="Consolas" w:cs="Times New Roman"/>
-          <w:color w:val="D4D4D4"/>
-          <w:sz w:val="21"/>
-          <w:szCs w:val="21"/>
-        </w:rPr>
-        <w:t>);</w:t>
-      </w:r>
     </w:p>
     <w:p>
       <w:pPr>
@@ -3278,79 +3039,20 @@
       <w:r>
         <w:rPr>
           <w:rFonts w:ascii="Consolas" w:eastAsia="Times New Roman" w:hAnsi="Consolas" w:cs="Times New Roman"/>
-          <w:color w:val="4EC9B0"/>
-          <w:sz w:val="21"/>
-          <w:szCs w:val="21"/>
-        </w:rPr>
-        <w:t>vector</w:t>
-      </w:r>
-      <w:r>
-        <w:rPr>
-          <w:rFonts w:ascii="Consolas" w:eastAsia="Times New Roman" w:hAnsi="Consolas" w:cs="Times New Roman"/>
-          <w:color w:val="D4D4D4"/>
-          <w:sz w:val="21"/>
-          <w:szCs w:val="21"/>
-        </w:rPr>
-        <w:t>&lt;</w:t>
-      </w:r>
-      <w:r>
-        <w:rPr>
-          <w:rFonts w:ascii="Consolas" w:eastAsia="Times New Roman" w:hAnsi="Consolas" w:cs="Times New Roman"/>
-          <w:color w:val="569CD6"/>
-          <w:sz w:val="21"/>
-          <w:szCs w:val="21"/>
-        </w:rPr>
-        <w:t>int</w:t>
-      </w:r>
-      <w:r>
-        <w:rPr>
-          <w:rFonts w:ascii="Consolas" w:eastAsia="Times New Roman" w:hAnsi="Consolas" w:cs="Times New Roman"/>
-          <w:color w:val="D4D4D4"/>
-          <w:sz w:val="21"/>
-          <w:szCs w:val="21"/>
-        </w:rPr>
-        <w:t xml:space="preserve">&gt; </w:t>
-      </w:r>
-      <w:proofErr w:type="spellStart"/>
-      <w:proofErr w:type="gramStart"/>
-      <w:r>
-        <w:rPr>
-          <w:rFonts w:ascii="Consolas" w:eastAsia="Times New Roman" w:hAnsi="Consolas" w:cs="Times New Roman"/>
           <w:color w:val="9CDCFE"/>
           <w:sz w:val="21"/>
           <w:szCs w:val="21"/>
         </w:rPr>
-        <w:t>backwardSequence</w:t>
-      </w:r>
-      <w:proofErr w:type="spellEnd"/>
-      <w:r>
-        <w:rPr>
-          <w:rFonts w:ascii="Consolas" w:eastAsia="Times New Roman" w:hAnsi="Consolas" w:cs="Times New Roman"/>
-          <w:color w:val="D4D4D4"/>
-          <w:sz w:val="21"/>
-          <w:szCs w:val="21"/>
-        </w:rPr>
-        <w:t>(</w:t>
-      </w:r>
-      <w:proofErr w:type="spellStart"/>
-      <w:proofErr w:type="gramEnd"/>
-      <w:r>
-        <w:rPr>
-          <w:rFonts w:ascii="Consolas" w:eastAsia="Times New Roman" w:hAnsi="Consolas" w:cs="Times New Roman"/>
-          <w:color w:val="9CDCFE"/>
-          <w:sz w:val="21"/>
-          <w:szCs w:val="21"/>
-        </w:rPr>
-        <w:t>forwardSequence</w:t>
-      </w:r>
-      <w:r>
-        <w:rPr>
-          <w:rFonts w:ascii="Consolas" w:eastAsia="Times New Roman" w:hAnsi="Consolas" w:cs="Times New Roman"/>
-          <w:color w:val="D4D4D4"/>
-          <w:sz w:val="21"/>
-          <w:szCs w:val="21"/>
-        </w:rPr>
-        <w:t>.</w:t>
+        <w:t>cout</w:t>
+      </w:r>
+      <w:r>
+        <w:rPr>
+          <w:rFonts w:ascii="Consolas" w:eastAsia="Times New Roman" w:hAnsi="Consolas" w:cs="Times New Roman"/>
+          <w:color w:val="D4D4D4"/>
+          <w:sz w:val="21"/>
+          <w:szCs w:val="21"/>
+        </w:rPr>
+        <w:t xml:space="preserve"> </w:t>
       </w:r>
       <w:r>
         <w:rPr>
@@ -3359,55 +3061,34 @@
           <w:sz w:val="21"/>
           <w:szCs w:val="21"/>
         </w:rPr>
-        <w:t>rbegin</w:t>
-      </w:r>
-      <w:proofErr w:type="spellEnd"/>
-      <w:r>
-        <w:rPr>
-          <w:rFonts w:ascii="Consolas" w:eastAsia="Times New Roman" w:hAnsi="Consolas" w:cs="Times New Roman"/>
-          <w:color w:val="D4D4D4"/>
-          <w:sz w:val="21"/>
-          <w:szCs w:val="21"/>
-        </w:rPr>
-        <w:t xml:space="preserve">(), </w:t>
-      </w:r>
-      <w:proofErr w:type="spellStart"/>
-      <w:r>
-        <w:rPr>
-          <w:rFonts w:ascii="Consolas" w:eastAsia="Times New Roman" w:hAnsi="Consolas" w:cs="Times New Roman"/>
-          <w:color w:val="9CDCFE"/>
-          <w:sz w:val="21"/>
-          <w:szCs w:val="21"/>
-        </w:rPr>
-        <w:t>forwardSequence</w:t>
-      </w:r>
-      <w:r>
-        <w:rPr>
-          <w:rFonts w:ascii="Consolas" w:eastAsia="Times New Roman" w:hAnsi="Consolas" w:cs="Times New Roman"/>
-          <w:color w:val="D4D4D4"/>
-          <w:sz w:val="21"/>
-          <w:szCs w:val="21"/>
-        </w:rPr>
-        <w:t>.</w:t>
-      </w:r>
-      <w:r>
-        <w:rPr>
-          <w:rFonts w:ascii="Consolas" w:eastAsia="Times New Roman" w:hAnsi="Consolas" w:cs="Times New Roman"/>
-          <w:color w:val="DCDCAA"/>
-          <w:sz w:val="21"/>
-          <w:szCs w:val="21"/>
-        </w:rPr>
-        <w:t>rend</w:t>
-      </w:r>
-      <w:proofErr w:type="spellEnd"/>
-      <w:r>
-        <w:rPr>
-          <w:rFonts w:ascii="Consolas" w:eastAsia="Times New Roman" w:hAnsi="Consolas" w:cs="Times New Roman"/>
-          <w:color w:val="D4D4D4"/>
-          <w:sz w:val="21"/>
-          <w:szCs w:val="21"/>
-        </w:rPr>
-        <w:t>());</w:t>
+        <w:t>&lt;&lt;</w:t>
+      </w:r>
+      <w:r>
+        <w:rPr>
+          <w:rFonts w:ascii="Consolas" w:eastAsia="Times New Roman" w:hAnsi="Consolas" w:cs="Times New Roman"/>
+          <w:color w:val="D4D4D4"/>
+          <w:sz w:val="21"/>
+          <w:szCs w:val="21"/>
+        </w:rPr>
+        <w:t xml:space="preserve"> </w:t>
+      </w:r>
+      <w:r>
+        <w:rPr>
+          <w:rFonts w:ascii="Consolas" w:eastAsia="Times New Roman" w:hAnsi="Consolas" w:cs="Times New Roman"/>
+          <w:color w:val="CE9178"/>
+          <w:sz w:val="21"/>
+          <w:szCs w:val="21"/>
+        </w:rPr>
+        <w:t>"sequence:"</w:t>
+      </w:r>
+      <w:r>
+        <w:rPr>
+          <w:rFonts w:ascii="Consolas" w:eastAsia="Times New Roman" w:hAnsi="Consolas" w:cs="Times New Roman"/>
+          <w:color w:val="D4D4D4"/>
+          <w:sz w:val="21"/>
+          <w:szCs w:val="21"/>
+        </w:rPr>
+        <w:t>;</w:t>
       </w:r>
     </w:p>
     <w:p>
@@ -3421,6 +3102,87 @@
           <w:szCs w:val="21"/>
         </w:rPr>
       </w:pPr>
+      <w:r>
+        <w:rPr>
+          <w:rFonts w:ascii="Consolas" w:eastAsia="Times New Roman" w:hAnsi="Consolas" w:cs="Times New Roman"/>
+          <w:color w:val="D4D4D4"/>
+          <w:sz w:val="21"/>
+          <w:szCs w:val="21"/>
+        </w:rPr>
+        <w:t xml:space="preserve">    </w:t>
+      </w:r>
+      <w:r>
+        <w:rPr>
+          <w:rFonts w:ascii="Consolas" w:eastAsia="Times New Roman" w:hAnsi="Consolas" w:cs="Times New Roman"/>
+          <w:color w:val="C586C0"/>
+          <w:sz w:val="21"/>
+          <w:szCs w:val="21"/>
+        </w:rPr>
+        <w:t>for</w:t>
+      </w:r>
+      <w:r>
+        <w:rPr>
+          <w:rFonts w:ascii="Consolas" w:eastAsia="Times New Roman" w:hAnsi="Consolas" w:cs="Times New Roman"/>
+          <w:color w:val="D4D4D4"/>
+          <w:sz w:val="21"/>
+          <w:szCs w:val="21"/>
+        </w:rPr>
+        <w:t xml:space="preserve"> (</w:t>
+      </w:r>
+      <w:r>
+        <w:rPr>
+          <w:rFonts w:ascii="Consolas" w:eastAsia="Times New Roman" w:hAnsi="Consolas" w:cs="Times New Roman"/>
+          <w:color w:val="569CD6"/>
+          <w:sz w:val="21"/>
+          <w:szCs w:val="21"/>
+        </w:rPr>
+        <w:t>int</w:t>
+      </w:r>
+      <w:r>
+        <w:rPr>
+          <w:rFonts w:ascii="Consolas" w:eastAsia="Times New Roman" w:hAnsi="Consolas" w:cs="Times New Roman"/>
+          <w:color w:val="D4D4D4"/>
+          <w:sz w:val="21"/>
+          <w:szCs w:val="21"/>
+        </w:rPr>
+        <w:t xml:space="preserve"> </w:t>
+      </w:r>
+      <w:r>
+        <w:rPr>
+          <w:rFonts w:ascii="Consolas" w:eastAsia="Times New Roman" w:hAnsi="Consolas" w:cs="Times New Roman"/>
+          <w:color w:val="9CDCFE"/>
+          <w:sz w:val="21"/>
+          <w:szCs w:val="21"/>
+        </w:rPr>
+        <w:t>x</w:t>
+      </w:r>
+      <w:r>
+        <w:rPr>
+          <w:rFonts w:ascii="Consolas" w:eastAsia="Times New Roman" w:hAnsi="Consolas" w:cs="Times New Roman"/>
+          <w:color w:val="D4D4D4"/>
+          <w:sz w:val="21"/>
+          <w:szCs w:val="21"/>
+        </w:rPr>
+        <w:t xml:space="preserve"> : </w:t>
+      </w:r>
+      <w:r>
+        <w:rPr>
+          <w:rFonts w:ascii="Consolas" w:eastAsia="Times New Roman" w:hAnsi="Consolas" w:cs="Times New Roman"/>
+          <w:color w:val="9CDCFE"/>
+          <w:sz w:val="21"/>
+          <w:szCs w:val="21"/>
+        </w:rPr>
+        <w:t>forwardSequence</w:t>
+      </w:r>
+      <w:r>
+        <w:rPr>
+          <w:rFonts w:ascii="Consolas" w:eastAsia="Times New Roman" w:hAnsi="Consolas" w:cs="Times New Roman"/>
+          <w:color w:val="D4D4D4"/>
+          <w:sz w:val="21"/>
+          <w:szCs w:val="21"/>
+        </w:rPr>
+        <w:t>)</w:t>
+      </w:r>
     </w:p>
     <w:p>
       <w:pPr>
@@ -3440,9 +3202,8 @@
           <w:sz w:val="21"/>
           <w:szCs w:val="21"/>
         </w:rPr>
-        <w:t xml:space="preserve">    </w:t>
-      </w:r>
-      <w:proofErr w:type="spellStart"/>
+        <w:t xml:space="preserve">        </w:t>
+      </w:r>
       <w:r>
         <w:rPr>
           <w:rFonts w:ascii="Consolas" w:eastAsia="Times New Roman" w:hAnsi="Consolas" w:cs="Times New Roman"/>
@@ -3452,7 +3213,6 @@
         </w:rPr>
         <w:t>cout</w:t>
       </w:r>
-      <w:proofErr w:type="spellEnd"/>
       <w:r>
         <w:rPr>
           <w:rFonts w:ascii="Consolas" w:eastAsia="Times New Roman" w:hAnsi="Consolas" w:cs="Times New Roman"/>
@@ -3487,17 +3247,43 @@
           <w:sz w:val="21"/>
           <w:szCs w:val="21"/>
         </w:rPr>
-        <w:t>"sequence:</w:t>
-      </w:r>
-      <w:proofErr w:type="gramStart"/>
-      <w:r>
-        <w:rPr>
-          <w:rFonts w:ascii="Consolas" w:eastAsia="Times New Roman" w:hAnsi="Consolas" w:cs="Times New Roman"/>
-          <w:color w:val="CE9178"/>
-          <w:sz w:val="21"/>
-          <w:szCs w:val="21"/>
-        </w:rPr>
-        <w:t>"</w:t>
+        <w:t>" "</w:t>
+      </w:r>
+      <w:r>
+        <w:rPr>
+          <w:rFonts w:ascii="Consolas" w:eastAsia="Times New Roman" w:hAnsi="Consolas" w:cs="Times New Roman"/>
+          <w:color w:val="D4D4D4"/>
+          <w:sz w:val="21"/>
+          <w:szCs w:val="21"/>
+        </w:rPr>
+        <w:t xml:space="preserve"> </w:t>
+      </w:r>
+      <w:r>
+        <w:rPr>
+          <w:rFonts w:ascii="Consolas" w:eastAsia="Times New Roman" w:hAnsi="Consolas" w:cs="Times New Roman"/>
+          <w:color w:val="DCDCAA"/>
+          <w:sz w:val="21"/>
+          <w:szCs w:val="21"/>
+        </w:rPr>
+        <w:t>&lt;&lt;</w:t>
+      </w:r>
+      <w:r>
+        <w:rPr>
+          <w:rFonts w:ascii="Consolas" w:eastAsia="Times New Roman" w:hAnsi="Consolas" w:cs="Times New Roman"/>
+          <w:color w:val="D4D4D4"/>
+          <w:sz w:val="21"/>
+          <w:szCs w:val="21"/>
+        </w:rPr>
+        <w:t xml:space="preserve"> </w:t>
+      </w:r>
+      <w:r>
+        <w:rPr>
+          <w:rFonts w:ascii="Consolas" w:eastAsia="Times New Roman" w:hAnsi="Consolas" w:cs="Times New Roman"/>
+          <w:color w:val="9CDCFE"/>
+          <w:sz w:val="21"/>
+          <w:szCs w:val="21"/>
+        </w:rPr>
+        <w:t>x</w:t>
       </w:r>
       <w:r>
         <w:rPr>
@@ -3508,7 +3294,6 @@
         </w:rPr>
         <w:t>;</w:t>
       </w:r>
-      <w:proofErr w:type="gramEnd"/>
     </w:p>
     <w:p>
       <w:pPr>
@@ -3566,7 +3351,6 @@
         </w:rPr>
         <w:t xml:space="preserve"> </w:t>
       </w:r>
-      <w:proofErr w:type="gramStart"/>
       <w:r>
         <w:rPr>
           <w:rFonts w:ascii="Consolas" w:eastAsia="Times New Roman" w:hAnsi="Consolas" w:cs="Times New Roman"/>
@@ -3583,19 +3367,8 @@
           <w:sz w:val="21"/>
           <w:szCs w:val="21"/>
         </w:rPr>
-        <w:t xml:space="preserve"> :</w:t>
-      </w:r>
-      <w:proofErr w:type="gramEnd"/>
-      <w:r>
-        <w:rPr>
-          <w:rFonts w:ascii="Consolas" w:eastAsia="Times New Roman" w:hAnsi="Consolas" w:cs="Times New Roman"/>
-          <w:color w:val="D4D4D4"/>
-          <w:sz w:val="21"/>
-          <w:szCs w:val="21"/>
-        </w:rPr>
-        <w:t xml:space="preserve"> </w:t>
-      </w:r>
-      <w:proofErr w:type="spellStart"/>
+        <w:t xml:space="preserve"> : </w:t>
+      </w:r>
       <w:r>
         <w:rPr>
           <w:rFonts w:ascii="Consolas" w:eastAsia="Times New Roman" w:hAnsi="Consolas" w:cs="Times New Roman"/>
@@ -3603,9 +3376,8 @@
           <w:sz w:val="21"/>
           <w:szCs w:val="21"/>
         </w:rPr>
-        <w:t>forwardSequence</w:t>
-      </w:r>
-      <w:proofErr w:type="spellEnd"/>
+        <w:t>backwardSequence</w:t>
+      </w:r>
       <w:r>
         <w:rPr>
           <w:rFonts w:ascii="Consolas" w:eastAsia="Times New Roman" w:hAnsi="Consolas" w:cs="Times New Roman"/>
@@ -3636,7 +3408,6 @@
         </w:rPr>
         <w:t xml:space="preserve">        </w:t>
       </w:r>
-      <w:proofErr w:type="spellStart"/>
       <w:r>
         <w:rPr>
           <w:rFonts w:ascii="Consolas" w:eastAsia="Times New Roman" w:hAnsi="Consolas" w:cs="Times New Roman"/>
@@ -3646,7 +3417,6 @@
         </w:rPr>
         <w:t>cout</w:t>
       </w:r>
-      <w:proofErr w:type="spellEnd"/>
       <w:r>
         <w:rPr>
           <w:rFonts w:ascii="Consolas" w:eastAsia="Times New Roman" w:hAnsi="Consolas" w:cs="Times New Roman"/>
@@ -3710,7 +3480,6 @@
         </w:rPr>
         <w:t xml:space="preserve"> </w:t>
       </w:r>
-      <w:proofErr w:type="gramStart"/>
       <w:r>
         <w:rPr>
           <w:rFonts w:ascii="Consolas" w:eastAsia="Times New Roman" w:hAnsi="Consolas" w:cs="Times New Roman"/>
@@ -3729,7 +3498,6 @@
         </w:rPr>
         <w:t>;</w:t>
       </w:r>
-      <w:proofErr w:type="gramEnd"/>
     </w:p>
     <w:p>
       <w:pPr>
@@ -3749,35 +3517,16 @@
           <w:sz w:val="21"/>
           <w:szCs w:val="21"/>
         </w:rPr>
-        <w:lastRenderedPageBreak/>
         <w:t xml:space="preserve">    </w:t>
       </w:r>
       <w:r>
         <w:rPr>
           <w:rFonts w:ascii="Consolas" w:eastAsia="Times New Roman" w:hAnsi="Consolas" w:cs="Times New Roman"/>
-          <w:color w:val="C586C0"/>
-          <w:sz w:val="21"/>
-          <w:szCs w:val="21"/>
-        </w:rPr>
-        <w:t>for</w:t>
-      </w:r>
-      <w:r>
-        <w:rPr>
-          <w:rFonts w:ascii="Consolas" w:eastAsia="Times New Roman" w:hAnsi="Consolas" w:cs="Times New Roman"/>
-          <w:color w:val="D4D4D4"/>
-          <w:sz w:val="21"/>
-          <w:szCs w:val="21"/>
-        </w:rPr>
-        <w:t xml:space="preserve"> (</w:t>
-      </w:r>
-      <w:r>
-        <w:rPr>
-          <w:rFonts w:ascii="Consolas" w:eastAsia="Times New Roman" w:hAnsi="Consolas" w:cs="Times New Roman"/>
-          <w:color w:val="569CD6"/>
-          <w:sz w:val="21"/>
-          <w:szCs w:val="21"/>
-        </w:rPr>
-        <w:t>int</w:t>
+          <w:color w:val="9CDCFE"/>
+          <w:sz w:val="21"/>
+          <w:szCs w:val="21"/>
+        </w:rPr>
+        <w:t>cout</w:t>
       </w:r>
       <w:r>
         <w:rPr>
@@ -3788,26 +3537,15 @@
         </w:rPr>
         <w:t xml:space="preserve"> </w:t>
       </w:r>
-      <w:proofErr w:type="gramStart"/>
-      <w:r>
-        <w:rPr>
-          <w:rFonts w:ascii="Consolas" w:eastAsia="Times New Roman" w:hAnsi="Consolas" w:cs="Times New Roman"/>
-          <w:color w:val="9CDCFE"/>
-          <w:sz w:val="21"/>
-          <w:szCs w:val="21"/>
-        </w:rPr>
-        <w:t>x</w:t>
-      </w:r>
-      <w:r>
-        <w:rPr>
-          <w:rFonts w:ascii="Consolas" w:eastAsia="Times New Roman" w:hAnsi="Consolas" w:cs="Times New Roman"/>
-          <w:color w:val="D4D4D4"/>
-          <w:sz w:val="21"/>
-          <w:szCs w:val="21"/>
-        </w:rPr>
-        <w:t xml:space="preserve"> :</w:t>
-      </w:r>
-      <w:proofErr w:type="gramEnd"/>
+      <w:r>
+        <w:rPr>
+          <w:rFonts w:ascii="Consolas" w:eastAsia="Times New Roman" w:hAnsi="Consolas" w:cs="Times New Roman"/>
+          <w:color w:val="DCDCAA"/>
+          <w:sz w:val="21"/>
+          <w:szCs w:val="21"/>
+        </w:rPr>
+        <w:t>&lt;&lt;</w:t>
+      </w:r>
       <w:r>
         <w:rPr>
           <w:rFonts w:ascii="Consolas" w:eastAsia="Times New Roman" w:hAnsi="Consolas" w:cs="Times New Roman"/>
@@ -3817,25 +3555,23 @@
         </w:rPr>
         <w:t xml:space="preserve"> </w:t>
       </w:r>
-      <w:proofErr w:type="spellStart"/>
-      <w:r>
-        <w:rPr>
-          <w:rFonts w:ascii="Consolas" w:eastAsia="Times New Roman" w:hAnsi="Consolas" w:cs="Times New Roman"/>
-          <w:color w:val="9CDCFE"/>
-          <w:sz w:val="21"/>
-          <w:szCs w:val="21"/>
-        </w:rPr>
-        <w:t>backwardSequence</w:t>
-      </w:r>
-      <w:proofErr w:type="spellEnd"/>
-      <w:r>
-        <w:rPr>
-          <w:rFonts w:ascii="Consolas" w:eastAsia="Times New Roman" w:hAnsi="Consolas" w:cs="Times New Roman"/>
-          <w:color w:val="D4D4D4"/>
-          <w:sz w:val="21"/>
-          <w:szCs w:val="21"/>
-        </w:rPr>
-        <w:t>)</w:t>
+      <w:r>
+        <w:rPr>
+          <w:rFonts w:ascii="Consolas" w:eastAsia="Times New Roman" w:hAnsi="Consolas" w:cs="Times New Roman"/>
+          <w:color w:val="DCDCAA"/>
+          <w:sz w:val="21"/>
+          <w:szCs w:val="21"/>
+        </w:rPr>
+        <w:t>endl</w:t>
+      </w:r>
+      <w:r>
+        <w:rPr>
+          <w:rFonts w:ascii="Consolas" w:eastAsia="Times New Roman" w:hAnsi="Consolas" w:cs="Times New Roman"/>
+          <w:color w:val="D4D4D4"/>
+          <w:sz w:val="21"/>
+          <w:szCs w:val="21"/>
+        </w:rPr>
+        <w:t>;</w:t>
       </w:r>
     </w:p>
     <w:p>
@@ -3849,109 +3585,6 @@
           <w:szCs w:val="21"/>
         </w:rPr>
       </w:pPr>
-      <w:r>
-        <w:rPr>
-          <w:rFonts w:ascii="Consolas" w:eastAsia="Times New Roman" w:hAnsi="Consolas" w:cs="Times New Roman"/>
-          <w:color w:val="D4D4D4"/>
-          <w:sz w:val="21"/>
-          <w:szCs w:val="21"/>
-        </w:rPr>
-        <w:t xml:space="preserve">        </w:t>
-      </w:r>
-      <w:proofErr w:type="spellStart"/>
-      <w:r>
-        <w:rPr>
-          <w:rFonts w:ascii="Consolas" w:eastAsia="Times New Roman" w:hAnsi="Consolas" w:cs="Times New Roman"/>
-          <w:color w:val="9CDCFE"/>
-          <w:sz w:val="21"/>
-          <w:szCs w:val="21"/>
-        </w:rPr>
-        <w:t>cout</w:t>
-      </w:r>
-      <w:proofErr w:type="spellEnd"/>
-      <w:r>
-        <w:rPr>
-          <w:rFonts w:ascii="Consolas" w:eastAsia="Times New Roman" w:hAnsi="Consolas" w:cs="Times New Roman"/>
-          <w:color w:val="D4D4D4"/>
-          <w:sz w:val="21"/>
-          <w:szCs w:val="21"/>
-        </w:rPr>
-        <w:t xml:space="preserve"> </w:t>
-      </w:r>
-      <w:r>
-        <w:rPr>
-          <w:rFonts w:ascii="Consolas" w:eastAsia="Times New Roman" w:hAnsi="Consolas" w:cs="Times New Roman"/>
-          <w:color w:val="DCDCAA"/>
-          <w:sz w:val="21"/>
-          <w:szCs w:val="21"/>
-        </w:rPr>
-        <w:t>&lt;&lt;</w:t>
-      </w:r>
-      <w:r>
-        <w:rPr>
-          <w:rFonts w:ascii="Consolas" w:eastAsia="Times New Roman" w:hAnsi="Consolas" w:cs="Times New Roman"/>
-          <w:color w:val="D4D4D4"/>
-          <w:sz w:val="21"/>
-          <w:szCs w:val="21"/>
-        </w:rPr>
-        <w:t xml:space="preserve"> </w:t>
-      </w:r>
-      <w:r>
-        <w:rPr>
-          <w:rFonts w:ascii="Consolas" w:eastAsia="Times New Roman" w:hAnsi="Consolas" w:cs="Times New Roman"/>
-          <w:color w:val="CE9178"/>
-          <w:sz w:val="21"/>
-          <w:szCs w:val="21"/>
-        </w:rPr>
-        <w:t>" "</w:t>
-      </w:r>
-      <w:r>
-        <w:rPr>
-          <w:rFonts w:ascii="Consolas" w:eastAsia="Times New Roman" w:hAnsi="Consolas" w:cs="Times New Roman"/>
-          <w:color w:val="D4D4D4"/>
-          <w:sz w:val="21"/>
-          <w:szCs w:val="21"/>
-        </w:rPr>
-        <w:t xml:space="preserve"> </w:t>
-      </w:r>
-      <w:r>
-        <w:rPr>
-          <w:rFonts w:ascii="Consolas" w:eastAsia="Times New Roman" w:hAnsi="Consolas" w:cs="Times New Roman"/>
-          <w:color w:val="DCDCAA"/>
-          <w:sz w:val="21"/>
-          <w:szCs w:val="21"/>
-        </w:rPr>
-        <w:t>&lt;&lt;</w:t>
-      </w:r>
-      <w:r>
-        <w:rPr>
-          <w:rFonts w:ascii="Consolas" w:eastAsia="Times New Roman" w:hAnsi="Consolas" w:cs="Times New Roman"/>
-          <w:color w:val="D4D4D4"/>
-          <w:sz w:val="21"/>
-          <w:szCs w:val="21"/>
-        </w:rPr>
-        <w:t xml:space="preserve"> </w:t>
-      </w:r>
-      <w:proofErr w:type="gramStart"/>
-      <w:r>
-        <w:rPr>
-          <w:rFonts w:ascii="Consolas" w:eastAsia="Times New Roman" w:hAnsi="Consolas" w:cs="Times New Roman"/>
-          <w:color w:val="9CDCFE"/>
-          <w:sz w:val="21"/>
-          <w:szCs w:val="21"/>
-        </w:rPr>
-        <w:t>x</w:t>
-      </w:r>
-      <w:r>
-        <w:rPr>
-          <w:rFonts w:ascii="Consolas" w:eastAsia="Times New Roman" w:hAnsi="Consolas" w:cs="Times New Roman"/>
-          <w:color w:val="D4D4D4"/>
-          <w:sz w:val="21"/>
-          <w:szCs w:val="21"/>
-        </w:rPr>
-        <w:t>;</w:t>
-      </w:r>
-      <w:proofErr w:type="gramEnd"/>
     </w:p>
     <w:p>
       <w:pPr>
@@ -3973,7 +3606,6 @@
         </w:rPr>
         <w:t xml:space="preserve">    </w:t>
       </w:r>
-      <w:proofErr w:type="spellStart"/>
       <w:r>
         <w:rPr>
           <w:rFonts w:ascii="Consolas" w:eastAsia="Times New Roman" w:hAnsi="Consolas" w:cs="Times New Roman"/>
@@ -3983,7 +3615,6 @@
         </w:rPr>
         <w:t>cout</w:t>
       </w:r>
-      <w:proofErr w:type="spellEnd"/>
       <w:r>
         <w:rPr>
           <w:rFonts w:ascii="Consolas" w:eastAsia="Times New Roman" w:hAnsi="Consolas" w:cs="Times New Roman"/>
@@ -4011,8 +3642,24 @@
         </w:rPr>
         <w:t xml:space="preserve"> </w:t>
       </w:r>
-      <w:proofErr w:type="spellStart"/>
-      <w:proofErr w:type="gramStart"/>
+      <w:r>
+        <w:rPr>
+          <w:rFonts w:ascii="Consolas" w:eastAsia="Times New Roman" w:hAnsi="Consolas" w:cs="Times New Roman"/>
+          <w:color w:val="CE9178"/>
+          <w:sz w:val="21"/>
+          <w:szCs w:val="21"/>
+        </w:rPr>
+        <w:t>"Max shots needed: "</w:t>
+      </w:r>
+      <w:r>
+        <w:rPr>
+          <w:rFonts w:ascii="Consolas" w:eastAsia="Times New Roman" w:hAnsi="Consolas" w:cs="Times New Roman"/>
+          <w:color w:val="D4D4D4"/>
+          <w:sz w:val="21"/>
+          <w:szCs w:val="21"/>
+        </w:rPr>
+        <w:t xml:space="preserve"> </w:t>
+      </w:r>
       <w:r>
         <w:rPr>
           <w:rFonts w:ascii="Consolas" w:eastAsia="Times New Roman" w:hAnsi="Consolas" w:cs="Times New Roman"/>
@@ -4020,9 +3667,98 @@
           <w:sz w:val="21"/>
           <w:szCs w:val="21"/>
         </w:rPr>
+        <w:t>&lt;&lt;</w:t>
+      </w:r>
+      <w:r>
+        <w:rPr>
+          <w:rFonts w:ascii="Consolas" w:eastAsia="Times New Roman" w:hAnsi="Consolas" w:cs="Times New Roman"/>
+          <w:color w:val="D4D4D4"/>
+          <w:sz w:val="21"/>
+          <w:szCs w:val="21"/>
+        </w:rPr>
+        <w:t xml:space="preserve"> </w:t>
+      </w:r>
+      <w:r>
+        <w:rPr>
+          <w:rFonts w:ascii="Consolas" w:eastAsia="Times New Roman" w:hAnsi="Consolas" w:cs="Times New Roman"/>
+          <w:color w:val="9CDCFE"/>
+          <w:sz w:val="21"/>
+          <w:szCs w:val="21"/>
+        </w:rPr>
+        <w:t>forwardSequence</w:t>
+      </w:r>
+      <w:r>
+        <w:rPr>
+          <w:rFonts w:ascii="Consolas" w:eastAsia="Times New Roman" w:hAnsi="Consolas" w:cs="Times New Roman"/>
+          <w:color w:val="D4D4D4"/>
+          <w:sz w:val="21"/>
+          <w:szCs w:val="21"/>
+        </w:rPr>
+        <w:t>.</w:t>
+      </w:r>
+      <w:r>
+        <w:rPr>
+          <w:rFonts w:ascii="Consolas" w:eastAsia="Times New Roman" w:hAnsi="Consolas" w:cs="Times New Roman"/>
+          <w:color w:val="DCDCAA"/>
+          <w:sz w:val="21"/>
+          <w:szCs w:val="21"/>
+        </w:rPr>
+        <w:t>size</w:t>
+      </w:r>
+      <w:r>
+        <w:rPr>
+          <w:rFonts w:ascii="Consolas" w:eastAsia="Times New Roman" w:hAnsi="Consolas" w:cs="Times New Roman"/>
+          <w:color w:val="D4D4D4"/>
+          <w:sz w:val="21"/>
+          <w:szCs w:val="21"/>
+        </w:rPr>
+        <w:t xml:space="preserve">() * </w:t>
+      </w:r>
+      <w:r>
+        <w:rPr>
+          <w:rFonts w:ascii="Consolas" w:eastAsia="Times New Roman" w:hAnsi="Consolas" w:cs="Times New Roman"/>
+          <w:color w:val="B5CEA8"/>
+          <w:sz w:val="21"/>
+          <w:szCs w:val="21"/>
+        </w:rPr>
+        <w:t>2</w:t>
+      </w:r>
+      <w:r>
+        <w:rPr>
+          <w:rFonts w:ascii="Consolas" w:eastAsia="Times New Roman" w:hAnsi="Consolas" w:cs="Times New Roman"/>
+          <w:color w:val="D4D4D4"/>
+          <w:sz w:val="21"/>
+          <w:szCs w:val="21"/>
+        </w:rPr>
+        <w:t xml:space="preserve"> </w:t>
+      </w:r>
+      <w:r>
+        <w:rPr>
+          <w:rFonts w:ascii="Consolas" w:eastAsia="Times New Roman" w:hAnsi="Consolas" w:cs="Times New Roman"/>
+          <w:color w:val="DCDCAA"/>
+          <w:sz w:val="21"/>
+          <w:szCs w:val="21"/>
+        </w:rPr>
+        <w:t>&lt;&lt;</w:t>
+      </w:r>
+      <w:r>
+        <w:rPr>
+          <w:rFonts w:ascii="Consolas" w:eastAsia="Times New Roman" w:hAnsi="Consolas" w:cs="Times New Roman"/>
+          <w:color w:val="D4D4D4"/>
+          <w:sz w:val="21"/>
+          <w:szCs w:val="21"/>
+        </w:rPr>
+        <w:t xml:space="preserve"> </w:t>
+      </w:r>
+      <w:r>
+        <w:rPr>
+          <w:rFonts w:ascii="Consolas" w:eastAsia="Times New Roman" w:hAnsi="Consolas" w:cs="Times New Roman"/>
+          <w:color w:val="DCDCAA"/>
+          <w:sz w:val="21"/>
+          <w:szCs w:val="21"/>
+        </w:rPr>
         <w:t>endl</w:t>
       </w:r>
-      <w:proofErr w:type="spellEnd"/>
       <w:r>
         <w:rPr>
           <w:rFonts w:ascii="Consolas" w:eastAsia="Times New Roman" w:hAnsi="Consolas" w:cs="Times New Roman"/>
@@ -4032,7 +3768,6 @@
         </w:rPr>
         <w:t>;</w:t>
       </w:r>
-      <w:proofErr w:type="gramEnd"/>
     </w:p>
     <w:p>
       <w:pPr>
@@ -4045,209 +3780,6 @@
           <w:szCs w:val="21"/>
         </w:rPr>
       </w:pPr>
-    </w:p>
-    <w:p>
-      <w:pPr>
-        <w:shd w:val="clear" w:color="auto" w:fill="1E1E1E"/>
-        <w:spacing w:line="285" w:lineRule="atLeast"/>
-        <w:rPr>
-          <w:rFonts w:ascii="Consolas" w:eastAsia="Times New Roman" w:hAnsi="Consolas" w:cs="Times New Roman"/>
-          <w:color w:val="D4D4D4"/>
-          <w:sz w:val="21"/>
-          <w:szCs w:val="21"/>
-        </w:rPr>
-      </w:pPr>
-      <w:r>
-        <w:rPr>
-          <w:rFonts w:ascii="Consolas" w:eastAsia="Times New Roman" w:hAnsi="Consolas" w:cs="Times New Roman"/>
-          <w:color w:val="D4D4D4"/>
-          <w:sz w:val="21"/>
-          <w:szCs w:val="21"/>
-        </w:rPr>
-        <w:t xml:space="preserve">    </w:t>
-      </w:r>
-      <w:proofErr w:type="spellStart"/>
-      <w:r>
-        <w:rPr>
-          <w:rFonts w:ascii="Consolas" w:eastAsia="Times New Roman" w:hAnsi="Consolas" w:cs="Times New Roman"/>
-          <w:color w:val="9CDCFE"/>
-          <w:sz w:val="21"/>
-          <w:szCs w:val="21"/>
-        </w:rPr>
-        <w:t>cout</w:t>
-      </w:r>
-      <w:proofErr w:type="spellEnd"/>
-      <w:r>
-        <w:rPr>
-          <w:rFonts w:ascii="Consolas" w:eastAsia="Times New Roman" w:hAnsi="Consolas" w:cs="Times New Roman"/>
-          <w:color w:val="D4D4D4"/>
-          <w:sz w:val="21"/>
-          <w:szCs w:val="21"/>
-        </w:rPr>
-        <w:t xml:space="preserve"> </w:t>
-      </w:r>
-      <w:r>
-        <w:rPr>
-          <w:rFonts w:ascii="Consolas" w:eastAsia="Times New Roman" w:hAnsi="Consolas" w:cs="Times New Roman"/>
-          <w:color w:val="DCDCAA"/>
-          <w:sz w:val="21"/>
-          <w:szCs w:val="21"/>
-        </w:rPr>
-        <w:t>&lt;&lt;</w:t>
-      </w:r>
-      <w:r>
-        <w:rPr>
-          <w:rFonts w:ascii="Consolas" w:eastAsia="Times New Roman" w:hAnsi="Consolas" w:cs="Times New Roman"/>
-          <w:color w:val="D4D4D4"/>
-          <w:sz w:val="21"/>
-          <w:szCs w:val="21"/>
-        </w:rPr>
-        <w:t xml:space="preserve"> </w:t>
-      </w:r>
-      <w:r>
-        <w:rPr>
-          <w:rFonts w:ascii="Consolas" w:eastAsia="Times New Roman" w:hAnsi="Consolas" w:cs="Times New Roman"/>
-          <w:color w:val="CE9178"/>
-          <w:sz w:val="21"/>
-          <w:szCs w:val="21"/>
-        </w:rPr>
-        <w:t>"Max shots needed: "</w:t>
-      </w:r>
-      <w:r>
-        <w:rPr>
-          <w:rFonts w:ascii="Consolas" w:eastAsia="Times New Roman" w:hAnsi="Consolas" w:cs="Times New Roman"/>
-          <w:color w:val="D4D4D4"/>
-          <w:sz w:val="21"/>
-          <w:szCs w:val="21"/>
-        </w:rPr>
-        <w:t xml:space="preserve"> </w:t>
-      </w:r>
-      <w:r>
-        <w:rPr>
-          <w:rFonts w:ascii="Consolas" w:eastAsia="Times New Roman" w:hAnsi="Consolas" w:cs="Times New Roman"/>
-          <w:color w:val="DCDCAA"/>
-          <w:sz w:val="21"/>
-          <w:szCs w:val="21"/>
-        </w:rPr>
-        <w:t>&lt;&lt;</w:t>
-      </w:r>
-      <w:r>
-        <w:rPr>
-          <w:rFonts w:ascii="Consolas" w:eastAsia="Times New Roman" w:hAnsi="Consolas" w:cs="Times New Roman"/>
-          <w:color w:val="D4D4D4"/>
-          <w:sz w:val="21"/>
-          <w:szCs w:val="21"/>
-        </w:rPr>
-        <w:t xml:space="preserve"> </w:t>
-      </w:r>
-      <w:proofErr w:type="spellStart"/>
-      <w:r>
-        <w:rPr>
-          <w:rFonts w:ascii="Consolas" w:eastAsia="Times New Roman" w:hAnsi="Consolas" w:cs="Times New Roman"/>
-          <w:color w:val="9CDCFE"/>
-          <w:sz w:val="21"/>
-          <w:szCs w:val="21"/>
-        </w:rPr>
-        <w:t>forwardSequence</w:t>
-      </w:r>
-      <w:r>
-        <w:rPr>
-          <w:rFonts w:ascii="Consolas" w:eastAsia="Times New Roman" w:hAnsi="Consolas" w:cs="Times New Roman"/>
-          <w:color w:val="D4D4D4"/>
-          <w:sz w:val="21"/>
-          <w:szCs w:val="21"/>
-        </w:rPr>
-        <w:t>.</w:t>
-      </w:r>
-      <w:r>
-        <w:rPr>
-          <w:rFonts w:ascii="Consolas" w:eastAsia="Times New Roman" w:hAnsi="Consolas" w:cs="Times New Roman"/>
-          <w:color w:val="DCDCAA"/>
-          <w:sz w:val="21"/>
-          <w:szCs w:val="21"/>
-        </w:rPr>
-        <w:t>size</w:t>
-      </w:r>
-      <w:proofErr w:type="spellEnd"/>
-      <w:r>
-        <w:rPr>
-          <w:rFonts w:ascii="Consolas" w:eastAsia="Times New Roman" w:hAnsi="Consolas" w:cs="Times New Roman"/>
-          <w:color w:val="D4D4D4"/>
-          <w:sz w:val="21"/>
-          <w:szCs w:val="21"/>
-        </w:rPr>
-        <w:t xml:space="preserve">() * </w:t>
-      </w:r>
-      <w:r>
-        <w:rPr>
-          <w:rFonts w:ascii="Consolas" w:eastAsia="Times New Roman" w:hAnsi="Consolas" w:cs="Times New Roman"/>
-          <w:color w:val="B5CEA8"/>
-          <w:sz w:val="21"/>
-          <w:szCs w:val="21"/>
-        </w:rPr>
-        <w:t>2</w:t>
-      </w:r>
-      <w:r>
-        <w:rPr>
-          <w:rFonts w:ascii="Consolas" w:eastAsia="Times New Roman" w:hAnsi="Consolas" w:cs="Times New Roman"/>
-          <w:color w:val="D4D4D4"/>
-          <w:sz w:val="21"/>
-          <w:szCs w:val="21"/>
-        </w:rPr>
-        <w:t xml:space="preserve"> </w:t>
-      </w:r>
-      <w:r>
-        <w:rPr>
-          <w:rFonts w:ascii="Consolas" w:eastAsia="Times New Roman" w:hAnsi="Consolas" w:cs="Times New Roman"/>
-          <w:color w:val="DCDCAA"/>
-          <w:sz w:val="21"/>
-          <w:szCs w:val="21"/>
-        </w:rPr>
-        <w:t>&lt;&lt;</w:t>
-      </w:r>
-      <w:r>
-        <w:rPr>
-          <w:rFonts w:ascii="Consolas" w:eastAsia="Times New Roman" w:hAnsi="Consolas" w:cs="Times New Roman"/>
-          <w:color w:val="D4D4D4"/>
-          <w:sz w:val="21"/>
-          <w:szCs w:val="21"/>
-        </w:rPr>
-        <w:t xml:space="preserve"> </w:t>
-      </w:r>
-      <w:proofErr w:type="spellStart"/>
-      <w:proofErr w:type="gramStart"/>
-      <w:r>
-        <w:rPr>
-          <w:rFonts w:ascii="Consolas" w:eastAsia="Times New Roman" w:hAnsi="Consolas" w:cs="Times New Roman"/>
-          <w:color w:val="DCDCAA"/>
-          <w:sz w:val="21"/>
-          <w:szCs w:val="21"/>
-        </w:rPr>
-        <w:t>endl</w:t>
-      </w:r>
-      <w:proofErr w:type="spellEnd"/>
-      <w:r>
-        <w:rPr>
-          <w:rFonts w:ascii="Consolas" w:eastAsia="Times New Roman" w:hAnsi="Consolas" w:cs="Times New Roman"/>
-          <w:color w:val="D4D4D4"/>
-          <w:sz w:val="21"/>
-          <w:szCs w:val="21"/>
-        </w:rPr>
-        <w:t>;</w:t>
-      </w:r>
-      <w:proofErr w:type="gramEnd"/>
-    </w:p>
-    <w:p>
-      <w:pPr>
-        <w:shd w:val="clear" w:color="auto" w:fill="1E1E1E"/>
-        <w:spacing w:line="285" w:lineRule="atLeast"/>
-        <w:rPr>
-          <w:rFonts w:ascii="Consolas" w:eastAsia="Times New Roman" w:hAnsi="Consolas" w:cs="Times New Roman"/>
-          <w:color w:val="D4D4D4"/>
-          <w:sz w:val="21"/>
-          <w:szCs w:val="21"/>
-        </w:rPr>
-      </w:pPr>
       <w:r>
         <w:rPr>
           <w:rFonts w:ascii="Consolas" w:eastAsia="Times New Roman" w:hAnsi="Consolas" w:cs="Times New Roman"/>
@@ -4259,28 +3791,59 @@
       </w:r>
     </w:p>
     <w:p>
-      <w:r>
-        <w:br w:type="page"/>
-      </w:r>
-    </w:p>
-    <w:p>
-      <w:pPr>
-        <w:pStyle w:val="Heading1"/>
+      <w:pPr>
+        <w:pStyle w:val="Heading2"/>
       </w:pPr>
       <w:bookmarkStart w:id="7" w:name="_Toc228918279"/>
       <w:r>
         <w:lastRenderedPageBreak/>
-        <w:t>6. Test Cases</w:t>
+        <w:t>5.6</w:t>
+      </w:r>
+      <w:r>
+        <w:t xml:space="preserve"> Test </w:t>
+      </w:r>
+      <w:r>
+        <w:t>c</w:t>
+      </w:r>
+      <w:r>
+        <w:t>ases</w:t>
       </w:r>
       <w:bookmarkEnd w:id="7"/>
     </w:p>
     <w:p>
       <w:pPr>
-        <w:pStyle w:val="Heading2"/>
+        <w:pStyle w:val="Heading3"/>
       </w:pPr>
       <w:bookmarkStart w:id="8" w:name="_Toc228918280"/>
       <w:r>
-        <w:t>6.1 Test Cases Where the Technique Succeeds</w:t>
+        <w:t>5.</w:t>
+      </w:r>
+      <w:r>
+        <w:t xml:space="preserve">6.1 Test </w:t>
+      </w:r>
+      <w:r>
+        <w:t>c</w:t>
+      </w:r>
+      <w:r>
+        <w:t xml:space="preserve">ases </w:t>
+      </w:r>
+      <w:r>
+        <w:t>w</w:t>
+      </w:r>
+      <w:r>
+        <w:t xml:space="preserve">here the </w:t>
+      </w:r>
+      <w:r>
+        <w:t>t</w:t>
+      </w:r>
+      <w:r>
+        <w:t xml:space="preserve">echnique </w:t>
+      </w:r>
+      <w:r>
+        <w:t>s</w:t>
+      </w:r>
+      <w:r>
+        <w:t>ucceeds</w:t>
       </w:r>
       <w:bookmarkEnd w:id="8"/>
     </w:p>
@@ -5395,25 +4958,7 @@
                 <w:sz w:val="20"/>
                 <w:szCs w:val="20"/>
               </w:rPr>
-              <w:t xml:space="preserve">Large </w:t>
-            </w:r>
-            <w:proofErr w:type="gramStart"/>
-            <w:r>
-              <w:rPr>
-                <w:color w:val="000000"/>
-                <w:sz w:val="20"/>
-                <w:szCs w:val="20"/>
-              </w:rPr>
-              <w:t>range;</w:t>
-            </w:r>
-            <w:proofErr w:type="gramEnd"/>
-            <w:r>
-              <w:rPr>
-                <w:color w:val="000000"/>
-                <w:sz w:val="20"/>
-                <w:szCs w:val="20"/>
-              </w:rPr>
-              <w:t xml:space="preserve"> both odd and even starting positions covered</w:t>
+              <w:t>Large range; both odd and even starting positions covered</w:t>
             </w:r>
           </w:p>
         </w:tc>
@@ -5438,9 +4983,12 @@
     <w:p/>
     <w:p>
       <w:pPr>
-        <w:pStyle w:val="Heading2"/>
+        <w:pStyle w:val="Heading3"/>
       </w:pPr>
       <w:bookmarkStart w:id="9" w:name="_Toc228918281"/>
+      <w:r>
+        <w:t>5.</w:t>
+      </w:r>
       <w:r>
         <w:t>6.2 Test Cases Where the Technique Fails</w:t>
       </w:r>
@@ -5918,25 +5466,7 @@
                 <w:sz w:val="20"/>
                 <w:szCs w:val="20"/>
               </w:rPr>
-              <w:t>Forward sweep only (</w:t>
-            </w:r>
-            <w:proofErr w:type="gramStart"/>
-            <w:r>
-              <w:rPr>
-                <w:color w:val="000000"/>
-                <w:sz w:val="20"/>
-                <w:szCs w:val="20"/>
-              </w:rPr>
-              <w:t>no</w:t>
-            </w:r>
-            <w:proofErr w:type="gramEnd"/>
-            <w:r>
-              <w:rPr>
-                <w:color w:val="000000"/>
-                <w:sz w:val="20"/>
-                <w:szCs w:val="20"/>
-              </w:rPr>
-              <w:t xml:space="preserve"> backward)</w:t>
+              <w:t>Forward sweep only (no backward)</w:t>
             </w:r>
           </w:p>
         </w:tc>
@@ -6290,45 +5820,35 @@
                 <w:sz w:val="20"/>
                 <w:szCs w:val="20"/>
               </w:rPr>
-              <w:t xml:space="preserve">Using only Decrease and </w:t>
-            </w:r>
+              <w:t>Using only Decrease and Conquer (linear scan)</w:t>
+            </w:r>
+          </w:p>
+        </w:tc>
+        <w:tc>
+          <w:tcPr>
+            <w:tcW w:w="1860" w:type="dxa"/>
+            <w:tcBorders>
+              <w:top w:val="single" w:sz="4" w:space="0" w:color="AAAAAA"/>
+              <w:left w:val="single" w:sz="4" w:space="0" w:color="AAAAAA"/>
+              <w:bottom w:val="single" w:sz="4" w:space="0" w:color="AAAAAA"/>
+              <w:right w:val="single" w:sz="4" w:space="0" w:color="AAAAAA"/>
+            </w:tcBorders>
+            <w:shd w:val="clear" w:color="auto" w:fill="FFFFFF"/>
+            <w:tcMar>
+              <w:top w:w="80" w:type="dxa"/>
+              <w:left w:w="120" w:type="dxa"/>
+              <w:bottom w:w="80" w:type="dxa"/>
+              <w:right w:w="120" w:type="dxa"/>
+            </w:tcMar>
+            <w:vAlign w:val="center"/>
+          </w:tcPr>
+          <w:p>
             <w:r>
               <w:rPr>
                 <w:color w:val="000000"/>
                 <w:sz w:val="20"/>
                 <w:szCs w:val="20"/>
               </w:rPr>
-              <w:lastRenderedPageBreak/>
-              <w:t>Conquer (linear scan)</w:t>
-            </w:r>
-          </w:p>
-        </w:tc>
-        <w:tc>
-          <w:tcPr>
-            <w:tcW w:w="1860" w:type="dxa"/>
-            <w:tcBorders>
-              <w:top w:val="single" w:sz="4" w:space="0" w:color="AAAAAA"/>
-              <w:left w:val="single" w:sz="4" w:space="0" w:color="AAAAAA"/>
-              <w:bottom w:val="single" w:sz="4" w:space="0" w:color="AAAAAA"/>
-              <w:right w:val="single" w:sz="4" w:space="0" w:color="AAAAAA"/>
-            </w:tcBorders>
-            <w:shd w:val="clear" w:color="auto" w:fill="FFFFFF"/>
-            <w:tcMar>
-              <w:top w:w="80" w:type="dxa"/>
-              <w:left w:w="120" w:type="dxa"/>
-              <w:bottom w:w="80" w:type="dxa"/>
-              <w:right w:w="120" w:type="dxa"/>
-            </w:tcMar>
-            <w:vAlign w:val="center"/>
-          </w:tcPr>
-          <w:p>
-            <w:r>
-              <w:rPr>
-                <w:color w:val="000000"/>
-                <w:sz w:val="20"/>
-                <w:szCs w:val="20"/>
-              </w:rPr>
-              <w:lastRenderedPageBreak/>
               <w:t>n = 5, shoot: 1 2 3 4 5</w:t>
             </w:r>
           </w:p>
@@ -6392,6 +5912,7 @@
           <w:bCs/>
           <w:color w:val="000000"/>
         </w:rPr>
+        <w:lastRenderedPageBreak/>
         <w:t>Key reason for failure:</w:t>
       </w:r>
       <w:r>
@@ -6408,22 +5929,40 @@
     </w:p>
     <w:p>
       <w:pPr>
-        <w:pStyle w:val="Heading1"/>
+        <w:pStyle w:val="Heading2"/>
       </w:pPr>
       <w:bookmarkStart w:id="10" w:name="_Toc228918282"/>
       <w:r>
         <w:lastRenderedPageBreak/>
-        <w:t>7. Complexity Analysis</w:t>
+        <w:t>5.</w:t>
+      </w:r>
+      <w:r>
+        <w:t xml:space="preserve">7 Complexity </w:t>
+      </w:r>
+      <w:r>
+        <w:t>a</w:t>
+      </w:r>
+      <w:r>
+        <w:t>nalysis</w:t>
       </w:r>
       <w:bookmarkEnd w:id="10"/>
     </w:p>
     <w:p>
       <w:pPr>
-        <w:pStyle w:val="Heading2"/>
+        <w:pStyle w:val="Heading3"/>
       </w:pPr>
       <w:bookmarkStart w:id="11" w:name="_Toc228918283"/>
       <w:r>
-        <w:t>7.1 Time Complexity</w:t>
+        <w:t>5.</w:t>
+      </w:r>
+      <w:r>
+        <w:t xml:space="preserve">7.1 Time </w:t>
+      </w:r>
+      <w:r>
+        <w:t>c</w:t>
+      </w:r>
+      <w:r>
+        <w:t>omplexity</w:t>
       </w:r>
       <w:bookmarkEnd w:id="11"/>
     </w:p>
@@ -6437,21 +5976,7 @@
         <w:rPr>
           <w:color w:val="000000"/>
         </w:rPr>
-        <w:t xml:space="preserve">The </w:t>
-      </w:r>
-      <w:proofErr w:type="gramStart"/>
-      <w:r>
-        <w:rPr>
-          <w:color w:val="000000"/>
-        </w:rPr>
-        <w:t>hunt(</w:t>
-      </w:r>
-      <w:proofErr w:type="gramEnd"/>
-      <w:r>
-        <w:rPr>
-          <w:color w:val="000000"/>
-        </w:rPr>
-        <w:t>) function divides the range [low, high] into two halves recursively, similar to a merge sort decomposition. The recurrence relation is:</w:t>
+        <w:t>The hunt() function divides the range [low, high] into two halves recursively, similar to a merge sort decomposition. The recurrence relation is:</w:t>
       </w:r>
     </w:p>
     <w:p>
@@ -6466,27 +5991,7 @@
           <w:bCs/>
           <w:color w:val="2E75B6"/>
         </w:rPr>
-        <w:t xml:space="preserve">T(n) = </w:t>
-      </w:r>
-      <w:proofErr w:type="spellStart"/>
-      <w:r>
-        <w:rPr>
-          <w:rFonts w:ascii="Courier New" w:eastAsia="Courier New" w:hAnsi="Courier New" w:cs="Courier New"/>
-          <w:b/>
-          <w:bCs/>
-          <w:color w:val="2E75B6"/>
-        </w:rPr>
-        <w:t>aT</w:t>
-      </w:r>
-      <w:proofErr w:type="spellEnd"/>
-      <w:r>
-        <w:rPr>
-          <w:rFonts w:ascii="Courier New" w:eastAsia="Courier New" w:hAnsi="Courier New" w:cs="Courier New"/>
-          <w:b/>
-          <w:bCs/>
-          <w:color w:val="2E75B6"/>
-        </w:rPr>
-        <w:t>(n/b) + f(n)</w:t>
+        <w:t>T(n) = aT(n/b) + f(n)</w:t>
       </w:r>
     </w:p>
     <w:p>
@@ -6511,49 +6016,7 @@
         <w:rPr>
           <w:color w:val="000000"/>
         </w:rPr>
-        <w:t xml:space="preserve"> algorithm: a = 2 (two recursive calls), b = 2 (each half is half the size), f(n) = </w:t>
-      </w:r>
-      <w:proofErr w:type="gramStart"/>
-      <w:r>
-        <w:rPr>
-          <w:color w:val="000000"/>
-        </w:rPr>
-        <w:t>O(</w:t>
-      </w:r>
-      <w:proofErr w:type="gramEnd"/>
-      <w:r>
-        <w:rPr>
-          <w:color w:val="000000"/>
-        </w:rPr>
-        <w:t xml:space="preserve">1) (only a </w:t>
-      </w:r>
-      <w:proofErr w:type="spellStart"/>
-      <w:r>
-        <w:rPr>
-          <w:color w:val="000000"/>
-        </w:rPr>
-        <w:t>push_back</w:t>
-      </w:r>
-      <w:proofErr w:type="spellEnd"/>
-      <w:r>
-        <w:rPr>
-          <w:color w:val="000000"/>
-        </w:rPr>
-        <w:t xml:space="preserve"> at the base case, no merge cost). By the Master Theorem with a = 2, b = 2, d = 0: Since a = 2 &gt; </w:t>
-      </w:r>
-      <w:proofErr w:type="spellStart"/>
-      <w:r>
-        <w:rPr>
-          <w:color w:val="000000"/>
-        </w:rPr>
-        <w:t>b^d</w:t>
-      </w:r>
-      <w:proofErr w:type="spellEnd"/>
-      <w:r>
-        <w:rPr>
-          <w:color w:val="000000"/>
-        </w:rPr>
-        <w:t xml:space="preserve"> = 1, we have Case 1: T(n) = O(n).</w:t>
+        <w:t xml:space="preserve"> algorithm: a = 2 (two recursive calls), b = 2 (each half is half the size), f(n) = O(1) (only a push_back at the base case, no merge cost). By the Master Theorem with a = 2, b = 2, d = 0: Since a = 2 &gt; b^d = 1, we have Case 1: T(n) = O(n).</w:t>
       </w:r>
     </w:p>
     <w:p>
@@ -6607,14 +6070,22 @@
         <w:t>Total Time Complexity: O(n).</w:t>
       </w:r>
     </w:p>
-    <w:p/>
-    <w:p>
-      <w:pPr>
-        <w:pStyle w:val="Heading2"/>
+    <w:p>
+      <w:pPr>
+        <w:pStyle w:val="Heading3"/>
       </w:pPr>
       <w:bookmarkStart w:id="12" w:name="_Toc228918284"/>
       <w:r>
-        <w:t>7.2 Space Complexity</w:t>
+        <w:t>5.</w:t>
+      </w:r>
+      <w:r>
+        <w:t xml:space="preserve">7.2 Space </w:t>
+      </w:r>
+      <w:r>
+        <w:t>c</w:t>
+      </w:r>
+      <w:r>
+        <w:t>omplexity</w:t>
       </w:r>
       <w:bookmarkEnd w:id="12"/>
     </w:p>
@@ -6632,21 +6103,7 @@
         <w:rPr>
           <w:color w:val="000000"/>
         </w:rPr>
-        <w:t xml:space="preserve">The </w:t>
-      </w:r>
-      <w:proofErr w:type="spellStart"/>
-      <w:r>
-        <w:rPr>
-          <w:color w:val="000000"/>
-        </w:rPr>
-        <w:t>forwardSequence</w:t>
-      </w:r>
-      <w:proofErr w:type="spellEnd"/>
-      <w:r>
-        <w:rPr>
-          <w:color w:val="000000"/>
-        </w:rPr>
-        <w:t xml:space="preserve"> vector holds n-2 elements → O(n) space.</w:t>
+        <w:t>The forwardSequence vector holds n-2 elements → O(n) space.</w:t>
       </w:r>
     </w:p>
     <w:p>
@@ -6663,21 +6120,7 @@
         <w:rPr>
           <w:color w:val="000000"/>
         </w:rPr>
-        <w:t xml:space="preserve">The </w:t>
-      </w:r>
-      <w:proofErr w:type="spellStart"/>
-      <w:r>
-        <w:rPr>
-          <w:color w:val="000000"/>
-        </w:rPr>
-        <w:t>backwardSequence</w:t>
-      </w:r>
-      <w:proofErr w:type="spellEnd"/>
-      <w:r>
-        <w:rPr>
-          <w:color w:val="000000"/>
-        </w:rPr>
-        <w:t xml:space="preserve"> vector also holds n-2 elements → O(n) space.</w:t>
+        <w:t>The backwardSequence vector also holds n-2 elements → O(n) space.</w:t>
       </w:r>
     </w:p>
     <w:p>
@@ -6694,21 +6137,7 @@
         <w:rPr>
           <w:color w:val="000000"/>
         </w:rPr>
-        <w:t xml:space="preserve">The recursion stack depth is </w:t>
-      </w:r>
-      <w:proofErr w:type="gramStart"/>
-      <w:r>
-        <w:rPr>
-          <w:color w:val="000000"/>
-        </w:rPr>
-        <w:t>O(</w:t>
-      </w:r>
-      <w:proofErr w:type="gramEnd"/>
-      <w:r>
-        <w:rPr>
-          <w:color w:val="000000"/>
-        </w:rPr>
-        <w:t>log n) (binary split each time).</w:t>
+        <w:t>The recursion stack depth is O(log n) (binary split each time).</w:t>
       </w:r>
     </w:p>
     <w:p>
@@ -7113,23 +6542,13 @@
             <w:pPr>
               <w:jc w:val="center"/>
             </w:pPr>
-            <w:proofErr w:type="gramStart"/>
             <w:r>
               <w:rPr>
                 <w:color w:val="000000"/>
                 <w:sz w:val="20"/>
                 <w:szCs w:val="20"/>
               </w:rPr>
-              <w:t>O(</w:t>
-            </w:r>
-            <w:proofErr w:type="gramEnd"/>
-            <w:r>
-              <w:rPr>
-                <w:color w:val="000000"/>
-                <w:sz w:val="20"/>
-                <w:szCs w:val="20"/>
-              </w:rPr>
-              <w:t>log n)</w:t>
+              <w:t>O(log n)</w:t>
             </w:r>
           </w:p>
         </w:tc>
@@ -7187,12 +6606,27 @@
     </w:p>
     <w:p>
       <w:pPr>
-        <w:pStyle w:val="Heading1"/>
+        <w:pStyle w:val="Heading2"/>
       </w:pPr>
       <w:bookmarkStart w:id="13" w:name="_Toc228918285"/>
       <w:r>
         <w:lastRenderedPageBreak/>
-        <w:t>8. Comparative Evaluation of Techniques</w:t>
+        <w:t>5.</w:t>
+      </w:r>
+      <w:r>
+        <w:t xml:space="preserve">8. Comparative </w:t>
+      </w:r>
+      <w:r>
+        <w:t>e</w:t>
+      </w:r>
+      <w:r>
+        <w:t xml:space="preserve">valuation of </w:t>
+      </w:r>
+      <w:r>
+        <w:t>t</w:t>
+      </w:r>
+      <w:r>
+        <w:t>echniques</w:t>
       </w:r>
       <w:bookmarkEnd w:id="13"/>
     </w:p>
@@ -8245,11 +7679,38 @@
     </w:p>
     <w:p>
       <w:pPr>
-        <w:pStyle w:val="Heading2"/>
+        <w:pStyle w:val="Heading3"/>
       </w:pPr>
       <w:bookmarkStart w:id="14" w:name="_Toc228918286"/>
       <w:r>
-        <w:t>8.1 Pros of Divide and Conquer Over Other Techniques</w:t>
+        <w:t>5.</w:t>
+      </w:r>
+      <w:r>
+        <w:t xml:space="preserve">8.1 </w:t>
+      </w:r>
+      <w:r>
+        <w:t>Advantages</w:t>
+      </w:r>
+      <w:r>
+        <w:t xml:space="preserve"> of Divide and Conquer </w:t>
+      </w:r>
+      <w:r>
+        <w:t>o</w:t>
+      </w:r>
+      <w:r>
+        <w:t xml:space="preserve">ver </w:t>
+      </w:r>
+      <w:r>
+        <w:t>o</w:t>
+      </w:r>
+      <w:r>
+        <w:t xml:space="preserve">ther </w:t>
+      </w:r>
+      <w:r>
+        <w:t>t</w:t>
+      </w:r>
+      <w:r>
+        <w:t>echniques</w:t>
       </w:r>
       <w:bookmarkEnd w:id="14"/>
     </w:p>
@@ -8340,11 +7801,20 @@
     </w:p>
     <w:p>
       <w:pPr>
-        <w:pStyle w:val="Heading2"/>
+        <w:pStyle w:val="Heading3"/>
       </w:pPr>
       <w:bookmarkStart w:id="15" w:name="_Toc228918287"/>
       <w:r>
-        <w:t>8.2 Cons of Divide and Conquer</w:t>
+        <w:t>5.</w:t>
+      </w:r>
+      <w:r>
+        <w:t xml:space="preserve">8.2 </w:t>
+      </w:r>
+      <w:r>
+        <w:t>Disadvantages</w:t>
+      </w:r>
+      <w:r>
+        <w:t xml:space="preserve"> of Divide and Conquer</w:t>
       </w:r>
       <w:bookmarkEnd w:id="15"/>
     </w:p>
@@ -8406,22 +7876,28 @@
     </w:p>
     <w:p>
       <w:pPr>
-        <w:pStyle w:val="Heading1"/>
+        <w:pStyle w:val="Heading2"/>
       </w:pPr>
       <w:bookmarkStart w:id="16" w:name="_Toc228918288"/>
       <w:r>
         <w:lastRenderedPageBreak/>
+        <w:t>5.</w:t>
+      </w:r>
+      <w:r>
         <w:t>9. Alternative Approaches</w:t>
       </w:r>
       <w:bookmarkEnd w:id="16"/>
     </w:p>
     <w:p>
       <w:pPr>
-        <w:pStyle w:val="Heading2"/>
+        <w:pStyle w:val="Heading3"/>
       </w:pPr>
       <w:bookmarkStart w:id="17" w:name="_Toc228918289"/>
       <w:r>
-        <w:t xml:space="preserve">9.1 Decrease and Conquer – Linear Sweep </w:t>
+        <w:t>5.</w:t>
+      </w:r>
+      <w:r>
+        <w:t>9.1 Decrease and Conquer</w:t>
       </w:r>
       <w:bookmarkEnd w:id="17"/>
     </w:p>
@@ -8434,20 +7910,29 @@
         <w:rPr>
           <w:color w:val="000000"/>
         </w:rPr>
-        <w:t>A simple approach would be to shoot spots 1, 2, 3, ..., n sequentially</w:t>
+        <w:t>A simple approach would be to shoot spots 1, 2, 3, ..., n sequentiall</w:t>
       </w:r>
       <w:r>
         <w:rPr>
           <w:color w:val="000000"/>
         </w:rPr>
-        <w:t>.</w:t>
-      </w:r>
-    </w:p>
-    <w:p>
-      <w:pPr>
-        <w:pStyle w:val="Heading2"/>
+        <w:t>y in a linear sweep fashion</w:t>
+      </w:r>
+      <w:r>
+        <w:rPr>
+          <w:color w:val="000000"/>
+        </w:rPr>
+        <w:t>.s</w:t>
+      </w:r>
+    </w:p>
+    <w:p>
+      <w:pPr>
+        <w:pStyle w:val="Heading3"/>
       </w:pPr>
       <w:bookmarkStart w:id="18" w:name="_Toc228918290"/>
+      <w:r>
+        <w:t>5.</w:t>
+      </w:r>
       <w:r>
         <w:t>9.2 Random Shooting</w:t>
       </w:r>
@@ -8468,9 +7953,12 @@
     </w:p>
     <w:p>
       <w:pPr>
-        <w:pStyle w:val="Heading2"/>
+        <w:pStyle w:val="Heading3"/>
       </w:pPr>
       <w:bookmarkStart w:id="19" w:name="_Toc228918291"/>
+      <w:r>
+        <w:t>5.</w:t>
+      </w:r>
       <w:r>
         <w:t>9.3 Brute Force / Exhaustive Search</w:t>
       </w:r>
@@ -8491,9 +7979,12 @@
     </w:p>
     <w:p>
       <w:pPr>
-        <w:pStyle w:val="Heading2"/>
+        <w:pStyle w:val="Heading3"/>
       </w:pPr>
       <w:bookmarkStart w:id="20" w:name="_Toc228918292"/>
+      <w:r>
+        <w:t>5.</w:t>
+      </w:r>
       <w:r>
         <w:t>9.4 Dynamic Programming</w:t>
       </w:r>
@@ -8512,56 +8003,55 @@
         <w:rPr>
           <w:color w:val="000000"/>
         </w:rPr>
-        <w:t>One could model the state as (</w:t>
-      </w:r>
-      <w:proofErr w:type="spellStart"/>
+        <w:t xml:space="preserve">One could model the state as (shot_number, possible_positions_of_target) and use a DP table to compute the minimum guaranteed shooting sequence. While theoretically sound, this approach has higher space complexity — O(n²) — and is not simpler than the D&amp;C solution for this </w:t>
+      </w:r>
       <w:r>
         <w:rPr>
           <w:color w:val="000000"/>
         </w:rPr>
-        <w:t>shot_number</w:t>
-      </w:r>
-      <w:proofErr w:type="spellEnd"/>
+        <w:t>problem</w:t>
+      </w:r>
       <w:r>
         <w:rPr>
           <w:color w:val="000000"/>
         </w:rPr>
-        <w:t xml:space="preserve">, </w:t>
-      </w:r>
-      <w:proofErr w:type="spellStart"/>
-      <w:r>
-        <w:rPr>
-          <w:color w:val="000000"/>
-        </w:rPr>
-        <w:t>possible_positions_of_target</w:t>
-      </w:r>
-      <w:proofErr w:type="spellEnd"/>
-      <w:r>
-        <w:rPr>
-          <w:color w:val="000000"/>
-        </w:rPr>
-        <w:t xml:space="preserve">) and use a DP table to compute the minimum guaranteed shooting sequence. While theoretically sound, this approach has higher space complexity — O(n²) — and is not simpler than the D&amp;C solution for this </w:t>
-      </w:r>
-      <w:r>
-        <w:rPr>
-          <w:color w:val="000000"/>
-        </w:rPr>
-        <w:t>problem</w:t>
-      </w:r>
-      <w:r>
-        <w:rPr>
-          <w:color w:val="000000"/>
-        </w:rPr>
         <w:t>.</w:t>
       </w:r>
     </w:p>
     <w:p>
       <w:pPr>
-        <w:pStyle w:val="Heading2"/>
+        <w:pStyle w:val="Heading3"/>
       </w:pPr>
       <w:bookmarkStart w:id="21" w:name="_Toc228918293"/>
       <w:r>
-        <w:t>9.5 Possible Improvements to the Divide and Conquer Technique</w:t>
+        <w:t>5.</w:t>
+      </w:r>
+      <w:r>
+        <w:t xml:space="preserve">9.5 Possible </w:t>
+      </w:r>
+      <w:r>
+        <w:t>i</w:t>
+      </w:r>
+      <w:r>
+        <w:t>mprovements to the Divide</w:t>
+      </w:r>
+      <w:r>
+        <w:t>-</w:t>
+      </w:r>
+      <w:r>
+        <w:t>and</w:t>
+      </w:r>
+      <w:r>
+        <w:t>-</w:t>
+      </w:r>
+      <w:r>
+        <w:t xml:space="preserve">Conquer </w:t>
+      </w:r>
+      <w:r>
+        <w:t>t</w:t>
+      </w:r>
+      <w:r>
+        <w:t>echnique</w:t>
       </w:r>
       <w:bookmarkEnd w:id="21"/>
     </w:p>
@@ -8730,25 +8220,7 @@
                 <w:sz w:val="20"/>
                 <w:szCs w:val="20"/>
               </w:rPr>
-              <w:t xml:space="preserve">Convert the recursive </w:t>
-            </w:r>
-            <w:proofErr w:type="gramStart"/>
-            <w:r>
-              <w:rPr>
-                <w:color w:val="000000"/>
-                <w:sz w:val="20"/>
-                <w:szCs w:val="20"/>
-              </w:rPr>
-              <w:t>hunt(</w:t>
-            </w:r>
-            <w:proofErr w:type="gramEnd"/>
-            <w:r>
-              <w:rPr>
-                <w:color w:val="000000"/>
-                <w:sz w:val="20"/>
-                <w:szCs w:val="20"/>
-              </w:rPr>
-              <w:t>) to an iterative approach using an explicit stack to avoid recursion overhead and stack overflow for very large n.</w:t>
+              <w:t>Convert the recursive hunt() to an iterative approach using an explicit stack to avoid recursion overhead and stack overflow for very large n.</w:t>
             </w:r>
           </w:p>
         </w:tc>
@@ -9017,22 +8489,40 @@
     </w:p>
     <w:p>
       <w:pPr>
-        <w:pStyle w:val="Heading1"/>
+        <w:pStyle w:val="Heading2"/>
       </w:pPr>
       <w:bookmarkStart w:id="22" w:name="_Toc228918294"/>
       <w:r>
         <w:lastRenderedPageBreak/>
-        <w:t>10. Sample Outputs</w:t>
+        <w:t>5.</w:t>
+      </w:r>
+      <w:r>
+        <w:t xml:space="preserve">10 Sample </w:t>
+      </w:r>
+      <w:r>
+        <w:t>o</w:t>
+      </w:r>
+      <w:r>
+        <w:t>utputs</w:t>
       </w:r>
       <w:bookmarkEnd w:id="22"/>
     </w:p>
     <w:p>
       <w:pPr>
-        <w:pStyle w:val="Heading2"/>
+        <w:pStyle w:val="Heading3"/>
       </w:pPr>
       <w:bookmarkStart w:id="23" w:name="_Toc228918295"/>
       <w:r>
-        <w:t>10.1 Sample Output for n = 4</w:t>
+        <w:t>5.</w:t>
+      </w:r>
+      <w:r>
+        <w:t xml:space="preserve">10.1 Sample </w:t>
+      </w:r>
+      <w:r>
+        <w:t>o</w:t>
+      </w:r>
+      <w:r>
+        <w:t>utput for n = 4</w:t>
       </w:r>
       <w:bookmarkEnd w:id="23"/>
     </w:p>
@@ -9057,16 +8547,8 @@
         <w:rPr>
           <w:color w:val="000000"/>
         </w:rPr>
-        <w:t xml:space="preserve">Shot sequence: 2 3 3 </w:t>
-      </w:r>
-      <w:proofErr w:type="gramStart"/>
-      <w:r>
-        <w:rPr>
-          <w:color w:val="000000"/>
-        </w:rPr>
-        <w:t>2</w:t>
-      </w:r>
-      <w:proofErr w:type="gramEnd"/>
+        <w:t>Shot sequence: 2 3 3 2</w:t>
+      </w:r>
     </w:p>
     <w:p>
       <w:pPr>
@@ -9080,16 +8562,8 @@
         <w:rPr>
           <w:color w:val="000000"/>
         </w:rPr>
-        <w:t xml:space="preserve">Total shots needed: </w:t>
-      </w:r>
-      <w:proofErr w:type="gramStart"/>
-      <w:r>
-        <w:rPr>
-          <w:color w:val="000000"/>
-        </w:rPr>
-        <w:t>4</w:t>
-      </w:r>
-      <w:proofErr w:type="gramEnd"/>
+        <w:t>Total shots needed: 4</w:t>
+      </w:r>
     </w:p>
     <w:p>
       <w:pPr>
@@ -9175,34 +8649,37 @@
         <w:rPr>
           <w:color w:val="000000"/>
         </w:rPr>
-        <w:t>T</w:t>
+        <w:t>The forward sweep shoots spots 2 then 3. The backward sweep shoots spots 3 then 2</w:t>
       </w:r>
       <w:r>
         <w:rPr>
           <w:color w:val="000000"/>
         </w:rPr>
-        <w:t>he forward sweep shoots spots 2 then 3. The backward sweep shoots spots 3 then 2</w:t>
+        <w:t xml:space="preserve">, which </w:t>
       </w:r>
       <w:r>
         <w:rPr>
           <w:color w:val="000000"/>
         </w:rPr>
-        <w:t xml:space="preserve">, which </w:t>
-      </w:r>
-      <w:r>
-        <w:rPr>
-          <w:color w:val="000000"/>
-        </w:rPr>
         <w:t>guarantees hitting a target that starts at any of the 4 positions regardless of its movement strategy.</w:t>
       </w:r>
     </w:p>
     <w:p>
       <w:pPr>
-        <w:pStyle w:val="Heading2"/>
+        <w:pStyle w:val="Heading3"/>
       </w:pPr>
       <w:bookmarkStart w:id="24" w:name="_Toc228918296"/>
       <w:r>
-        <w:t>10.2 Sample Output for n = 5</w:t>
+        <w:t>5.</w:t>
+      </w:r>
+      <w:r>
+        <w:t xml:space="preserve">10.2 Sample </w:t>
+      </w:r>
+      <w:r>
+        <w:t>o</w:t>
+      </w:r>
+      <w:r>
+        <w:t>utput for n = 5</w:t>
       </w:r>
       <w:bookmarkEnd w:id="24"/>
     </w:p>
@@ -9227,16 +8704,8 @@
         <w:rPr>
           <w:color w:val="000000"/>
         </w:rPr>
-        <w:t xml:space="preserve">Shot sequence: 2 3 4 4 3 </w:t>
-      </w:r>
-      <w:proofErr w:type="gramStart"/>
-      <w:r>
-        <w:rPr>
-          <w:color w:val="000000"/>
-        </w:rPr>
-        <w:t>2</w:t>
-      </w:r>
-      <w:proofErr w:type="gramEnd"/>
+        <w:t>Shot sequence: 2 3 4 4 3 2</w:t>
+      </w:r>
     </w:p>
     <w:p>
       <w:pPr>
@@ -9250,16 +8719,8 @@
         <w:rPr>
           <w:color w:val="000000"/>
         </w:rPr>
-        <w:t xml:space="preserve">Total shots needed: </w:t>
-      </w:r>
-      <w:proofErr w:type="gramStart"/>
-      <w:r>
-        <w:rPr>
-          <w:color w:val="000000"/>
-        </w:rPr>
-        <w:t>6</w:t>
-      </w:r>
-      <w:proofErr w:type="gramEnd"/>
+        <w:t>Total shots needed: 6</w:t>
+      </w:r>
     </w:p>
     <w:p>
       <w:pPr>
@@ -9343,11 +8804,13 @@
     </w:p>
     <w:p>
       <w:pPr>
-        <w:pStyle w:val="Heading2"/>
+        <w:pStyle w:val="Heading3"/>
       </w:pPr>
       <w:bookmarkStart w:id="25" w:name="_Toc228918297"/>
       <w:r>
-        <w:lastRenderedPageBreak/>
+        <w:t>5.</w:t>
+      </w:r>
+      <w:r>
         <w:t>10.3 Sample Output for n = 8</w:t>
       </w:r>
       <w:bookmarkEnd w:id="25"/>
@@ -9361,6 +8824,7 @@
         <w:rPr>
           <w:color w:val="000000"/>
         </w:rPr>
+        <w:lastRenderedPageBreak/>
         <w:t>Input: n = 8</w:t>
       </w:r>
     </w:p>
@@ -9373,16 +8837,8 @@
         <w:rPr>
           <w:color w:val="000000"/>
         </w:rPr>
-        <w:t xml:space="preserve">Shot sequence: 2 3 4 5 6 7 7 6 5 4 3 </w:t>
-      </w:r>
-      <w:proofErr w:type="gramStart"/>
-      <w:r>
-        <w:rPr>
-          <w:color w:val="000000"/>
-        </w:rPr>
-        <w:t>2</w:t>
-      </w:r>
-      <w:proofErr w:type="gramEnd"/>
+        <w:t>Shot sequence: 2 3 4 5 6 7 7 6 5 4 3 2</w:t>
+      </w:r>
     </w:p>
     <w:p>
       <w:pPr>
@@ -9396,16 +8852,8 @@
         <w:rPr>
           <w:color w:val="000000"/>
         </w:rPr>
-        <w:t xml:space="preserve">Total shots needed: </w:t>
-      </w:r>
-      <w:proofErr w:type="gramStart"/>
-      <w:r>
-        <w:rPr>
-          <w:color w:val="000000"/>
-        </w:rPr>
-        <w:t>12</w:t>
-      </w:r>
-      <w:proofErr w:type="gramEnd"/>
+        <w:t>Total shots needed: 12</w:t>
+      </w:r>
     </w:p>
     <w:p>
       <w:pPr>
@@ -9493,12 +8941,27 @@
     </w:p>
     <w:p>
       <w:pPr>
-        <w:pStyle w:val="Heading1"/>
+        <w:pStyle w:val="Heading2"/>
       </w:pPr>
       <w:bookmarkStart w:id="26" w:name="_Toc228918298"/>
       <w:r>
         <w:lastRenderedPageBreak/>
-        <w:t>11. Summary and Key Findings</w:t>
+        <w:t>5.</w:t>
+      </w:r>
+      <w:r>
+        <w:t xml:space="preserve">11 Summary and </w:t>
+      </w:r>
+      <w:r>
+        <w:t>k</w:t>
+      </w:r>
+      <w:r>
+        <w:t xml:space="preserve">ey </w:t>
+      </w:r>
+      <w:r>
+        <w:t>f</w:t>
+      </w:r>
+      <w:r>
+        <w:t>indings</w:t>
       </w:r>
       <w:bookmarkEnd w:id="26"/>
     </w:p>
@@ -9599,21 +9062,7 @@
         <w:rPr>
           <w:color w:val="000000"/>
         </w:rPr>
-        <w:t xml:space="preserve">Space Complexity: O(n) for sequences, </w:t>
-      </w:r>
-      <w:proofErr w:type="gramStart"/>
-      <w:r>
-        <w:rPr>
-          <w:color w:val="000000"/>
-        </w:rPr>
-        <w:t>O(</w:t>
-      </w:r>
-      <w:proofErr w:type="gramEnd"/>
-      <w:r>
-        <w:rPr>
-          <w:color w:val="000000"/>
-        </w:rPr>
-        <w:t>log n) for the recursion stack.</w:t>
+        <w:t>Space Complexity: O(n) for sequences, O(log n) for the recursion stack.</w:t>
       </w:r>
     </w:p>
     <w:p>
@@ -10132,7 +9581,7 @@
     <w:lsdException w:name="Table Grid" w:uiPriority="39"/>
     <w:lsdException w:name="Table Theme" w:semiHidden="1" w:unhideWhenUsed="1"/>
     <w:lsdException w:name="Placeholder Text" w:semiHidden="1"/>
-    <w:lsdException w:name="No Spacing" w:uiPriority="1" w:qFormat="1"/>
+    <w:lsdException w:name="No Spacing" w:uiPriority="1"/>
     <w:lsdException w:name="Light Shading" w:uiPriority="60"/>
     <w:lsdException w:name="Light List" w:uiPriority="61"/>
     <w:lsdException w:name="Light Grid" w:uiPriority="62"/>
@@ -10390,7 +9839,6 @@
   <w:style w:type="paragraph" w:styleId="Heading3">
     <w:name w:val="heading 3"/>
     <w:uiPriority w:val="9"/>
-    <w:semiHidden/>
     <w:unhideWhenUsed/>
     <w:qFormat/>
     <w:pPr>

</xml_diff>

<commit_message>
merged 5.8 and 5.9
</commit_message>
<xml_diff>
--- a/Report/Task 05_MovingTarget_Report.docx
+++ b/Report/Task 05_MovingTarget_Report.docx
@@ -1,6 +1,6 @@
 
 <file path=word/document.xml><?xml version="1.0" encoding="utf-8"?>
-<w:document xmlns:wpc="http://schemas.microsoft.com/office/word/2010/wordprocessingCanvas" xmlns:cx="http://schemas.microsoft.com/office/drawing/2014/chartex" xmlns:cx1="http://schemas.microsoft.com/office/drawing/2015/9/8/chartex" xmlns:cx2="http://schemas.microsoft.com/office/drawing/2015/10/21/chartex" xmlns:cx3="http://schemas.microsoft.com/office/drawing/2016/5/9/chartex" xmlns:cx4="http://schemas.microsoft.com/office/drawing/2016/5/10/chartex" xmlns:cx5="http://schemas.microsoft.com/office/drawing/2016/5/11/chartex" xmlns:cx6="http://schemas.microsoft.com/office/drawing/2016/5/12/chartex" xmlns:cx7="http://schemas.microsoft.com/office/drawing/2016/5/13/chartex" xmlns:cx8="http://schemas.microsoft.com/office/drawing/2016/5/14/chartex" xmlns:mc="http://schemas.openxmlformats.org/markup-compatibility/2006" xmlns:aink="http://schemas.microsoft.com/office/drawing/2016/ink" xmlns:am3d="http://schemas.microsoft.com/office/drawing/2017/model3d" xmlns:o="urn:schemas-microsoft-com:office:office" xmlns:oel="http://schemas.microsoft.com/office/2019/extlst" xmlns:r="http://schemas.openxmlformats.org/officeDocument/2006/relationships" xmlns:m="http://schemas.openxmlformats.org/officeDocument/2006/math" xmlns:v="urn:schemas-microsoft-com:vml" xmlns:wp14="http://schemas.microsoft.com/office/word/2010/wordprocessingDrawing" xmlns:wp="http://schemas.openxmlformats.org/drawingml/2006/wordprocessingDrawing" xmlns:w10="urn:schemas-microsoft-com:office:word" xmlns:w="http://schemas.openxmlformats.org/wordprocessingml/2006/main" xmlns:w14="http://schemas.microsoft.com/office/word/2010/wordml" xmlns:w15="http://schemas.microsoft.com/office/word/2012/wordml" xmlns:w16cex="http://schemas.microsoft.com/office/word/2018/wordml/cex" xmlns:w16cid="http://schemas.microsoft.com/office/word/2016/wordml/cid" xmlns:w16="http://schemas.microsoft.com/office/word/2018/wordml" xmlns:w16du="http://schemas.microsoft.com/office/word/2023/wordml/word16du" xmlns:w16sdtdh="http://schemas.microsoft.com/office/word/2020/wordml/sdtdatahash" xmlns:w16se="http://schemas.microsoft.com/office/word/2015/wordml/symex" xmlns:wpg="http://schemas.microsoft.com/office/word/2010/wordprocessingGroup" xmlns:wpi="http://schemas.microsoft.com/office/word/2010/wordprocessingInk" xmlns:wne="http://schemas.microsoft.com/office/word/2006/wordml" xmlns:wps="http://schemas.microsoft.com/office/word/2010/wordprocessingShape" mc:Ignorable="w14 w15 w16se w16cid w16 w16cex w16sdtdh wp14">
+<w:document xmlns:wpc="http://schemas.microsoft.com/office/word/2010/wordprocessingCanvas" xmlns:cx="http://schemas.microsoft.com/office/drawing/2014/chartex" xmlns:cx1="http://schemas.microsoft.com/office/drawing/2015/9/8/chartex" xmlns:cx2="http://schemas.microsoft.com/office/drawing/2015/10/21/chartex" xmlns:cx3="http://schemas.microsoft.com/office/drawing/2016/5/9/chartex" xmlns:cx4="http://schemas.microsoft.com/office/drawing/2016/5/10/chartex" xmlns:cx5="http://schemas.microsoft.com/office/drawing/2016/5/11/chartex" xmlns:cx6="http://schemas.microsoft.com/office/drawing/2016/5/12/chartex" xmlns:cx7="http://schemas.microsoft.com/office/drawing/2016/5/13/chartex" xmlns:cx8="http://schemas.microsoft.com/office/drawing/2016/5/14/chartex" xmlns:mc="http://schemas.openxmlformats.org/markup-compatibility/2006" xmlns:aink="http://schemas.microsoft.com/office/drawing/2016/ink" xmlns:am3d="http://schemas.microsoft.com/office/drawing/2017/model3d" xmlns:o="urn:schemas-microsoft-com:office:office" xmlns:oel="http://schemas.microsoft.com/office/2019/extlst" xmlns:r="http://schemas.openxmlformats.org/officeDocument/2006/relationships" xmlns:m="http://schemas.openxmlformats.org/officeDocument/2006/math" xmlns:v="urn:schemas-microsoft-com:vml" xmlns:wp14="http://schemas.microsoft.com/office/word/2010/wordprocessingDrawing" xmlns:wp="http://schemas.openxmlformats.org/drawingml/2006/wordprocessingDrawing" xmlns:w10="urn:schemas-microsoft-com:office:word" xmlns:w="http://schemas.openxmlformats.org/wordprocessingml/2006/main" xmlns:w14="http://schemas.microsoft.com/office/word/2010/wordml" xmlns:w15="http://schemas.microsoft.com/office/word/2012/wordml" xmlns:w16cex="http://schemas.microsoft.com/office/word/2018/wordml/cex" xmlns:w16cid="http://schemas.microsoft.com/office/word/2016/wordml/cid" xmlns:w16="http://schemas.microsoft.com/office/word/2018/wordml" xmlns:w16du="http://schemas.microsoft.com/office/word/2023/wordml/word16du" xmlns:w16sdtdh="http://schemas.microsoft.com/office/word/2020/wordml/sdtdatahash" xmlns:w16sdtfl="http://schemas.microsoft.com/office/word/2024/wordml/sdtformatlock" xmlns:w16se="http://schemas.microsoft.com/office/word/2015/wordml/symex" xmlns:wpg="http://schemas.microsoft.com/office/word/2010/wordprocessingGroup" xmlns:wpi="http://schemas.microsoft.com/office/word/2010/wordprocessingInk" xmlns:wne="http://schemas.microsoft.com/office/word/2006/wordml" xmlns:wps="http://schemas.microsoft.com/office/word/2010/wordprocessingShape" mc:Ignorable="w14 w15 w16se w16cid w16 w16cex w16sdtdh w16sdtfl w16du wp14">
   <w:body>
     <w:p>
       <w:pPr>
@@ -16,10 +16,7 @@
         <w:pStyle w:val="Heading2"/>
       </w:pPr>
       <w:r>
-        <w:t>5</w:t>
-      </w:r>
-      <w:r>
-        <w:t>.</w:t>
+        <w:t>5.</w:t>
       </w:r>
       <w:r>
         <w:t>1</w:t>
@@ -263,10 +260,7 @@
       <w:bookmarkStart w:id="2" w:name="_Toc228918274"/>
       <w:r>
         <w:lastRenderedPageBreak/>
-        <w:t>5.</w:t>
-      </w:r>
-      <w:r>
-        <w:t>3 Methodology</w:t>
+        <w:t>5.3 Methodology</w:t>
       </w:r>
       <w:bookmarkEnd w:id="2"/>
     </w:p>
@@ -276,10 +270,7 @@
       </w:pPr>
       <w:bookmarkStart w:id="3" w:name="_Toc228918275"/>
       <w:r>
-        <w:t xml:space="preserve">5.3.1 </w:t>
-      </w:r>
-      <w:r>
-        <w:t xml:space="preserve">Key </w:t>
+        <w:t xml:space="preserve">5.3.1 Key </w:t>
       </w:r>
       <w:r>
         <w:t>i</w:t>
@@ -318,10 +309,7 @@
       </w:pPr>
       <w:bookmarkStart w:id="4" w:name="_Toc228918276"/>
       <w:r>
-        <w:t xml:space="preserve">5.3.2 </w:t>
-      </w:r>
-      <w:r>
-        <w:t xml:space="preserve">Step-by-Step </w:t>
+        <w:t xml:space="preserve">5.3.2 Step-by-Step </w:t>
       </w:r>
       <w:r>
         <w:t>d</w:t>
@@ -515,10 +503,7 @@
       <w:bookmarkStart w:id="5" w:name="_Toc228918277"/>
       <w:r>
         <w:lastRenderedPageBreak/>
-        <w:t>5.4</w:t>
-      </w:r>
-      <w:r>
-        <w:t xml:space="preserve"> Pseudocode</w:t>
+        <w:t>5.4 Pseudocode</w:t>
       </w:r>
       <w:bookmarkEnd w:id="5"/>
     </w:p>
@@ -840,10 +825,7 @@
       <w:bookmarkStart w:id="6" w:name="_Toc228918278"/>
       <w:r>
         <w:lastRenderedPageBreak/>
-        <w:t>5.</w:t>
-      </w:r>
-      <w:r>
-        <w:t xml:space="preserve">5 Implementation </w:t>
+        <w:t xml:space="preserve">5.5 Implementation </w:t>
       </w:r>
       <w:r>
         <w:t>c</w:t>
@@ -3797,10 +3779,7 @@
       <w:bookmarkStart w:id="7" w:name="_Toc228918279"/>
       <w:r>
         <w:lastRenderedPageBreak/>
-        <w:t>5.6</w:t>
-      </w:r>
-      <w:r>
-        <w:t xml:space="preserve"> Test </w:t>
+        <w:t xml:space="preserve">5.6 Test </w:t>
       </w:r>
       <w:r>
         <w:t>c</w:t>
@@ -3816,10 +3795,7 @@
       </w:pPr>
       <w:bookmarkStart w:id="8" w:name="_Toc228918280"/>
       <w:r>
-        <w:t>5.</w:t>
-      </w:r>
-      <w:r>
-        <w:t xml:space="preserve">6.1 Test </w:t>
+        <w:t xml:space="preserve">5.6.1 Test </w:t>
       </w:r>
       <w:r>
         <w:t>c</w:t>
@@ -4987,10 +4963,7 @@
       </w:pPr>
       <w:bookmarkStart w:id="9" w:name="_Toc228918281"/>
       <w:r>
-        <w:t>5.</w:t>
-      </w:r>
-      <w:r>
-        <w:t>6.2 Test Cases Where the Technique Fails</w:t>
+        <w:t>5.6.2 Test Cases Where the Technique Fails</w:t>
       </w:r>
       <w:bookmarkEnd w:id="9"/>
     </w:p>
@@ -5934,10 +5907,7 @@
       <w:bookmarkStart w:id="10" w:name="_Toc228918282"/>
       <w:r>
         <w:lastRenderedPageBreak/>
-        <w:t>5.</w:t>
-      </w:r>
-      <w:r>
-        <w:t xml:space="preserve">7 Complexity </w:t>
+        <w:t xml:space="preserve">5.7 Complexity </w:t>
       </w:r>
       <w:r>
         <w:t>a</w:t>
@@ -5953,10 +5923,7 @@
       </w:pPr>
       <w:bookmarkStart w:id="11" w:name="_Toc228918283"/>
       <w:r>
-        <w:t>5.</w:t>
-      </w:r>
-      <w:r>
-        <w:t xml:space="preserve">7.1 Time </w:t>
+        <w:t xml:space="preserve">5.7.1 Time </w:t>
       </w:r>
       <w:r>
         <w:t>c</w:t>
@@ -6076,10 +6043,7 @@
       </w:pPr>
       <w:bookmarkStart w:id="12" w:name="_Toc228918284"/>
       <w:r>
-        <w:t>5.</w:t>
-      </w:r>
-      <w:r>
-        <w:t xml:space="preserve">7.2 Space </w:t>
+        <w:t xml:space="preserve">5.7.2 Space </w:t>
       </w:r>
       <w:r>
         <w:t>c</w:t>
@@ -6600,6 +6564,14 @@
       </w:r>
     </w:p>
     <w:p>
+      <w:pPr>
+        <w:rPr>
+          <w:b/>
+          <w:bCs/>
+          <w:color w:val="1F3864"/>
+        </w:rPr>
+      </w:pPr>
+      <w:bookmarkStart w:id="13" w:name="_Toc228918288"/>
       <w:r>
         <w:br w:type="page"/>
       </w:r>
@@ -6608,27 +6580,115 @@
       <w:pPr>
         <w:pStyle w:val="Heading2"/>
       </w:pPr>
-      <w:bookmarkStart w:id="13" w:name="_Toc228918285"/>
       <w:r>
         <w:lastRenderedPageBreak/>
         <w:t>5.</w:t>
       </w:r>
       <w:r>
-        <w:t xml:space="preserve">8. Comparative </w:t>
-      </w:r>
-      <w:r>
-        <w:t>e</w:t>
-      </w:r>
-      <w:r>
-        <w:t xml:space="preserve">valuation of </w:t>
-      </w:r>
-      <w:r>
-        <w:t>t</w:t>
-      </w:r>
-      <w:r>
-        <w:t>echniques</w:t>
+        <w:t>8</w:t>
+      </w:r>
+      <w:r>
+        <w:t xml:space="preserve"> Alternative Approaches</w:t>
       </w:r>
       <w:bookmarkEnd w:id="13"/>
+    </w:p>
+    <w:p>
+      <w:pPr>
+        <w:pStyle w:val="Heading3"/>
+      </w:pPr>
+      <w:bookmarkStart w:id="14" w:name="_Toc228918289"/>
+      <w:r>
+        <w:t>5.</w:t>
+      </w:r>
+      <w:r>
+        <w:t>8</w:t>
+      </w:r>
+      <w:r>
+        <w:t>.1 Decrease and Conquer</w:t>
+      </w:r>
+      <w:bookmarkEnd w:id="14"/>
+    </w:p>
+    <w:p>
+      <w:pPr>
+        <w:spacing w:before="240" w:after="120" w:line="360" w:lineRule="auto"/>
+        <w:jc w:val="both"/>
+      </w:pPr>
+      <w:r>
+        <w:rPr>
+          <w:color w:val="000000"/>
+        </w:rPr>
+        <w:t>A simple approach would be to shoot spots 1, 2, 3, ..., n sequentiall</w:t>
+      </w:r>
+      <w:r>
+        <w:rPr>
+          <w:color w:val="000000"/>
+        </w:rPr>
+        <w:t>y in a linear sweep fashion</w:t>
+      </w:r>
+      <w:r>
+        <w:rPr>
+          <w:color w:val="000000"/>
+        </w:rPr>
+        <w:t>.s</w:t>
+      </w:r>
+    </w:p>
+    <w:p>
+      <w:pPr>
+        <w:pStyle w:val="Heading3"/>
+      </w:pPr>
+      <w:bookmarkStart w:id="15" w:name="_Toc228918290"/>
+      <w:r>
+        <w:t>5.</w:t>
+      </w:r>
+      <w:r>
+        <w:t>8</w:t>
+      </w:r>
+      <w:r>
+        <w:t>.2 Random Shooting</w:t>
+      </w:r>
+      <w:bookmarkEnd w:id="15"/>
+    </w:p>
+    <w:p>
+      <w:pPr>
+        <w:spacing w:before="240" w:after="120" w:line="360" w:lineRule="auto"/>
+        <w:ind w:firstLine="720"/>
+        <w:jc w:val="both"/>
+      </w:pPr>
+      <w:r>
+        <w:rPr>
+          <w:color w:val="000000"/>
+        </w:rPr>
+        <w:t>Randomly select a spot to shoot each turn. This provides no guarantee of ever hitting the target and can theoretically run indefinitely.</w:t>
+      </w:r>
+    </w:p>
+    <w:p>
+      <w:pPr>
+        <w:pStyle w:val="Heading3"/>
+      </w:pPr>
+      <w:bookmarkStart w:id="16" w:name="_Toc228918291"/>
+      <w:r>
+        <w:t>5.</w:t>
+      </w:r>
+      <w:r>
+        <w:t>8</w:t>
+      </w:r>
+      <w:r>
+        <w:t>.3 Brute Force / Exhaustive Search</w:t>
+      </w:r>
+      <w:bookmarkEnd w:id="16"/>
+    </w:p>
+    <w:p>
+      <w:pPr>
+        <w:spacing w:before="240" w:after="120" w:line="360" w:lineRule="auto"/>
+        <w:ind w:firstLine="720"/>
+        <w:jc w:val="both"/>
+      </w:pPr>
+      <w:r>
+        <w:rPr>
+          <w:color w:val="000000"/>
+        </w:rPr>
+        <w:t>Try all possible shooting sequences of length k and check which one guarantees a hit. This is factorial in complexity — O(n!) — and completely impractical for large n.</w:t>
+      </w:r>
     </w:p>
     <w:p>
       <w:pPr>
@@ -6738,27 +6798,7 @@
                 <w:sz w:val="20"/>
                 <w:szCs w:val="20"/>
               </w:rPr>
-              <w:t>D&amp;C (</w:t>
-            </w:r>
-            <w:r>
-              <w:rPr>
-                <w:b/>
-                <w:bCs/>
-                <w:color w:val="FFFFFF"/>
-                <w:sz w:val="20"/>
-                <w:szCs w:val="20"/>
-              </w:rPr>
-              <w:t>Used</w:t>
-            </w:r>
-            <w:r>
-              <w:rPr>
-                <w:b/>
-                <w:bCs/>
-                <w:color w:val="FFFFFF"/>
-                <w:sz w:val="20"/>
-                <w:szCs w:val="20"/>
-              </w:rPr>
-              <w:t xml:space="preserve"> Approach)</w:t>
+              <w:t>D&amp;C (Used Approach)</w:t>
             </w:r>
           </w:p>
         </w:tc>
@@ -7681,38 +7721,17 @@
       <w:pPr>
         <w:pStyle w:val="Heading3"/>
       </w:pPr>
-      <w:bookmarkStart w:id="14" w:name="_Toc228918286"/>
-      <w:r>
-        <w:t>5.</w:t>
-      </w:r>
-      <w:r>
-        <w:t xml:space="preserve">8.1 </w:t>
-      </w:r>
-      <w:r>
-        <w:t>Advantages</w:t>
-      </w:r>
-      <w:r>
-        <w:t xml:space="preserve"> of Divide and Conquer </w:t>
-      </w:r>
-      <w:r>
-        <w:t>o</w:t>
-      </w:r>
-      <w:r>
-        <w:t xml:space="preserve">ver </w:t>
-      </w:r>
-      <w:r>
-        <w:t>o</w:t>
-      </w:r>
-      <w:r>
-        <w:t xml:space="preserve">ther </w:t>
-      </w:r>
-      <w:r>
-        <w:t>t</w:t>
-      </w:r>
-      <w:r>
-        <w:t>echniques</w:t>
-      </w:r>
-      <w:bookmarkEnd w:id="14"/>
+      <w:bookmarkStart w:id="17" w:name="_Toc228918286"/>
+      <w:r>
+        <w:t>5.8.</w:t>
+      </w:r>
+      <w:r>
+        <w:t>4</w:t>
+      </w:r>
+      <w:r>
+        <w:t xml:space="preserve"> Advantages of Divide and Conquer over other techniques</w:t>
+      </w:r>
+      <w:bookmarkEnd w:id="17"/>
     </w:p>
     <w:p>
       <w:pPr>
@@ -7803,20 +7822,17 @@
       <w:pPr>
         <w:pStyle w:val="Heading3"/>
       </w:pPr>
-      <w:bookmarkStart w:id="15" w:name="_Toc228918287"/>
-      <w:r>
-        <w:t>5.</w:t>
-      </w:r>
-      <w:r>
-        <w:t xml:space="preserve">8.2 </w:t>
-      </w:r>
-      <w:r>
-        <w:t>Disadvantages</w:t>
-      </w:r>
-      <w:r>
-        <w:t xml:space="preserve"> of Divide and Conquer</w:t>
-      </w:r>
-      <w:bookmarkEnd w:id="15"/>
+      <w:bookmarkStart w:id="18" w:name="_Toc228918287"/>
+      <w:r>
+        <w:t>5.8.</w:t>
+      </w:r>
+      <w:r>
+        <w:t>5</w:t>
+      </w:r>
+      <w:r>
+        <w:t xml:space="preserve"> Disadvantages of Divide and Conquer</w:t>
+      </w:r>
+      <w:bookmarkEnd w:id="18"/>
     </w:p>
     <w:p>
       <w:pPr>
@@ -7866,194 +7882,52 @@
         <w:rPr>
           <w:color w:val="000000"/>
         </w:rPr>
+        <w:lastRenderedPageBreak/>
         <w:t>It is prone to stack overflow error due to the use of recursion.</w:t>
       </w:r>
     </w:p>
     <w:p>
-      <w:r>
-        <w:br w:type="page"/>
-      </w:r>
-    </w:p>
-    <w:p>
-      <w:pPr>
-        <w:pStyle w:val="Heading2"/>
-      </w:pPr>
-      <w:bookmarkStart w:id="16" w:name="_Toc228918288"/>
-      <w:r>
-        <w:lastRenderedPageBreak/>
+      <w:pPr>
+        <w:pStyle w:val="Heading3"/>
+      </w:pPr>
+      <w:bookmarkStart w:id="19" w:name="_Toc228918293"/>
+      <w:r>
         <w:t>5.</w:t>
       </w:r>
       <w:r>
-        <w:t>9. Alternative Approaches</w:t>
-      </w:r>
-      <w:bookmarkEnd w:id="16"/>
-    </w:p>
-    <w:p>
-      <w:pPr>
-        <w:pStyle w:val="Heading3"/>
-      </w:pPr>
-      <w:bookmarkStart w:id="17" w:name="_Toc228918289"/>
-      <w:r>
-        <w:t>5.</w:t>
-      </w:r>
-      <w:r>
-        <w:t>9.1 Decrease and Conquer</w:t>
-      </w:r>
-      <w:bookmarkEnd w:id="17"/>
-    </w:p>
-    <w:p>
-      <w:pPr>
-        <w:spacing w:before="240" w:after="120" w:line="360" w:lineRule="auto"/>
-        <w:jc w:val="both"/>
-      </w:pPr>
-      <w:r>
-        <w:rPr>
-          <w:color w:val="000000"/>
-        </w:rPr>
-        <w:t>A simple approach would be to shoot spots 1, 2, 3, ..., n sequentiall</w:t>
-      </w:r>
-      <w:r>
-        <w:rPr>
-          <w:color w:val="000000"/>
-        </w:rPr>
-        <w:t>y in a linear sweep fashion</w:t>
-      </w:r>
-      <w:r>
-        <w:rPr>
-          <w:color w:val="000000"/>
-        </w:rPr>
-        <w:t>.s</w:t>
-      </w:r>
-    </w:p>
-    <w:p>
-      <w:pPr>
-        <w:pStyle w:val="Heading3"/>
-      </w:pPr>
-      <w:bookmarkStart w:id="18" w:name="_Toc228918290"/>
-      <w:r>
-        <w:t>5.</w:t>
-      </w:r>
-      <w:r>
-        <w:t>9.2 Random Shooting</w:t>
-      </w:r>
-      <w:bookmarkEnd w:id="18"/>
-    </w:p>
-    <w:p>
-      <w:pPr>
-        <w:spacing w:before="240" w:after="120" w:line="360" w:lineRule="auto"/>
-        <w:ind w:firstLine="720"/>
-        <w:jc w:val="both"/>
-      </w:pPr>
-      <w:r>
-        <w:rPr>
-          <w:color w:val="000000"/>
-        </w:rPr>
-        <w:t>Randomly select a spot to shoot each turn. This provides no guarantee of ever hitting the target and can theoretically run indefinitely.</w:t>
-      </w:r>
-    </w:p>
-    <w:p>
-      <w:pPr>
-        <w:pStyle w:val="Heading3"/>
-      </w:pPr>
-      <w:bookmarkStart w:id="19" w:name="_Toc228918291"/>
-      <w:r>
-        <w:t>5.</w:t>
-      </w:r>
-      <w:r>
-        <w:t>9.3 Brute Force / Exhaustive Search</w:t>
+        <w:t>8.</w:t>
+      </w:r>
+      <w:r>
+        <w:t>6</w:t>
+      </w:r>
+      <w:r>
+        <w:t xml:space="preserve"> Possible </w:t>
+      </w:r>
+      <w:r>
+        <w:t>i</w:t>
+      </w:r>
+      <w:r>
+        <w:t>mprovements to the Divide</w:t>
+      </w:r>
+      <w:r>
+        <w:t>-</w:t>
+      </w:r>
+      <w:r>
+        <w:t>and</w:t>
+      </w:r>
+      <w:r>
+        <w:t>-</w:t>
+      </w:r>
+      <w:r>
+        <w:t xml:space="preserve">Conquer </w:t>
+      </w:r>
+      <w:r>
+        <w:t>t</w:t>
+      </w:r>
+      <w:r>
+        <w:t>echnique</w:t>
       </w:r>
       <w:bookmarkEnd w:id="19"/>
-    </w:p>
-    <w:p>
-      <w:pPr>
-        <w:spacing w:before="240" w:after="120" w:line="360" w:lineRule="auto"/>
-        <w:ind w:firstLine="720"/>
-        <w:jc w:val="both"/>
-      </w:pPr>
-      <w:r>
-        <w:rPr>
-          <w:color w:val="000000"/>
-        </w:rPr>
-        <w:t>Try all possible shooting sequences of length k and check which one guarantees a hit. This is factorial in complexity — O(n!) — and completely impractical for large n.</w:t>
-      </w:r>
-    </w:p>
-    <w:p>
-      <w:pPr>
-        <w:pStyle w:val="Heading3"/>
-      </w:pPr>
-      <w:bookmarkStart w:id="20" w:name="_Toc228918292"/>
-      <w:r>
-        <w:t>5.</w:t>
-      </w:r>
-      <w:r>
-        <w:t>9.4 Dynamic Programming</w:t>
-      </w:r>
-      <w:bookmarkEnd w:id="20"/>
-    </w:p>
-    <w:p>
-      <w:pPr>
-        <w:spacing w:before="240" w:after="120" w:line="360" w:lineRule="auto"/>
-        <w:ind w:firstLine="720"/>
-        <w:jc w:val="both"/>
-        <w:rPr>
-          <w:color w:val="000000"/>
-        </w:rPr>
-      </w:pPr>
-      <w:r>
-        <w:rPr>
-          <w:color w:val="000000"/>
-        </w:rPr>
-        <w:t xml:space="preserve">One could model the state as (shot_number, possible_positions_of_target) and use a DP table to compute the minimum guaranteed shooting sequence. While theoretically sound, this approach has higher space complexity — O(n²) — and is not simpler than the D&amp;C solution for this </w:t>
-      </w:r>
-      <w:r>
-        <w:rPr>
-          <w:color w:val="000000"/>
-        </w:rPr>
-        <w:t>problem</w:t>
-      </w:r>
-      <w:r>
-        <w:rPr>
-          <w:color w:val="000000"/>
-        </w:rPr>
-        <w:t>.</w:t>
-      </w:r>
-    </w:p>
-    <w:p>
-      <w:pPr>
-        <w:pStyle w:val="Heading3"/>
-      </w:pPr>
-      <w:bookmarkStart w:id="21" w:name="_Toc228918293"/>
-      <w:r>
-        <w:t>5.</w:t>
-      </w:r>
-      <w:r>
-        <w:t xml:space="preserve">9.5 Possible </w:t>
-      </w:r>
-      <w:r>
-        <w:t>i</w:t>
-      </w:r>
-      <w:r>
-        <w:t>mprovements to the Divide</w:t>
-      </w:r>
-      <w:r>
-        <w:t>-</w:t>
-      </w:r>
-      <w:r>
-        <w:t>and</w:t>
-      </w:r>
-      <w:r>
-        <w:t>-</w:t>
-      </w:r>
-      <w:r>
-        <w:t xml:space="preserve">Conquer </w:t>
-      </w:r>
-      <w:r>
-        <w:t>t</w:t>
-      </w:r>
-      <w:r>
-        <w:t>echnique</w:t>
-      </w:r>
-      <w:bookmarkEnd w:id="21"/>
     </w:p>
     <w:p>
       <w:pPr>
@@ -8491,13 +8365,16 @@
       <w:pPr>
         <w:pStyle w:val="Heading2"/>
       </w:pPr>
-      <w:bookmarkStart w:id="22" w:name="_Toc228918294"/>
+      <w:bookmarkStart w:id="20" w:name="_Toc228918294"/>
       <w:r>
         <w:lastRenderedPageBreak/>
         <w:t>5.</w:t>
       </w:r>
       <w:r>
-        <w:t xml:space="preserve">10 Sample </w:t>
+        <w:t>9</w:t>
+      </w:r>
+      <w:r>
+        <w:t xml:space="preserve"> Sample </w:t>
       </w:r>
       <w:r>
         <w:t>o</w:t>
@@ -8505,18 +8382,21 @@
       <w:r>
         <w:t>utputs</w:t>
       </w:r>
-      <w:bookmarkEnd w:id="22"/>
+      <w:bookmarkEnd w:id="20"/>
     </w:p>
     <w:p>
       <w:pPr>
         <w:pStyle w:val="Heading3"/>
       </w:pPr>
-      <w:bookmarkStart w:id="23" w:name="_Toc228918295"/>
+      <w:bookmarkStart w:id="21" w:name="_Toc228918295"/>
       <w:r>
         <w:t>5.</w:t>
       </w:r>
       <w:r>
-        <w:t xml:space="preserve">10.1 Sample </w:t>
+        <w:t>9</w:t>
+      </w:r>
+      <w:r>
+        <w:t xml:space="preserve">.1 Sample </w:t>
       </w:r>
       <w:r>
         <w:t>o</w:t>
@@ -8524,7 +8404,7 @@
       <w:r>
         <w:t>utput for n = 4</w:t>
       </w:r>
-      <w:bookmarkEnd w:id="23"/>
+      <w:bookmarkEnd w:id="21"/>
     </w:p>
     <w:p>
       <w:pPr>
@@ -8668,12 +8548,15 @@
       <w:pPr>
         <w:pStyle w:val="Heading3"/>
       </w:pPr>
-      <w:bookmarkStart w:id="24" w:name="_Toc228918296"/>
+      <w:bookmarkStart w:id="22" w:name="_Toc228918296"/>
       <w:r>
         <w:t>5.</w:t>
       </w:r>
       <w:r>
-        <w:t xml:space="preserve">10.2 Sample </w:t>
+        <w:t>9</w:t>
+      </w:r>
+      <w:r>
+        <w:t xml:space="preserve">.2 Sample </w:t>
       </w:r>
       <w:r>
         <w:t>o</w:t>
@@ -8681,7 +8564,7 @@
       <w:r>
         <w:t>utput for n = 5</w:t>
       </w:r>
-      <w:bookmarkEnd w:id="24"/>
+      <w:bookmarkEnd w:id="22"/>
     </w:p>
     <w:p>
       <w:pPr>
@@ -8806,14 +8689,17 @@
       <w:pPr>
         <w:pStyle w:val="Heading3"/>
       </w:pPr>
-      <w:bookmarkStart w:id="25" w:name="_Toc228918297"/>
+      <w:bookmarkStart w:id="23" w:name="_Toc228918297"/>
       <w:r>
         <w:t>5.</w:t>
       </w:r>
       <w:r>
-        <w:t>10.3 Sample Output for n = 8</w:t>
-      </w:r>
-      <w:bookmarkEnd w:id="25"/>
+        <w:t>9</w:t>
+      </w:r>
+      <w:r>
+        <w:t>.3 Sample Output for n = 8</w:t>
+      </w:r>
+      <w:bookmarkEnd w:id="23"/>
     </w:p>
     <w:p>
       <w:pPr>
@@ -8943,13 +8829,16 @@
       <w:pPr>
         <w:pStyle w:val="Heading2"/>
       </w:pPr>
-      <w:bookmarkStart w:id="26" w:name="_Toc228918298"/>
+      <w:bookmarkStart w:id="24" w:name="_Toc228918298"/>
       <w:r>
         <w:lastRenderedPageBreak/>
         <w:t>5.</w:t>
       </w:r>
       <w:r>
-        <w:t xml:space="preserve">11 Summary and </w:t>
+        <w:t>10</w:t>
+      </w:r>
+      <w:r>
+        <w:t xml:space="preserve"> Summary and </w:t>
       </w:r>
       <w:r>
         <w:t>k</w:t>
@@ -8963,7 +8852,7 @@
       <w:r>
         <w:t>indings</w:t>
       </w:r>
-      <w:bookmarkEnd w:id="26"/>
+      <w:bookmarkEnd w:id="24"/>
     </w:p>
     <w:p>
       <w:pPr>
@@ -9130,7 +9019,7 @@
 </file>
 
 <file path=word/endnotes.xml><?xml version="1.0" encoding="utf-8"?>
-<w:endnotes xmlns:wpc="http://schemas.microsoft.com/office/word/2010/wordprocessingCanvas" xmlns:cx="http://schemas.microsoft.com/office/drawing/2014/chartex" xmlns:cx1="http://schemas.microsoft.com/office/drawing/2015/9/8/chartex" xmlns:cx2="http://schemas.microsoft.com/office/drawing/2015/10/21/chartex" xmlns:cx3="http://schemas.microsoft.com/office/drawing/2016/5/9/chartex" xmlns:cx4="http://schemas.microsoft.com/office/drawing/2016/5/10/chartex" xmlns:cx5="http://schemas.microsoft.com/office/drawing/2016/5/11/chartex" xmlns:cx6="http://schemas.microsoft.com/office/drawing/2016/5/12/chartex" xmlns:cx7="http://schemas.microsoft.com/office/drawing/2016/5/13/chartex" xmlns:cx8="http://schemas.microsoft.com/office/drawing/2016/5/14/chartex" xmlns:mc="http://schemas.openxmlformats.org/markup-compatibility/2006" xmlns:aink="http://schemas.microsoft.com/office/drawing/2016/ink" xmlns:am3d="http://schemas.microsoft.com/office/drawing/2017/model3d" xmlns:o="urn:schemas-microsoft-com:office:office" xmlns:oel="http://schemas.microsoft.com/office/2019/extlst" xmlns:r="http://schemas.openxmlformats.org/officeDocument/2006/relationships" xmlns:m="http://schemas.openxmlformats.org/officeDocument/2006/math" xmlns:v="urn:schemas-microsoft-com:vml" xmlns:wp14="http://schemas.microsoft.com/office/word/2010/wordprocessingDrawing" xmlns:wp="http://schemas.openxmlformats.org/drawingml/2006/wordprocessingDrawing" xmlns:w10="urn:schemas-microsoft-com:office:word" xmlns:w="http://schemas.openxmlformats.org/wordprocessingml/2006/main" xmlns:w14="http://schemas.microsoft.com/office/word/2010/wordml" xmlns:w15="http://schemas.microsoft.com/office/word/2012/wordml" xmlns:w16cex="http://schemas.microsoft.com/office/word/2018/wordml/cex" xmlns:w16cid="http://schemas.microsoft.com/office/word/2016/wordml/cid" xmlns:w16="http://schemas.microsoft.com/office/word/2018/wordml" xmlns:w16du="http://schemas.microsoft.com/office/word/2023/wordml/word16du" xmlns:w16sdtdh="http://schemas.microsoft.com/office/word/2020/wordml/sdtdatahash" xmlns:w16se="http://schemas.microsoft.com/office/word/2015/wordml/symex" xmlns:wpg="http://schemas.microsoft.com/office/word/2010/wordprocessingGroup" xmlns:wpi="http://schemas.microsoft.com/office/word/2010/wordprocessingInk" xmlns:wne="http://schemas.microsoft.com/office/word/2006/wordml" xmlns:wps="http://schemas.microsoft.com/office/word/2010/wordprocessingShape" mc:Ignorable="w14 w15 w16se w16cid w16 w16cex w16sdtdh wp14">
+<w:endnotes xmlns:wpc="http://schemas.microsoft.com/office/word/2010/wordprocessingCanvas" xmlns:cx="http://schemas.microsoft.com/office/drawing/2014/chartex" xmlns:cx1="http://schemas.microsoft.com/office/drawing/2015/9/8/chartex" xmlns:cx2="http://schemas.microsoft.com/office/drawing/2015/10/21/chartex" xmlns:cx3="http://schemas.microsoft.com/office/drawing/2016/5/9/chartex" xmlns:cx4="http://schemas.microsoft.com/office/drawing/2016/5/10/chartex" xmlns:cx5="http://schemas.microsoft.com/office/drawing/2016/5/11/chartex" xmlns:cx6="http://schemas.microsoft.com/office/drawing/2016/5/12/chartex" xmlns:cx7="http://schemas.microsoft.com/office/drawing/2016/5/13/chartex" xmlns:cx8="http://schemas.microsoft.com/office/drawing/2016/5/14/chartex" xmlns:mc="http://schemas.openxmlformats.org/markup-compatibility/2006" xmlns:aink="http://schemas.microsoft.com/office/drawing/2016/ink" xmlns:am3d="http://schemas.microsoft.com/office/drawing/2017/model3d" xmlns:o="urn:schemas-microsoft-com:office:office" xmlns:oel="http://schemas.microsoft.com/office/2019/extlst" xmlns:r="http://schemas.openxmlformats.org/officeDocument/2006/relationships" xmlns:m="http://schemas.openxmlformats.org/officeDocument/2006/math" xmlns:v="urn:schemas-microsoft-com:vml" xmlns:wp14="http://schemas.microsoft.com/office/word/2010/wordprocessingDrawing" xmlns:wp="http://schemas.openxmlformats.org/drawingml/2006/wordprocessingDrawing" xmlns:w10="urn:schemas-microsoft-com:office:word" xmlns:w="http://schemas.openxmlformats.org/wordprocessingml/2006/main" xmlns:w14="http://schemas.microsoft.com/office/word/2010/wordml" xmlns:w15="http://schemas.microsoft.com/office/word/2012/wordml" xmlns:w16cex="http://schemas.microsoft.com/office/word/2018/wordml/cex" xmlns:w16cid="http://schemas.microsoft.com/office/word/2016/wordml/cid" xmlns:w16="http://schemas.microsoft.com/office/word/2018/wordml" xmlns:w16du="http://schemas.microsoft.com/office/word/2023/wordml/word16du" xmlns:w16sdtdh="http://schemas.microsoft.com/office/word/2020/wordml/sdtdatahash" xmlns:w16sdtfl="http://schemas.microsoft.com/office/word/2024/wordml/sdtformatlock" xmlns:w16se="http://schemas.microsoft.com/office/word/2015/wordml/symex" xmlns:wpg="http://schemas.microsoft.com/office/word/2010/wordprocessingGroup" xmlns:wpi="http://schemas.microsoft.com/office/word/2010/wordprocessingInk" xmlns:wne="http://schemas.microsoft.com/office/word/2006/wordml" xmlns:wps="http://schemas.microsoft.com/office/word/2010/wordprocessingShape" mc:Ignorable="w14 w15 w16se w16cid w16 w16cex w16sdtdh w16sdtfl w16du wp14">
   <w:endnote w:type="separator" w:id="-1">
     <w:p>
       <w:r>
@@ -9149,7 +9038,7 @@
 </file>
 
 <file path=word/footer1.xml><?xml version="1.0" encoding="utf-8"?>
-<w:ftr xmlns:wpc="http://schemas.microsoft.com/office/word/2010/wordprocessingCanvas" xmlns:cx="http://schemas.microsoft.com/office/drawing/2014/chartex" xmlns:cx1="http://schemas.microsoft.com/office/drawing/2015/9/8/chartex" xmlns:cx2="http://schemas.microsoft.com/office/drawing/2015/10/21/chartex" xmlns:cx3="http://schemas.microsoft.com/office/drawing/2016/5/9/chartex" xmlns:cx4="http://schemas.microsoft.com/office/drawing/2016/5/10/chartex" xmlns:cx5="http://schemas.microsoft.com/office/drawing/2016/5/11/chartex" xmlns:cx6="http://schemas.microsoft.com/office/drawing/2016/5/12/chartex" xmlns:cx7="http://schemas.microsoft.com/office/drawing/2016/5/13/chartex" xmlns:cx8="http://schemas.microsoft.com/office/drawing/2016/5/14/chartex" xmlns:mc="http://schemas.openxmlformats.org/markup-compatibility/2006" xmlns:aink="http://schemas.microsoft.com/office/drawing/2016/ink" xmlns:am3d="http://schemas.microsoft.com/office/drawing/2017/model3d" xmlns:o="urn:schemas-microsoft-com:office:office" xmlns:oel="http://schemas.microsoft.com/office/2019/extlst" xmlns:r="http://schemas.openxmlformats.org/officeDocument/2006/relationships" xmlns:m="http://schemas.openxmlformats.org/officeDocument/2006/math" xmlns:v="urn:schemas-microsoft-com:vml" xmlns:wp14="http://schemas.microsoft.com/office/word/2010/wordprocessingDrawing" xmlns:wp="http://schemas.openxmlformats.org/drawingml/2006/wordprocessingDrawing" xmlns:w10="urn:schemas-microsoft-com:office:word" xmlns:w="http://schemas.openxmlformats.org/wordprocessingml/2006/main" xmlns:w14="http://schemas.microsoft.com/office/word/2010/wordml" xmlns:w15="http://schemas.microsoft.com/office/word/2012/wordml" xmlns:w16cex="http://schemas.microsoft.com/office/word/2018/wordml/cex" xmlns:w16cid="http://schemas.microsoft.com/office/word/2016/wordml/cid" xmlns:w16="http://schemas.microsoft.com/office/word/2018/wordml" xmlns:w16du="http://schemas.microsoft.com/office/word/2023/wordml/word16du" xmlns:w16sdtdh="http://schemas.microsoft.com/office/word/2020/wordml/sdtdatahash" xmlns:w16se="http://schemas.microsoft.com/office/word/2015/wordml/symex" xmlns:wpg="http://schemas.microsoft.com/office/word/2010/wordprocessingGroup" xmlns:wpi="http://schemas.microsoft.com/office/word/2010/wordprocessingInk" xmlns:wne="http://schemas.microsoft.com/office/word/2006/wordml" xmlns:wps="http://schemas.microsoft.com/office/word/2010/wordprocessingShape" mc:Ignorable="w14 w15 w16se w16cid w16 w16cex w16sdtdh wp14">
+<w:ftr xmlns:wpc="http://schemas.microsoft.com/office/word/2010/wordprocessingCanvas" xmlns:cx="http://schemas.microsoft.com/office/drawing/2014/chartex" xmlns:cx1="http://schemas.microsoft.com/office/drawing/2015/9/8/chartex" xmlns:cx2="http://schemas.microsoft.com/office/drawing/2015/10/21/chartex" xmlns:cx3="http://schemas.microsoft.com/office/drawing/2016/5/9/chartex" xmlns:cx4="http://schemas.microsoft.com/office/drawing/2016/5/10/chartex" xmlns:cx5="http://schemas.microsoft.com/office/drawing/2016/5/11/chartex" xmlns:cx6="http://schemas.microsoft.com/office/drawing/2016/5/12/chartex" xmlns:cx7="http://schemas.microsoft.com/office/drawing/2016/5/13/chartex" xmlns:cx8="http://schemas.microsoft.com/office/drawing/2016/5/14/chartex" xmlns:mc="http://schemas.openxmlformats.org/markup-compatibility/2006" xmlns:aink="http://schemas.microsoft.com/office/drawing/2016/ink" xmlns:am3d="http://schemas.microsoft.com/office/drawing/2017/model3d" xmlns:o="urn:schemas-microsoft-com:office:office" xmlns:oel="http://schemas.microsoft.com/office/2019/extlst" xmlns:r="http://schemas.openxmlformats.org/officeDocument/2006/relationships" xmlns:m="http://schemas.openxmlformats.org/officeDocument/2006/math" xmlns:v="urn:schemas-microsoft-com:vml" xmlns:wp14="http://schemas.microsoft.com/office/word/2010/wordprocessingDrawing" xmlns:wp="http://schemas.openxmlformats.org/drawingml/2006/wordprocessingDrawing" xmlns:w10="urn:schemas-microsoft-com:office:word" xmlns:w="http://schemas.openxmlformats.org/wordprocessingml/2006/main" xmlns:w14="http://schemas.microsoft.com/office/word/2010/wordml" xmlns:w15="http://schemas.microsoft.com/office/word/2012/wordml" xmlns:w16cex="http://schemas.microsoft.com/office/word/2018/wordml/cex" xmlns:w16cid="http://schemas.microsoft.com/office/word/2016/wordml/cid" xmlns:w16="http://schemas.microsoft.com/office/word/2018/wordml" xmlns:w16du="http://schemas.microsoft.com/office/word/2023/wordml/word16du" xmlns:w16sdtdh="http://schemas.microsoft.com/office/word/2020/wordml/sdtdatahash" xmlns:w16sdtfl="http://schemas.microsoft.com/office/word/2024/wordml/sdtformatlock" xmlns:w16se="http://schemas.microsoft.com/office/word/2015/wordml/symex" xmlns:wpg="http://schemas.microsoft.com/office/word/2010/wordprocessingGroup" xmlns:wpi="http://schemas.microsoft.com/office/word/2010/wordprocessingInk" xmlns:wne="http://schemas.microsoft.com/office/word/2006/wordml" xmlns:wps="http://schemas.microsoft.com/office/word/2010/wordprocessingShape" mc:Ignorable="w14 w15 w16se w16cid w16 w16cex w16sdtdh w16sdtfl w16du wp14">
   <w:p>
     <w:pPr>
       <w:pBdr>
@@ -9162,7 +9051,7 @@
 </file>
 
 <file path=word/footnotes.xml><?xml version="1.0" encoding="utf-8"?>
-<w:footnotes xmlns:wpc="http://schemas.microsoft.com/office/word/2010/wordprocessingCanvas" xmlns:cx="http://schemas.microsoft.com/office/drawing/2014/chartex" xmlns:cx1="http://schemas.microsoft.com/office/drawing/2015/9/8/chartex" xmlns:cx2="http://schemas.microsoft.com/office/drawing/2015/10/21/chartex" xmlns:cx3="http://schemas.microsoft.com/office/drawing/2016/5/9/chartex" xmlns:cx4="http://schemas.microsoft.com/office/drawing/2016/5/10/chartex" xmlns:cx5="http://schemas.microsoft.com/office/drawing/2016/5/11/chartex" xmlns:cx6="http://schemas.microsoft.com/office/drawing/2016/5/12/chartex" xmlns:cx7="http://schemas.microsoft.com/office/drawing/2016/5/13/chartex" xmlns:cx8="http://schemas.microsoft.com/office/drawing/2016/5/14/chartex" xmlns:mc="http://schemas.openxmlformats.org/markup-compatibility/2006" xmlns:aink="http://schemas.microsoft.com/office/drawing/2016/ink" xmlns:am3d="http://schemas.microsoft.com/office/drawing/2017/model3d" xmlns:o="urn:schemas-microsoft-com:office:office" xmlns:oel="http://schemas.microsoft.com/office/2019/extlst" xmlns:r="http://schemas.openxmlformats.org/officeDocument/2006/relationships" xmlns:m="http://schemas.openxmlformats.org/officeDocument/2006/math" xmlns:v="urn:schemas-microsoft-com:vml" xmlns:wp14="http://schemas.microsoft.com/office/word/2010/wordprocessingDrawing" xmlns:wp="http://schemas.openxmlformats.org/drawingml/2006/wordprocessingDrawing" xmlns:w10="urn:schemas-microsoft-com:office:word" xmlns:w="http://schemas.openxmlformats.org/wordprocessingml/2006/main" xmlns:w14="http://schemas.microsoft.com/office/word/2010/wordml" xmlns:w15="http://schemas.microsoft.com/office/word/2012/wordml" xmlns:w16cex="http://schemas.microsoft.com/office/word/2018/wordml/cex" xmlns:w16cid="http://schemas.microsoft.com/office/word/2016/wordml/cid" xmlns:w16="http://schemas.microsoft.com/office/word/2018/wordml" xmlns:w16du="http://schemas.microsoft.com/office/word/2023/wordml/word16du" xmlns:w16sdtdh="http://schemas.microsoft.com/office/word/2020/wordml/sdtdatahash" xmlns:w16se="http://schemas.microsoft.com/office/word/2015/wordml/symex" xmlns:wpg="http://schemas.microsoft.com/office/word/2010/wordprocessingGroup" xmlns:wpi="http://schemas.microsoft.com/office/word/2010/wordprocessingInk" xmlns:wne="http://schemas.microsoft.com/office/word/2006/wordml" xmlns:wps="http://schemas.microsoft.com/office/word/2010/wordprocessingShape" mc:Ignorable="w14 w15 w16se w16cid w16 w16cex w16sdtdh wp14">
+<w:footnotes xmlns:wpc="http://schemas.microsoft.com/office/word/2010/wordprocessingCanvas" xmlns:cx="http://schemas.microsoft.com/office/drawing/2014/chartex" xmlns:cx1="http://schemas.microsoft.com/office/drawing/2015/9/8/chartex" xmlns:cx2="http://schemas.microsoft.com/office/drawing/2015/10/21/chartex" xmlns:cx3="http://schemas.microsoft.com/office/drawing/2016/5/9/chartex" xmlns:cx4="http://schemas.microsoft.com/office/drawing/2016/5/10/chartex" xmlns:cx5="http://schemas.microsoft.com/office/drawing/2016/5/11/chartex" xmlns:cx6="http://schemas.microsoft.com/office/drawing/2016/5/12/chartex" xmlns:cx7="http://schemas.microsoft.com/office/drawing/2016/5/13/chartex" xmlns:cx8="http://schemas.microsoft.com/office/drawing/2016/5/14/chartex" xmlns:mc="http://schemas.openxmlformats.org/markup-compatibility/2006" xmlns:aink="http://schemas.microsoft.com/office/drawing/2016/ink" xmlns:am3d="http://schemas.microsoft.com/office/drawing/2017/model3d" xmlns:o="urn:schemas-microsoft-com:office:office" xmlns:oel="http://schemas.microsoft.com/office/2019/extlst" xmlns:r="http://schemas.openxmlformats.org/officeDocument/2006/relationships" xmlns:m="http://schemas.openxmlformats.org/officeDocument/2006/math" xmlns:v="urn:schemas-microsoft-com:vml" xmlns:wp14="http://schemas.microsoft.com/office/word/2010/wordprocessingDrawing" xmlns:wp="http://schemas.openxmlformats.org/drawingml/2006/wordprocessingDrawing" xmlns:w10="urn:schemas-microsoft-com:office:word" xmlns:w="http://schemas.openxmlformats.org/wordprocessingml/2006/main" xmlns:w14="http://schemas.microsoft.com/office/word/2010/wordml" xmlns:w15="http://schemas.microsoft.com/office/word/2012/wordml" xmlns:w16cex="http://schemas.microsoft.com/office/word/2018/wordml/cex" xmlns:w16cid="http://schemas.microsoft.com/office/word/2016/wordml/cid" xmlns:w16="http://schemas.microsoft.com/office/word/2018/wordml" xmlns:w16du="http://schemas.microsoft.com/office/word/2023/wordml/word16du" xmlns:w16sdtdh="http://schemas.microsoft.com/office/word/2020/wordml/sdtdatahash" xmlns:w16sdtfl="http://schemas.microsoft.com/office/word/2024/wordml/sdtformatlock" xmlns:w16se="http://schemas.microsoft.com/office/word/2015/wordml/symex" xmlns:wpg="http://schemas.microsoft.com/office/word/2010/wordprocessingGroup" xmlns:wpi="http://schemas.microsoft.com/office/word/2010/wordprocessingInk" xmlns:wne="http://schemas.microsoft.com/office/word/2006/wordml" xmlns:wps="http://schemas.microsoft.com/office/word/2010/wordprocessingShape" mc:Ignorable="w14 w15 w16se w16cid w16 w16cex w16sdtdh w16sdtfl w16du wp14">
   <w:footnote w:type="separator" w:id="-1">
     <w:p>
       <w:r>
@@ -9181,7 +9070,7 @@
 </file>
 
 <file path=word/header1.xml><?xml version="1.0" encoding="utf-8"?>
-<w:hdr xmlns:wpc="http://schemas.microsoft.com/office/word/2010/wordprocessingCanvas" xmlns:cx="http://schemas.microsoft.com/office/drawing/2014/chartex" xmlns:cx1="http://schemas.microsoft.com/office/drawing/2015/9/8/chartex" xmlns:cx2="http://schemas.microsoft.com/office/drawing/2015/10/21/chartex" xmlns:cx3="http://schemas.microsoft.com/office/drawing/2016/5/9/chartex" xmlns:cx4="http://schemas.microsoft.com/office/drawing/2016/5/10/chartex" xmlns:cx5="http://schemas.microsoft.com/office/drawing/2016/5/11/chartex" xmlns:cx6="http://schemas.microsoft.com/office/drawing/2016/5/12/chartex" xmlns:cx7="http://schemas.microsoft.com/office/drawing/2016/5/13/chartex" xmlns:cx8="http://schemas.microsoft.com/office/drawing/2016/5/14/chartex" xmlns:mc="http://schemas.openxmlformats.org/markup-compatibility/2006" xmlns:aink="http://schemas.microsoft.com/office/drawing/2016/ink" xmlns:am3d="http://schemas.microsoft.com/office/drawing/2017/model3d" xmlns:o="urn:schemas-microsoft-com:office:office" xmlns:oel="http://schemas.microsoft.com/office/2019/extlst" xmlns:r="http://schemas.openxmlformats.org/officeDocument/2006/relationships" xmlns:m="http://schemas.openxmlformats.org/officeDocument/2006/math" xmlns:v="urn:schemas-microsoft-com:vml" xmlns:wp14="http://schemas.microsoft.com/office/word/2010/wordprocessingDrawing" xmlns:wp="http://schemas.openxmlformats.org/drawingml/2006/wordprocessingDrawing" xmlns:w10="urn:schemas-microsoft-com:office:word" xmlns:w="http://schemas.openxmlformats.org/wordprocessingml/2006/main" xmlns:w14="http://schemas.microsoft.com/office/word/2010/wordml" xmlns:w15="http://schemas.microsoft.com/office/word/2012/wordml" xmlns:w16cex="http://schemas.microsoft.com/office/word/2018/wordml/cex" xmlns:w16cid="http://schemas.microsoft.com/office/word/2016/wordml/cid" xmlns:w16="http://schemas.microsoft.com/office/word/2018/wordml" xmlns:w16du="http://schemas.microsoft.com/office/word/2023/wordml/word16du" xmlns:w16sdtdh="http://schemas.microsoft.com/office/word/2020/wordml/sdtdatahash" xmlns:w16se="http://schemas.microsoft.com/office/word/2015/wordml/symex" xmlns:wpg="http://schemas.microsoft.com/office/word/2010/wordprocessingGroup" xmlns:wpi="http://schemas.microsoft.com/office/word/2010/wordprocessingInk" xmlns:wne="http://schemas.microsoft.com/office/word/2006/wordml" xmlns:wps="http://schemas.microsoft.com/office/word/2010/wordprocessingShape" mc:Ignorable="w14 w15 w16se w16cid w16 w16cex w16sdtdh wp14">
+<w:hdr xmlns:wpc="http://schemas.microsoft.com/office/word/2010/wordprocessingCanvas" xmlns:cx="http://schemas.microsoft.com/office/drawing/2014/chartex" xmlns:cx1="http://schemas.microsoft.com/office/drawing/2015/9/8/chartex" xmlns:cx2="http://schemas.microsoft.com/office/drawing/2015/10/21/chartex" xmlns:cx3="http://schemas.microsoft.com/office/drawing/2016/5/9/chartex" xmlns:cx4="http://schemas.microsoft.com/office/drawing/2016/5/10/chartex" xmlns:cx5="http://schemas.microsoft.com/office/drawing/2016/5/11/chartex" xmlns:cx6="http://schemas.microsoft.com/office/drawing/2016/5/12/chartex" xmlns:cx7="http://schemas.microsoft.com/office/drawing/2016/5/13/chartex" xmlns:cx8="http://schemas.microsoft.com/office/drawing/2016/5/14/chartex" xmlns:mc="http://schemas.openxmlformats.org/markup-compatibility/2006" xmlns:aink="http://schemas.microsoft.com/office/drawing/2016/ink" xmlns:am3d="http://schemas.microsoft.com/office/drawing/2017/model3d" xmlns:o="urn:schemas-microsoft-com:office:office" xmlns:oel="http://schemas.microsoft.com/office/2019/extlst" xmlns:r="http://schemas.openxmlformats.org/officeDocument/2006/relationships" xmlns:m="http://schemas.openxmlformats.org/officeDocument/2006/math" xmlns:v="urn:schemas-microsoft-com:vml" xmlns:wp14="http://schemas.microsoft.com/office/word/2010/wordprocessingDrawing" xmlns:wp="http://schemas.openxmlformats.org/drawingml/2006/wordprocessingDrawing" xmlns:w10="urn:schemas-microsoft-com:office:word" xmlns:w="http://schemas.openxmlformats.org/wordprocessingml/2006/main" xmlns:w14="http://schemas.microsoft.com/office/word/2010/wordml" xmlns:w15="http://schemas.microsoft.com/office/word/2012/wordml" xmlns:w16cex="http://schemas.microsoft.com/office/word/2018/wordml/cex" xmlns:w16cid="http://schemas.microsoft.com/office/word/2016/wordml/cid" xmlns:w16="http://schemas.microsoft.com/office/word/2018/wordml" xmlns:w16du="http://schemas.microsoft.com/office/word/2023/wordml/word16du" xmlns:w16sdtdh="http://schemas.microsoft.com/office/word/2020/wordml/sdtdatahash" xmlns:w16sdtfl="http://schemas.microsoft.com/office/word/2024/wordml/sdtformatlock" xmlns:w16se="http://schemas.microsoft.com/office/word/2015/wordml/symex" xmlns:wpg="http://schemas.microsoft.com/office/word/2010/wordprocessingGroup" xmlns:wpi="http://schemas.microsoft.com/office/word/2010/wordprocessingInk" xmlns:wne="http://schemas.microsoft.com/office/word/2006/wordml" xmlns:wps="http://schemas.microsoft.com/office/word/2010/wordprocessingShape" mc:Ignorable="w14 w15 w16se w16cid w16 w16cex w16sdtdh w16sdtfl w16du wp14">
   <w:p>
     <w:pPr>
       <w:pBdr>
@@ -9194,7 +9083,7 @@
 </file>
 
 <file path=word/numbering.xml><?xml version="1.0" encoding="utf-8"?>
-<w:numbering xmlns:wpc="http://schemas.microsoft.com/office/word/2010/wordprocessingCanvas" xmlns:cx="http://schemas.microsoft.com/office/drawing/2014/chartex" xmlns:cx1="http://schemas.microsoft.com/office/drawing/2015/9/8/chartex" xmlns:cx2="http://schemas.microsoft.com/office/drawing/2015/10/21/chartex" xmlns:cx3="http://schemas.microsoft.com/office/drawing/2016/5/9/chartex" xmlns:cx4="http://schemas.microsoft.com/office/drawing/2016/5/10/chartex" xmlns:cx5="http://schemas.microsoft.com/office/drawing/2016/5/11/chartex" xmlns:cx6="http://schemas.microsoft.com/office/drawing/2016/5/12/chartex" xmlns:cx7="http://schemas.microsoft.com/office/drawing/2016/5/13/chartex" xmlns:cx8="http://schemas.microsoft.com/office/drawing/2016/5/14/chartex" xmlns:mc="http://schemas.openxmlformats.org/markup-compatibility/2006" xmlns:aink="http://schemas.microsoft.com/office/drawing/2016/ink" xmlns:am3d="http://schemas.microsoft.com/office/drawing/2017/model3d" xmlns:o="urn:schemas-microsoft-com:office:office" xmlns:oel="http://schemas.microsoft.com/office/2019/extlst" xmlns:r="http://schemas.openxmlformats.org/officeDocument/2006/relationships" xmlns:m="http://schemas.openxmlformats.org/officeDocument/2006/math" xmlns:v="urn:schemas-microsoft-com:vml" xmlns:wp14="http://schemas.microsoft.com/office/word/2010/wordprocessingDrawing" xmlns:wp="http://schemas.openxmlformats.org/drawingml/2006/wordprocessingDrawing" xmlns:w10="urn:schemas-microsoft-com:office:word" xmlns:w="http://schemas.openxmlformats.org/wordprocessingml/2006/main" xmlns:w14="http://schemas.microsoft.com/office/word/2010/wordml" xmlns:w15="http://schemas.microsoft.com/office/word/2012/wordml" xmlns:w16cex="http://schemas.microsoft.com/office/word/2018/wordml/cex" xmlns:w16cid="http://schemas.microsoft.com/office/word/2016/wordml/cid" xmlns:w16="http://schemas.microsoft.com/office/word/2018/wordml" xmlns:w16du="http://schemas.microsoft.com/office/word/2023/wordml/word16du" xmlns:w16sdtdh="http://schemas.microsoft.com/office/word/2020/wordml/sdtdatahash" xmlns:w16se="http://schemas.microsoft.com/office/word/2015/wordml/symex" xmlns:wpg="http://schemas.microsoft.com/office/word/2010/wordprocessingGroup" xmlns:wpi="http://schemas.microsoft.com/office/word/2010/wordprocessingInk" xmlns:wne="http://schemas.microsoft.com/office/word/2006/wordml" xmlns:wps="http://schemas.microsoft.com/office/word/2010/wordprocessingShape" mc:Ignorable="w14 w15 w16se w16cid w16 w16cex w16sdtdh wp14">
+<w:numbering xmlns:wpc="http://schemas.microsoft.com/office/word/2010/wordprocessingCanvas" xmlns:cx="http://schemas.microsoft.com/office/drawing/2014/chartex" xmlns:cx1="http://schemas.microsoft.com/office/drawing/2015/9/8/chartex" xmlns:cx2="http://schemas.microsoft.com/office/drawing/2015/10/21/chartex" xmlns:cx3="http://schemas.microsoft.com/office/drawing/2016/5/9/chartex" xmlns:cx4="http://schemas.microsoft.com/office/drawing/2016/5/10/chartex" xmlns:cx5="http://schemas.microsoft.com/office/drawing/2016/5/11/chartex" xmlns:cx6="http://schemas.microsoft.com/office/drawing/2016/5/12/chartex" xmlns:cx7="http://schemas.microsoft.com/office/drawing/2016/5/13/chartex" xmlns:cx8="http://schemas.microsoft.com/office/drawing/2016/5/14/chartex" xmlns:mc="http://schemas.openxmlformats.org/markup-compatibility/2006" xmlns:aink="http://schemas.microsoft.com/office/drawing/2016/ink" xmlns:am3d="http://schemas.microsoft.com/office/drawing/2017/model3d" xmlns:o="urn:schemas-microsoft-com:office:office" xmlns:oel="http://schemas.microsoft.com/office/2019/extlst" xmlns:r="http://schemas.openxmlformats.org/officeDocument/2006/relationships" xmlns:m="http://schemas.openxmlformats.org/officeDocument/2006/math" xmlns:v="urn:schemas-microsoft-com:vml" xmlns:wp14="http://schemas.microsoft.com/office/word/2010/wordprocessingDrawing" xmlns:wp="http://schemas.openxmlformats.org/drawingml/2006/wordprocessingDrawing" xmlns:w10="urn:schemas-microsoft-com:office:word" xmlns:w="http://schemas.openxmlformats.org/wordprocessingml/2006/main" xmlns:w14="http://schemas.microsoft.com/office/word/2010/wordml" xmlns:w15="http://schemas.microsoft.com/office/word/2012/wordml" xmlns:w16cex="http://schemas.microsoft.com/office/word/2018/wordml/cex" xmlns:w16cid="http://schemas.microsoft.com/office/word/2016/wordml/cid" xmlns:w16="http://schemas.microsoft.com/office/word/2018/wordml" xmlns:w16du="http://schemas.microsoft.com/office/word/2023/wordml/word16du" xmlns:w16sdtdh="http://schemas.microsoft.com/office/word/2020/wordml/sdtdatahash" xmlns:w16sdtfl="http://schemas.microsoft.com/office/word/2024/wordml/sdtformatlock" xmlns:w16se="http://schemas.microsoft.com/office/word/2015/wordml/symex" xmlns:wpg="http://schemas.microsoft.com/office/word/2010/wordprocessingGroup" xmlns:wpi="http://schemas.microsoft.com/office/word/2010/wordprocessingInk" xmlns:wne="http://schemas.microsoft.com/office/word/2006/wordml" xmlns:wps="http://schemas.microsoft.com/office/word/2010/wordprocessingShape" mc:Ignorable="w14 w15 w16se w16cid w16 w16cex w16sdtdh w16sdtfl w16du wp14">
   <w:abstractNum w:abstractNumId="0" w15:restartNumberingAfterBreak="0">
     <w:nsid w:val="17D154F0"/>
     <w:multiLevelType w:val="hybridMultilevel"/>
@@ -9411,7 +9300,7 @@
 </file>
 
 <file path=word/styles.xml><?xml version="1.0" encoding="utf-8"?>
-<w:styles xmlns:mc="http://schemas.openxmlformats.org/markup-compatibility/2006" xmlns:r="http://schemas.openxmlformats.org/officeDocument/2006/relationships" xmlns:w="http://schemas.openxmlformats.org/wordprocessingml/2006/main" xmlns:w14="http://schemas.microsoft.com/office/word/2010/wordml" xmlns:w15="http://schemas.microsoft.com/office/word/2012/wordml" xmlns:w16cex="http://schemas.microsoft.com/office/word/2018/wordml/cex" xmlns:w16cid="http://schemas.microsoft.com/office/word/2016/wordml/cid" xmlns:w16="http://schemas.microsoft.com/office/word/2018/wordml" xmlns:w16sdtdh="http://schemas.microsoft.com/office/word/2020/wordml/sdtdatahash" xmlns:w16se="http://schemas.microsoft.com/office/word/2015/wordml/symex" mc:Ignorable="w14 w15 w16se w16cid w16 w16cex w16sdtdh">
+<w:styles xmlns:mc="http://schemas.openxmlformats.org/markup-compatibility/2006" xmlns:r="http://schemas.openxmlformats.org/officeDocument/2006/relationships" xmlns:w="http://schemas.openxmlformats.org/wordprocessingml/2006/main" xmlns:w14="http://schemas.microsoft.com/office/word/2010/wordml" xmlns:w15="http://schemas.microsoft.com/office/word/2012/wordml" xmlns:w16cex="http://schemas.microsoft.com/office/word/2018/wordml/cex" xmlns:w16cid="http://schemas.microsoft.com/office/word/2016/wordml/cid" xmlns:w16="http://schemas.microsoft.com/office/word/2018/wordml" xmlns:w16du="http://schemas.microsoft.com/office/word/2023/wordml/word16du" xmlns:w16sdtdh="http://schemas.microsoft.com/office/word/2020/wordml/sdtdatahash" xmlns:w16sdtfl="http://schemas.microsoft.com/office/word/2024/wordml/sdtformatlock" xmlns:w16se="http://schemas.microsoft.com/office/word/2015/wordml/symex" mc:Ignorable="w14 w15 w16se w16cid w16 w16cex w16sdtdh w16sdtfl w16du">
   <w:docDefaults>
     <w:rPrDefault>
       <w:rPr>

</xml_diff>